<commit_message>
docs: agregar CLAUDE.md, evidencias de los extras y sección de extras en el informe
</commit_message>
<xml_diff>
--- a/docs/Informe-Taller-Spring-Cloud-Config.docx
+++ b/docs/Informe-Taller-Spring-Cloud-Config.docx
@@ -428,7 +428,7 @@
     <w:sdt>
       <w:sdtPr>
         <w:alias w:val="Contenido"/>
-        <w:id w:val="-567187932"/>
+        <w:id w:val="50657472"/>
       </w:sdtPr>
       <w:sdtEndPr/>
       <w:sdtContent>
@@ -456,7 +456,7 @@
           <w:r>
             <w:fldChar w:fldCharType="separate"/>
           </w:r>
-          <w:hyperlink w:anchor="_Toc240670063" w:history="1">
+          <w:hyperlink w:anchor="_Toc240670760" w:history="1">
             <w:r>
               <w:rPr>
                 <w:rStyle w:val="Hyperlink"/>
@@ -480,7 +480,7 @@
               <w:rPr>
                 <w:noProof/>
               </w:rPr>
-              <w:instrText xml:space="preserve"> PAGEREF _Toc240670063 \h </w:instrText>
+              <w:instrText xml:space="preserve"> PAGEREF _Toc240670760 \h </w:instrText>
             </w:r>
             <w:r>
               <w:rPr>
@@ -522,7 +522,7 @@
               <w14:ligatures w14:val="standardContextual"/>
             </w:rPr>
           </w:pPr>
-          <w:hyperlink w:anchor="_Toc240670064" w:history="1">
+          <w:hyperlink w:anchor="_Toc240670761" w:history="1">
             <w:r>
               <w:rPr>
                 <w:rStyle w:val="Hyperlink"/>
@@ -546,7 +546,7 @@
               <w:rPr>
                 <w:noProof/>
               </w:rPr>
-              <w:instrText xml:space="preserve"> PAGEREF _Toc240670064 \h </w:instrText>
+              <w:instrText xml:space="preserve"> PAGEREF _Toc240670761 \h </w:instrText>
             </w:r>
             <w:r>
               <w:rPr>
@@ -588,7 +588,7 @@
               <w14:ligatures w14:val="standardContextual"/>
             </w:rPr>
           </w:pPr>
-          <w:hyperlink w:anchor="_Toc240670065" w:history="1">
+          <w:hyperlink w:anchor="_Toc240670762" w:history="1">
             <w:r>
               <w:rPr>
                 <w:rStyle w:val="Hyperlink"/>
@@ -612,7 +612,7 @@
               <w:rPr>
                 <w:noProof/>
               </w:rPr>
-              <w:instrText xml:space="preserve"> PAGEREF _Toc240670065 \h </w:instrText>
+              <w:instrText xml:space="preserve"> PAGEREF _Toc240670762 \h </w:instrText>
             </w:r>
             <w:r>
               <w:rPr>
@@ -654,7 +654,7 @@
               <w14:ligatures w14:val="standardContextual"/>
             </w:rPr>
           </w:pPr>
-          <w:hyperlink w:anchor="_Toc240670066" w:history="1">
+          <w:hyperlink w:anchor="_Toc240670763" w:history="1">
             <w:r>
               <w:rPr>
                 <w:rStyle w:val="Hyperlink"/>
@@ -678,7 +678,7 @@
               <w:rPr>
                 <w:noProof/>
               </w:rPr>
-              <w:instrText xml:space="preserve"> PAGEREF _Toc240670066 \h </w:instrText>
+              <w:instrText xml:space="preserve"> PAGEREF _Toc240670763 \h </w:instrText>
             </w:r>
             <w:r>
               <w:rPr>
@@ -720,7 +720,7 @@
               <w14:ligatures w14:val="standardContextual"/>
             </w:rPr>
           </w:pPr>
-          <w:hyperlink w:anchor="_Toc240670067" w:history="1">
+          <w:hyperlink w:anchor="_Toc240670764" w:history="1">
             <w:r>
               <w:rPr>
                 <w:rStyle w:val="Hyperlink"/>
@@ -744,7 +744,7 @@
               <w:rPr>
                 <w:noProof/>
               </w:rPr>
-              <w:instrText xml:space="preserve"> PAGEREF _Toc240670067 \h </w:instrText>
+              <w:instrText xml:space="preserve"> PAGEREF _Toc240670764 \h </w:instrText>
             </w:r>
             <w:r>
               <w:rPr>
@@ -786,7 +786,7 @@
               <w14:ligatures w14:val="standardContextual"/>
             </w:rPr>
           </w:pPr>
-          <w:hyperlink w:anchor="_Toc240670068" w:history="1">
+          <w:hyperlink w:anchor="_Toc240670765" w:history="1">
             <w:r>
               <w:rPr>
                 <w:rStyle w:val="Hyperlink"/>
@@ -810,7 +810,7 @@
               <w:rPr>
                 <w:noProof/>
               </w:rPr>
-              <w:instrText xml:space="preserve"> PAGEREF _Toc240670068 \h </w:instrText>
+              <w:instrText xml:space="preserve"> PAGEREF _Toc240670765 \h </w:instrText>
             </w:r>
             <w:r>
               <w:rPr>
@@ -852,7 +852,7 @@
               <w14:ligatures w14:val="standardContextual"/>
             </w:rPr>
           </w:pPr>
-          <w:hyperlink w:anchor="_Toc240670069" w:history="1">
+          <w:hyperlink w:anchor="_Toc240670766" w:history="1">
             <w:r>
               <w:rPr>
                 <w:rStyle w:val="Hyperlink"/>
@@ -876,7 +876,7 @@
               <w:rPr>
                 <w:noProof/>
               </w:rPr>
-              <w:instrText xml:space="preserve"> PAGEREF _Toc240670069 \h </w:instrText>
+              <w:instrText xml:space="preserve"> PAGEREF _Toc240670766 \h </w:instrText>
             </w:r>
             <w:r>
               <w:rPr>
@@ -918,7 +918,7 @@
               <w14:ligatures w14:val="standardContextual"/>
             </w:rPr>
           </w:pPr>
-          <w:hyperlink w:anchor="_Toc240670070" w:history="1">
+          <w:hyperlink w:anchor="_Toc240670767" w:history="1">
             <w:r>
               <w:rPr>
                 <w:rStyle w:val="Hyperlink"/>
@@ -942,7 +942,7 @@
               <w:rPr>
                 <w:noProof/>
               </w:rPr>
-              <w:instrText xml:space="preserve"> PAGEREF _Toc240670070 \h </w:instrText>
+              <w:instrText xml:space="preserve"> PAGEREF _Toc240670767 \h </w:instrText>
             </w:r>
             <w:r>
               <w:rPr>
@@ -984,7 +984,7 @@
               <w14:ligatures w14:val="standardContextual"/>
             </w:rPr>
           </w:pPr>
-          <w:hyperlink w:anchor="_Toc240670071" w:history="1">
+          <w:hyperlink w:anchor="_Toc240670768" w:history="1">
             <w:r>
               <w:rPr>
                 <w:rStyle w:val="Hyperlink"/>
@@ -1008,7 +1008,7 @@
               <w:rPr>
                 <w:noProof/>
               </w:rPr>
-              <w:instrText xml:space="preserve"> PAGEREF _Toc240670071 \h </w:instrText>
+              <w:instrText xml:space="preserve"> PAGEREF _Toc240670768 \h </w:instrText>
             </w:r>
             <w:r>
               <w:rPr>
@@ -1050,7 +1050,7 @@
               <w14:ligatures w14:val="standardContextual"/>
             </w:rPr>
           </w:pPr>
-          <w:hyperlink w:anchor="_Toc240670072" w:history="1">
+          <w:hyperlink w:anchor="_Toc240670769" w:history="1">
             <w:r>
               <w:rPr>
                 <w:rStyle w:val="Hyperlink"/>
@@ -1074,7 +1074,7 @@
               <w:rPr>
                 <w:noProof/>
               </w:rPr>
-              <w:instrText xml:space="preserve"> PAGEREF _Toc240670072 \h </w:instrText>
+              <w:instrText xml:space="preserve"> PAGEREF _Toc240670769 \h </w:instrText>
             </w:r>
             <w:r>
               <w:rPr>
@@ -1116,7 +1116,7 @@
               <w14:ligatures w14:val="standardContextual"/>
             </w:rPr>
           </w:pPr>
-          <w:hyperlink w:anchor="_Toc240670073" w:history="1">
+          <w:hyperlink w:anchor="_Toc240670770" w:history="1">
             <w:r>
               <w:rPr>
                 <w:rStyle w:val="Hyperlink"/>
@@ -1140,7 +1140,7 @@
               <w:rPr>
                 <w:noProof/>
               </w:rPr>
-              <w:instrText xml:space="preserve"> PAGEREF _Toc240670073 \h </w:instrText>
+              <w:instrText xml:space="preserve"> PAGEREF _Toc240670770 \h </w:instrText>
             </w:r>
             <w:r>
               <w:rPr>
@@ -1182,7 +1182,7 @@
               <w14:ligatures w14:val="standardContextual"/>
             </w:rPr>
           </w:pPr>
-          <w:hyperlink w:anchor="_Toc240670074" w:history="1">
+          <w:hyperlink w:anchor="_Toc240670771" w:history="1">
             <w:r>
               <w:rPr>
                 <w:rStyle w:val="Hyperlink"/>
@@ -1206,7 +1206,7 @@
               <w:rPr>
                 <w:noProof/>
               </w:rPr>
-              <w:instrText xml:space="preserve"> PAGEREF _Toc240670074 \h </w:instrText>
+              <w:instrText xml:space="preserve"> PAGEREF _Toc240670771 \h </w:instrText>
             </w:r>
             <w:r>
               <w:rPr>
@@ -1248,7 +1248,7 @@
               <w14:ligatures w14:val="standardContextual"/>
             </w:rPr>
           </w:pPr>
-          <w:hyperlink w:anchor="_Toc240670075" w:history="1">
+          <w:hyperlink w:anchor="_Toc240670772" w:history="1">
             <w:r>
               <w:rPr>
                 <w:rStyle w:val="Hyperlink"/>
@@ -1272,7 +1272,7 @@
               <w:rPr>
                 <w:noProof/>
               </w:rPr>
-              <w:instrText xml:space="preserve"> PAGEREF _Toc240670075 \h </w:instrText>
+              <w:instrText xml:space="preserve"> PAGEREF _Toc240670772 \h </w:instrText>
             </w:r>
             <w:r>
               <w:rPr>
@@ -1314,7 +1314,7 @@
               <w14:ligatures w14:val="standardContextual"/>
             </w:rPr>
           </w:pPr>
-          <w:hyperlink w:anchor="_Toc240670076" w:history="1">
+          <w:hyperlink w:anchor="_Toc240670773" w:history="1">
             <w:r>
               <w:rPr>
                 <w:rStyle w:val="Hyperlink"/>
@@ -1338,7 +1338,7 @@
               <w:rPr>
                 <w:noProof/>
               </w:rPr>
-              <w:instrText xml:space="preserve"> PAGEREF _Toc240670076 \h </w:instrText>
+              <w:instrText xml:space="preserve"> PAGEREF _Toc240670773 \h </w:instrText>
             </w:r>
             <w:r>
               <w:rPr>
@@ -1380,7 +1380,7 @@
               <w14:ligatures w14:val="standardContextual"/>
             </w:rPr>
           </w:pPr>
-          <w:hyperlink w:anchor="_Toc240670077" w:history="1">
+          <w:hyperlink w:anchor="_Toc240670774" w:history="1">
             <w:r>
               <w:rPr>
                 <w:rStyle w:val="Hyperlink"/>
@@ -1404,7 +1404,7 @@
               <w:rPr>
                 <w:noProof/>
               </w:rPr>
-              <w:instrText xml:space="preserve"> PAGEREF _Toc240670077 \h </w:instrText>
+              <w:instrText xml:space="preserve"> PAGEREF _Toc240670774 \h </w:instrText>
             </w:r>
             <w:r>
               <w:rPr>
@@ -1446,7 +1446,7 @@
               <w14:ligatures w14:val="standardContextual"/>
             </w:rPr>
           </w:pPr>
-          <w:hyperlink w:anchor="_Toc240670078" w:history="1">
+          <w:hyperlink w:anchor="_Toc240670775" w:history="1">
             <w:r>
               <w:rPr>
                 <w:rStyle w:val="Hyperlink"/>
@@ -1470,7 +1470,7 @@
               <w:rPr>
                 <w:noProof/>
               </w:rPr>
-              <w:instrText xml:space="preserve"> PAGEREF _Toc240670078 \h </w:instrText>
+              <w:instrText xml:space="preserve"> PAGEREF _Toc240670775 \h </w:instrText>
             </w:r>
             <w:r>
               <w:rPr>
@@ -1512,7 +1512,7 @@
               <w14:ligatures w14:val="standardContextual"/>
             </w:rPr>
           </w:pPr>
-          <w:hyperlink w:anchor="_Toc240670079" w:history="1">
+          <w:hyperlink w:anchor="_Toc240670776" w:history="1">
             <w:r>
               <w:rPr>
                 <w:rStyle w:val="Hyperlink"/>
@@ -1536,7 +1536,7 @@
               <w:rPr>
                 <w:noProof/>
               </w:rPr>
-              <w:instrText xml:space="preserve"> PAGEREF _Toc240670079 \h </w:instrText>
+              <w:instrText xml:space="preserve"> PAGEREF _Toc240670776 \h </w:instrText>
             </w:r>
             <w:r>
               <w:rPr>
@@ -1578,7 +1578,7 @@
               <w14:ligatures w14:val="standardContextual"/>
             </w:rPr>
           </w:pPr>
-          <w:hyperlink w:anchor="_Toc240670080" w:history="1">
+          <w:hyperlink w:anchor="_Toc240670777" w:history="1">
             <w:r>
               <w:rPr>
                 <w:rStyle w:val="Hyperlink"/>
@@ -1602,7 +1602,7 @@
               <w:rPr>
                 <w:noProof/>
               </w:rPr>
-              <w:instrText xml:space="preserve"> PAGEREF _Toc240670080 \h </w:instrText>
+              <w:instrText xml:space="preserve"> PAGEREF _Toc240670777 \h </w:instrText>
             </w:r>
             <w:r>
               <w:rPr>
@@ -1644,7 +1644,7 @@
               <w14:ligatures w14:val="standardContextual"/>
             </w:rPr>
           </w:pPr>
-          <w:hyperlink w:anchor="_Toc240670081" w:history="1">
+          <w:hyperlink w:anchor="_Toc240670778" w:history="1">
             <w:r>
               <w:rPr>
                 <w:rStyle w:val="Hyperlink"/>
@@ -1668,7 +1668,7 @@
               <w:rPr>
                 <w:noProof/>
               </w:rPr>
-              <w:instrText xml:space="preserve"> PAGEREF _Toc240670081 \h </w:instrText>
+              <w:instrText xml:space="preserve"> PAGEREF _Toc240670778 \h </w:instrText>
             </w:r>
             <w:r>
               <w:rPr>
@@ -1710,7 +1710,7 @@
               <w14:ligatures w14:val="standardContextual"/>
             </w:rPr>
           </w:pPr>
-          <w:hyperlink w:anchor="_Toc240670082" w:history="1">
+          <w:hyperlink w:anchor="_Toc240670779" w:history="1">
             <w:r>
               <w:rPr>
                 <w:rStyle w:val="Hyperlink"/>
@@ -1734,7 +1734,7 @@
               <w:rPr>
                 <w:noProof/>
               </w:rPr>
-              <w:instrText xml:space="preserve"> PAGEREF _Toc240670082 \h </w:instrText>
+              <w:instrText xml:space="preserve"> PAGEREF _Toc240670779 \h </w:instrText>
             </w:r>
             <w:r>
               <w:rPr>
@@ -1776,7 +1776,7 @@
               <w14:ligatures w14:val="standardContextual"/>
             </w:rPr>
           </w:pPr>
-          <w:hyperlink w:anchor="_Toc240670083" w:history="1">
+          <w:hyperlink w:anchor="_Toc240670780" w:history="1">
             <w:r>
               <w:rPr>
                 <w:rStyle w:val="Hyperlink"/>
@@ -1800,7 +1800,7 @@
               <w:rPr>
                 <w:noProof/>
               </w:rPr>
-              <w:instrText xml:space="preserve"> PAGEREF _Toc240670083 \h </w:instrText>
+              <w:instrText xml:space="preserve"> PAGEREF _Toc240670780 \h </w:instrText>
             </w:r>
             <w:r>
               <w:rPr>
@@ -1842,7 +1842,7 @@
               <w14:ligatures w14:val="standardContextual"/>
             </w:rPr>
           </w:pPr>
-          <w:hyperlink w:anchor="_Toc240670084" w:history="1">
+          <w:hyperlink w:anchor="_Toc240670781" w:history="1">
             <w:r>
               <w:rPr>
                 <w:rStyle w:val="Hyperlink"/>
@@ -1866,7 +1866,7 @@
               <w:rPr>
                 <w:noProof/>
               </w:rPr>
-              <w:instrText xml:space="preserve"> PAGEREF _Toc240670084 \h </w:instrText>
+              <w:instrText xml:space="preserve"> PAGEREF _Toc240670781 \h </w:instrText>
             </w:r>
             <w:r>
               <w:rPr>
@@ -1908,13 +1908,13 @@
               <w14:ligatures w14:val="standardContextual"/>
             </w:rPr>
           </w:pPr>
-          <w:hyperlink w:anchor="_Toc240670085" w:history="1">
+          <w:hyperlink w:anchor="_Toc240670782" w:history="1">
             <w:r>
               <w:rPr>
                 <w:rStyle w:val="Hyperlink"/>
                 <w:noProof/>
               </w:rPr>
-              <w:t>7. Observaciones sobre el enunciado</w:t>
+              <w:t>7. Extras opcionales</w:t>
             </w:r>
             <w:r>
               <w:rPr>
@@ -1932,7 +1932,7 @@
               <w:rPr>
                 <w:noProof/>
               </w:rPr>
-              <w:instrText xml:space="preserve"> PAGEREF _Toc240670085 \h </w:instrText>
+              <w:instrText xml:space="preserve"> PAGEREF _Toc240670782 \h </w:instrText>
             </w:r>
             <w:r>
               <w:rPr>
@@ -1950,6 +1950,204 @@
                 <w:noProof/>
               </w:rPr>
               <w:t>11</w:t>
+            </w:r>
+            <w:r>
+              <w:rPr>
+                <w:noProof/>
+              </w:rPr>
+              <w:fldChar w:fldCharType="end"/>
+            </w:r>
+          </w:hyperlink>
+        </w:p>
+        <w:p>
+          <w:pPr>
+            <w:pStyle w:val="TOC2"/>
+            <w:tabs>
+              <w:tab w:val="right" w:leader="dot" w:pos="9016"/>
+            </w:tabs>
+            <w:rPr>
+              <w:rFonts w:asciiTheme="minorHAnsi" w:eastAsiaTheme="minorEastAsia" w:hAnsiTheme="minorHAnsi" w:cstheme="minorBidi"/>
+              <w:noProof/>
+              <w:kern w:val="2"/>
+              <w:sz w:val="24"/>
+              <w:szCs w:val="24"/>
+              <w14:ligatures w14:val="standardContextual"/>
+            </w:rPr>
+          </w:pPr>
+          <w:hyperlink w:anchor="_Toc240670783" w:history="1">
+            <w:r>
+              <w:rPr>
+                <w:rStyle w:val="Hyperlink"/>
+                <w:noProof/>
+              </w:rPr>
+              <w:t>7.1 Perfil git del Config Server</w:t>
+            </w:r>
+            <w:r>
+              <w:rPr>
+                <w:noProof/>
+              </w:rPr>
+              <w:tab/>
+            </w:r>
+            <w:r>
+              <w:rPr>
+                <w:noProof/>
+              </w:rPr>
+              <w:fldChar w:fldCharType="begin"/>
+            </w:r>
+            <w:r>
+              <w:rPr>
+                <w:noProof/>
+              </w:rPr>
+              <w:instrText xml:space="preserve"> PAGEREF _Toc240670783 \h </w:instrText>
+            </w:r>
+            <w:r>
+              <w:rPr>
+                <w:noProof/>
+              </w:rPr>
+            </w:r>
+            <w:r>
+              <w:rPr>
+                <w:noProof/>
+              </w:rPr>
+              <w:fldChar w:fldCharType="separate"/>
+            </w:r>
+            <w:r>
+              <w:rPr>
+                <w:noProof/>
+              </w:rPr>
+              <w:t>11</w:t>
+            </w:r>
+            <w:r>
+              <w:rPr>
+                <w:noProof/>
+              </w:rPr>
+              <w:fldChar w:fldCharType="end"/>
+            </w:r>
+          </w:hyperlink>
+        </w:p>
+        <w:p>
+          <w:pPr>
+            <w:pStyle w:val="TOC2"/>
+            <w:tabs>
+              <w:tab w:val="right" w:leader="dot" w:pos="9016"/>
+            </w:tabs>
+            <w:rPr>
+              <w:rFonts w:asciiTheme="minorHAnsi" w:eastAsiaTheme="minorEastAsia" w:hAnsiTheme="minorHAnsi" w:cstheme="minorBidi"/>
+              <w:noProof/>
+              <w:kern w:val="2"/>
+              <w:sz w:val="24"/>
+              <w:szCs w:val="24"/>
+              <w14:ligatures w14:val="standardContextual"/>
+            </w:rPr>
+          </w:pPr>
+          <w:hyperlink w:anchor="_Toc240670784" w:history="1">
+            <w:r>
+              <w:rPr>
+                <w:rStyle w:val="Hyperlink"/>
+                <w:noProof/>
+              </w:rPr>
+              <w:t>7.2 Docker Compose y MySQL</w:t>
+            </w:r>
+            <w:r>
+              <w:rPr>
+                <w:noProof/>
+              </w:rPr>
+              <w:tab/>
+            </w:r>
+            <w:r>
+              <w:rPr>
+                <w:noProof/>
+              </w:rPr>
+              <w:fldChar w:fldCharType="begin"/>
+            </w:r>
+            <w:r>
+              <w:rPr>
+                <w:noProof/>
+              </w:rPr>
+              <w:instrText xml:space="preserve"> PAGEREF _Toc240670784 \h </w:instrText>
+            </w:r>
+            <w:r>
+              <w:rPr>
+                <w:noProof/>
+              </w:rPr>
+            </w:r>
+            <w:r>
+              <w:rPr>
+                <w:noProof/>
+              </w:rPr>
+              <w:fldChar w:fldCharType="separate"/>
+            </w:r>
+            <w:r>
+              <w:rPr>
+                <w:noProof/>
+              </w:rPr>
+              <w:t>12</w:t>
+            </w:r>
+            <w:r>
+              <w:rPr>
+                <w:noProof/>
+              </w:rPr>
+              <w:fldChar w:fldCharType="end"/>
+            </w:r>
+          </w:hyperlink>
+        </w:p>
+        <w:p>
+          <w:pPr>
+            <w:pStyle w:val="TOC2"/>
+            <w:tabs>
+              <w:tab w:val="right" w:leader="dot" w:pos="9016"/>
+            </w:tabs>
+            <w:rPr>
+              <w:rFonts w:asciiTheme="minorHAnsi" w:eastAsiaTheme="minorEastAsia" w:hAnsiTheme="minorHAnsi" w:cstheme="minorBidi"/>
+              <w:noProof/>
+              <w:kern w:val="2"/>
+              <w:sz w:val="24"/>
+              <w:szCs w:val="24"/>
+              <w14:ligatures w14:val="standardContextual"/>
+            </w:rPr>
+          </w:pPr>
+          <w:hyperlink w:anchor="_Toc240670785" w:history="1">
+            <w:r>
+              <w:rPr>
+                <w:rStyle w:val="Hyperlink"/>
+                <w:noProof/>
+              </w:rPr>
+              <w:t>7.3 Pruebas del extra</w:t>
+            </w:r>
+            <w:r>
+              <w:rPr>
+                <w:noProof/>
+              </w:rPr>
+              <w:tab/>
+            </w:r>
+            <w:r>
+              <w:rPr>
+                <w:noProof/>
+              </w:rPr>
+              <w:fldChar w:fldCharType="begin"/>
+            </w:r>
+            <w:r>
+              <w:rPr>
+                <w:noProof/>
+              </w:rPr>
+              <w:instrText xml:space="preserve"> PAGEREF _Toc240670785 \h </w:instrText>
+            </w:r>
+            <w:r>
+              <w:rPr>
+                <w:noProof/>
+              </w:rPr>
+            </w:r>
+            <w:r>
+              <w:rPr>
+                <w:noProof/>
+              </w:rPr>
+              <w:fldChar w:fldCharType="separate"/>
+            </w:r>
+            <w:r>
+              <w:rPr>
+                <w:noProof/>
+              </w:rPr>
+              <w:t>14</w:t>
             </w:r>
             <w:r>
               <w:rPr>
@@ -1974,13 +2172,13 @@
               <w14:ligatures w14:val="standardContextual"/>
             </w:rPr>
           </w:pPr>
-          <w:hyperlink w:anchor="_Toc240670086" w:history="1">
+          <w:hyperlink w:anchor="_Toc240670786" w:history="1">
             <w:r>
               <w:rPr>
                 <w:rStyle w:val="Hyperlink"/>
                 <w:noProof/>
               </w:rPr>
-              <w:t>8. Conclusiones</w:t>
+              <w:t>8. Observaciones sobre el enunciado</w:t>
             </w:r>
             <w:r>
               <w:rPr>
@@ -1998,7 +2196,7 @@
               <w:rPr>
                 <w:noProof/>
               </w:rPr>
-              <w:instrText xml:space="preserve"> PAGEREF _Toc240670086 \h </w:instrText>
+              <w:instrText xml:space="preserve"> PAGEREF _Toc240670786 \h </w:instrText>
             </w:r>
             <w:r>
               <w:rPr>
@@ -2015,7 +2213,73 @@
               <w:rPr>
                 <w:noProof/>
               </w:rPr>
-              <w:t>11</w:t>
+              <w:t>14</w:t>
+            </w:r>
+            <w:r>
+              <w:rPr>
+                <w:noProof/>
+              </w:rPr>
+              <w:fldChar w:fldCharType="end"/>
+            </w:r>
+          </w:hyperlink>
+        </w:p>
+        <w:p>
+          <w:pPr>
+            <w:pStyle w:val="TOC1"/>
+            <w:tabs>
+              <w:tab w:val="right" w:leader="dot" w:pos="9016"/>
+            </w:tabs>
+            <w:rPr>
+              <w:rFonts w:asciiTheme="minorHAnsi" w:eastAsiaTheme="minorEastAsia" w:hAnsiTheme="minorHAnsi" w:cstheme="minorBidi"/>
+              <w:noProof/>
+              <w:kern w:val="2"/>
+              <w:sz w:val="24"/>
+              <w:szCs w:val="24"/>
+              <w14:ligatures w14:val="standardContextual"/>
+            </w:rPr>
+          </w:pPr>
+          <w:hyperlink w:anchor="_Toc240670787" w:history="1">
+            <w:r>
+              <w:rPr>
+                <w:rStyle w:val="Hyperlink"/>
+                <w:noProof/>
+              </w:rPr>
+              <w:t>9. Conclusiones</w:t>
+            </w:r>
+            <w:r>
+              <w:rPr>
+                <w:noProof/>
+              </w:rPr>
+              <w:tab/>
+            </w:r>
+            <w:r>
+              <w:rPr>
+                <w:noProof/>
+              </w:rPr>
+              <w:fldChar w:fldCharType="begin"/>
+            </w:r>
+            <w:r>
+              <w:rPr>
+                <w:noProof/>
+              </w:rPr>
+              <w:instrText xml:space="preserve"> PAGEREF _Toc240670787 \h </w:instrText>
+            </w:r>
+            <w:r>
+              <w:rPr>
+                <w:noProof/>
+              </w:rPr>
+            </w:r>
+            <w:r>
+              <w:rPr>
+                <w:noProof/>
+              </w:rPr>
+              <w:fldChar w:fldCharType="separate"/>
+            </w:r>
+            <w:r>
+              <w:rPr>
+                <w:noProof/>
+              </w:rPr>
+              <w:t>14</w:t>
             </w:r>
             <w:r>
               <w:rPr>
@@ -2041,7 +2305,7 @@
       <w:pPr>
         <w:pStyle w:val="Heading1"/>
       </w:pPr>
-      <w:bookmarkStart w:id="0" w:name="_Toc240670063"/>
+      <w:bookmarkStart w:id="0" w:name="_Toc240670760"/>
       <w:r>
         <w:lastRenderedPageBreak/>
         <w:t>1. Introducción y objetivo</w:t>
@@ -2430,7 +2694,7 @@
       <w:pPr>
         <w:pStyle w:val="Heading1"/>
       </w:pPr>
-      <w:bookmarkStart w:id="1" w:name="_Toc240670064"/>
+      <w:bookmarkStart w:id="1" w:name="_Toc240670761"/>
       <w:r>
         <w:t>2. Entorno utilizado</w:t>
       </w:r>
@@ -3068,7 +3332,7 @@
       <w:pPr>
         <w:pStyle w:val="Heading1"/>
       </w:pPr>
-      <w:bookmarkStart w:id="2" w:name="_Toc240670065"/>
+      <w:bookmarkStart w:id="2" w:name="_Toc240670762"/>
       <w:r>
         <w:lastRenderedPageBreak/>
         <w:t>3. Paso 1: Creación del Config Server</w:t>
@@ -3087,7 +3351,7 @@
       <w:pPr>
         <w:pStyle w:val="Heading2"/>
       </w:pPr>
-      <w:bookmarkStart w:id="3" w:name="_Toc240670066"/>
+      <w:bookmarkStart w:id="3" w:name="_Toc240670763"/>
       <w:r>
         <w:t>3.1 Creación del proyecto Spring Boot</w:t>
       </w:r>
@@ -3590,7 +3854,7 @@
       <w:pPr>
         <w:pStyle w:val="Heading2"/>
       </w:pPr>
-      <w:bookmarkStart w:id="4" w:name="_Toc240670067"/>
+      <w:bookmarkStart w:id="4" w:name="_Toc240670764"/>
       <w:r>
         <w:t>3.2 Dependencia en el pom.xml</w:t>
       </w:r>
@@ -3708,7 +3972,7 @@
       <w:pPr>
         <w:pStyle w:val="Heading2"/>
       </w:pPr>
-      <w:bookmarkStart w:id="5" w:name="_Toc240670068"/>
+      <w:bookmarkStart w:id="5" w:name="_Toc240670765"/>
       <w:r>
         <w:t>3.3 Habilitar la funcionalidad del servidor</w:t>
       </w:r>
@@ -4017,7 +4281,7 @@
       <w:pPr>
         <w:pStyle w:val="Heading2"/>
       </w:pPr>
-      <w:bookmarkStart w:id="6" w:name="_Toc240670069"/>
+      <w:bookmarkStart w:id="6" w:name="_Toc240670766"/>
       <w:r>
         <w:lastRenderedPageBreak/>
         <w:t>3.4 Configuración del servidor</w:t>
@@ -4507,7 +4771,7 @@
       <w:pPr>
         <w:pStyle w:val="Heading2"/>
       </w:pPr>
-      <w:bookmarkStart w:id="7" w:name="_Toc240670070"/>
+      <w:bookmarkStart w:id="7" w:name="_Toc240670767"/>
       <w:r>
         <w:t>3.5 Archivos de configuración por perfil</w:t>
       </w:r>
@@ -4727,7 +4991,7 @@
       <w:pPr>
         <w:pStyle w:val="Heading2"/>
       </w:pPr>
-      <w:bookmarkStart w:id="8" w:name="_Toc240670071"/>
+      <w:bookmarkStart w:id="8" w:name="_Toc240670768"/>
       <w:r>
         <w:t>3.6 Ejecución del servidor</w:t>
       </w:r>
@@ -4837,7 +5101,7 @@
       <w:pPr>
         <w:pStyle w:val="Heading2"/>
       </w:pPr>
-      <w:bookmarkStart w:id="9" w:name="_Toc240670072"/>
+      <w:bookmarkStart w:id="9" w:name="_Toc240670769"/>
       <w:r>
         <w:t>3.7 Consulta directa al servidor</w:t>
       </w:r>
@@ -5738,7 +6002,7 @@
       <w:pPr>
         <w:pStyle w:val="Heading1"/>
       </w:pPr>
-      <w:bookmarkStart w:id="10" w:name="_Toc240670073"/>
+      <w:bookmarkStart w:id="10" w:name="_Toc240670770"/>
       <w:r>
         <w:t>4. Paso 2: Creación del Config Client</w:t>
       </w:r>
@@ -5756,7 +6020,7 @@
       <w:pPr>
         <w:pStyle w:val="Heading2"/>
       </w:pPr>
-      <w:bookmarkStart w:id="11" w:name="_Toc240670074"/>
+      <w:bookmarkStart w:id="11" w:name="_Toc240670771"/>
       <w:r>
         <w:t>4.1 Creación del proyecto</w:t>
       </w:r>
@@ -6251,7 +6515,7 @@
       <w:pPr>
         <w:pStyle w:val="Heading2"/>
       </w:pPr>
-      <w:bookmarkStart w:id="12" w:name="_Toc240670075"/>
+      <w:bookmarkStart w:id="12" w:name="_Toc240670772"/>
       <w:r>
         <w:t>4.2 Dependencia en el pom.xml</w:t>
       </w:r>
@@ -6361,7 +6625,7 @@
       <w:pPr>
         <w:pStyle w:val="Heading2"/>
       </w:pPr>
-      <w:bookmarkStart w:id="13" w:name="_Toc240670076"/>
+      <w:bookmarkStart w:id="13" w:name="_Toc240670773"/>
       <w:r>
         <w:t>4.3 Configuración del cliente</w:t>
       </w:r>
@@ -6744,7 +7008,7 @@
       <w:pPr>
         <w:pStyle w:val="Heading2"/>
       </w:pPr>
-      <w:bookmarkStart w:id="14" w:name="_Toc240670077"/>
+      <w:bookmarkStart w:id="14" w:name="_Toc240670774"/>
       <w:r>
         <w:lastRenderedPageBreak/>
         <w:t>4.4 Clase principal</w:t>
@@ -7035,7 +7299,7 @@
       <w:pPr>
         <w:pStyle w:val="Heading2"/>
       </w:pPr>
-      <w:bookmarkStart w:id="15" w:name="_Toc240670078"/>
+      <w:bookmarkStart w:id="15" w:name="_Toc240670775"/>
       <w:r>
         <w:t>4.5 Controlador REST</w:t>
       </w:r>
@@ -7404,7 +7668,7 @@
       <w:pPr>
         <w:pStyle w:val="Heading2"/>
       </w:pPr>
-      <w:bookmarkStart w:id="16" w:name="_Toc240670079"/>
+      <w:bookmarkStart w:id="16" w:name="_Toc240670776"/>
       <w:r>
         <w:t>4.6 Ejecución del cliente</w:t>
       </w:r>
@@ -7583,7 +7847,7 @@
       <w:pPr>
         <w:pStyle w:val="Heading1"/>
       </w:pPr>
-      <w:bookmarkStart w:id="17" w:name="_Toc240670080"/>
+      <w:bookmarkStart w:id="17" w:name="_Toc240670777"/>
       <w:r>
         <w:t>5. Pruebas por perfil</w:t>
       </w:r>
@@ -8235,7 +8499,7 @@
       <w:pPr>
         <w:pStyle w:val="Heading2"/>
       </w:pPr>
-      <w:bookmarkStart w:id="18" w:name="_Toc240670081"/>
+      <w:bookmarkStart w:id="18" w:name="_Toc240670778"/>
       <w:r>
         <w:t>5.1 Perfil default</w:t>
       </w:r>
@@ -8517,7 +8781,7 @@
       <w:pPr>
         <w:pStyle w:val="Heading2"/>
       </w:pPr>
-      <w:bookmarkStart w:id="19" w:name="_Toc240670082"/>
+      <w:bookmarkStart w:id="19" w:name="_Toc240670779"/>
       <w:r>
         <w:t>5.2 Perfil dev</w:t>
       </w:r>
@@ -8798,7 +9062,7 @@
       <w:pPr>
         <w:pStyle w:val="Heading2"/>
       </w:pPr>
-      <w:bookmarkStart w:id="20" w:name="_Toc240670083"/>
+      <w:bookmarkStart w:id="20" w:name="_Toc240670780"/>
       <w:r>
         <w:t>5.3 Perfil uat</w:t>
       </w:r>
@@ -9079,7 +9343,7 @@
       <w:pPr>
         <w:pStyle w:val="Heading1"/>
       </w:pPr>
-      <w:bookmarkStart w:id="21" w:name="_Toc240670084"/>
+      <w:bookmarkStart w:id="21" w:name="_Toc240670781"/>
       <w:r>
         <w:t>6. Pruebas automatizadas</w:t>
       </w:r>
@@ -9479,11 +9743,2255 @@
       <w:pPr>
         <w:pStyle w:val="Heading1"/>
       </w:pPr>
-      <w:bookmarkStart w:id="22" w:name="_Toc240670085"/>
-      <w:r>
-        <w:t>7. Observaciones sobre el enunciado</w:t>
+      <w:bookmarkStart w:id="22" w:name="_Toc240670782"/>
+      <w:r>
+        <w:t>7. Extras opcionales</w:t>
       </w:r>
       <w:bookmarkEnd w:id="22"/>
+    </w:p>
+    <w:p>
+      <w:pPr>
+        <w:spacing w:after="120" w:line="276" w:lineRule="auto"/>
+      </w:pPr>
+      <w:r>
+        <w:t xml:space="preserve">Fuera del alcance del enunciado, el repositorio incluye extras en la carpeta </w:t>
+      </w:r>
+      <w:r>
+        <w:rPr>
+          <w:rFonts w:ascii="Consolas" w:eastAsia="Consolas" w:hAnsi="Consolas" w:cs="Consolas"/>
+          <w:sz w:val="20"/>
+          <w:szCs w:val="20"/>
+        </w:rPr>
+        <w:t>extras/</w:t>
+      </w:r>
+      <w:r>
+        <w:t xml:space="preserve">. </w:t>
+      </w:r>
+      <w:r>
+        <w:rPr>
+          <w:b/>
+          <w:bCs/>
+        </w:rPr>
+        <w:t>No modifican ningún archivo de config-server ni de loan-service</w:t>
+      </w:r>
+      <w:r>
+        <w:t>: se activan con variables de entorno y carpetas adicionales.</w:t>
+      </w:r>
+    </w:p>
+    <w:p>
+      <w:pPr>
+        <w:pStyle w:val="Heading2"/>
+      </w:pPr>
+      <w:bookmarkStart w:id="23" w:name="_Toc240670783"/>
+      <w:r>
+        <w:t>7.1 Perfil git del Config Server</w:t>
+      </w:r>
+      <w:bookmarkEnd w:id="23"/>
+    </w:p>
+    <w:p>
+      <w:pPr>
+        <w:spacing w:after="120" w:line="276" w:lineRule="auto"/>
+      </w:pPr>
+      <w:r>
+        <w:t xml:space="preserve">En lugar de leer </w:t>
+      </w:r>
+      <w:r>
+        <w:rPr>
+          <w:rFonts w:ascii="Consolas" w:eastAsia="Consolas" w:hAnsi="Consolas" w:cs="Consolas"/>
+          <w:sz w:val="20"/>
+          <w:szCs w:val="20"/>
+        </w:rPr>
+        <w:t>classpath:/config</w:t>
+      </w:r>
+      <w:r>
+        <w:t xml:space="preserve">, el servidor puede servir la configuración desde un repositorio Git. Se activa con </w:t>
+      </w:r>
+      <w:r>
+        <w:rPr>
+          <w:rFonts w:ascii="Consolas" w:eastAsia="Consolas" w:hAnsi="Consolas" w:cs="Consolas"/>
+          <w:sz w:val="20"/>
+          <w:szCs w:val="20"/>
+        </w:rPr>
+        <w:t>SPRING_PROFILES_ACTIVE=git</w:t>
+      </w:r>
+      <w:r>
+        <w:t xml:space="preserve">, que tiene precedencia sobre el </w:t>
+      </w:r>
+      <w:r>
+        <w:rPr>
+          <w:rFonts w:ascii="Consolas" w:eastAsia="Consolas" w:hAnsi="Consolas" w:cs="Consolas"/>
+          <w:sz w:val="20"/>
+          <w:szCs w:val="20"/>
+        </w:rPr>
+        <w:t>native</w:t>
+      </w:r>
+      <w:r>
+        <w:t xml:space="preserve"> del application.properties. Los archivos de ejemplo terminan en "(Git)" para distinguir el origen de cada respuesta.</w:t>
+      </w:r>
+    </w:p>
+    <w:p>
+      <w:pPr>
+        <w:keepNext/>
+        <w:spacing w:before="120" w:after="40"/>
+      </w:pPr>
+      <w:r>
+        <w:rPr>
+          <w:i/>
+          <w:iCs/>
+          <w:color w:val="595959"/>
+          <w:sz w:val="20"/>
+          <w:szCs w:val="20"/>
+        </w:rPr>
+        <w:t>extras/git-backend/application-git.properties</w:t>
+      </w:r>
+    </w:p>
+    <w:p>
+      <w:pPr>
+        <w:keepNext/>
+        <w:keepLines/>
+        <w:pBdr>
+          <w:left w:val="single" w:sz="18" w:space="6" w:color="1F3864"/>
+        </w:pBdr>
+        <w:shd w:val="clear" w:color="auto" w:fill="F2F2F2"/>
+        <w:spacing w:line="252" w:lineRule="auto"/>
+        <w:ind w:left="200"/>
+      </w:pPr>
+      <w:r>
+        <w:rPr>
+          <w:rFonts w:ascii="Consolas" w:eastAsia="Consolas" w:hAnsi="Consolas" w:cs="Consolas"/>
+          <w:sz w:val="17"/>
+          <w:szCs w:val="17"/>
+        </w:rPr>
+        <w:t>spring.cloud.config.server.git.uri=${CONFIG_GIT_URI}</w:t>
+      </w:r>
+    </w:p>
+    <w:p>
+      <w:pPr>
+        <w:keepNext/>
+        <w:keepLines/>
+        <w:pBdr>
+          <w:left w:val="single" w:sz="18" w:space="6" w:color="1F3864"/>
+        </w:pBdr>
+        <w:shd w:val="clear" w:color="auto" w:fill="F2F2F2"/>
+        <w:spacing w:line="252" w:lineRule="auto"/>
+        <w:ind w:left="200"/>
+      </w:pPr>
+      <w:r>
+        <w:rPr>
+          <w:rFonts w:ascii="Consolas" w:eastAsia="Consolas" w:hAnsi="Consolas" w:cs="Consolas"/>
+          <w:sz w:val="17"/>
+          <w:szCs w:val="17"/>
+        </w:rPr>
+        <w:t>spring.cloud.config.server.git.default-label=main</w:t>
+      </w:r>
+    </w:p>
+    <w:p>
+      <w:pPr>
+        <w:keepNext/>
+        <w:keepLines/>
+        <w:pBdr>
+          <w:left w:val="single" w:sz="18" w:space="6" w:color="1F3864"/>
+        </w:pBdr>
+        <w:shd w:val="clear" w:color="auto" w:fill="F2F2F2"/>
+        <w:spacing w:line="252" w:lineRule="auto"/>
+        <w:ind w:left="200"/>
+      </w:pPr>
+      <w:r>
+        <w:rPr>
+          <w:rFonts w:ascii="Consolas" w:eastAsia="Consolas" w:hAnsi="Consolas" w:cs="Consolas"/>
+          <w:sz w:val="17"/>
+          <w:szCs w:val="17"/>
+        </w:rPr>
+        <w:t>spring.cloud.config.server.git.search-paths=extras/git-backend/config-repo</w:t>
+      </w:r>
+    </w:p>
+    <w:p>
+      <w:pPr>
+        <w:keepLines/>
+        <w:pBdr>
+          <w:left w:val="single" w:sz="18" w:space="6" w:color="1F3864"/>
+        </w:pBdr>
+        <w:shd w:val="clear" w:color="auto" w:fill="F2F2F2"/>
+        <w:spacing w:line="252" w:lineRule="auto"/>
+        <w:ind w:left="200"/>
+      </w:pPr>
+      <w:r>
+        <w:rPr>
+          <w:rFonts w:ascii="Consolas" w:eastAsia="Consolas" w:hAnsi="Consolas" w:cs="Consolas"/>
+          <w:sz w:val="17"/>
+          <w:szCs w:val="17"/>
+        </w:rPr>
+        <w:t>spring.cloud.config.server.git.clone-on-start=true</w:t>
+      </w:r>
+    </w:p>
+    <w:p>
+      <w:pPr>
+        <w:spacing w:after="120"/>
+      </w:pPr>
+    </w:p>
+    <w:p>
+      <w:pPr>
+        <w:spacing w:after="120" w:line="276" w:lineRule="auto"/>
+      </w:pPr>
+      <w:r>
+        <w:t xml:space="preserve">El campo </w:t>
+      </w:r>
+      <w:r>
+        <w:rPr>
+          <w:rFonts w:ascii="Consolas" w:eastAsia="Consolas" w:hAnsi="Consolas" w:cs="Consolas"/>
+          <w:sz w:val="20"/>
+          <w:szCs w:val="20"/>
+        </w:rPr>
+        <w:t>version</w:t>
+      </w:r>
+      <w:r>
+        <w:t xml:space="preserve"> de la respuesta es el hash del commit del que se leyó la configuración. El loan-service del taller, sin ningún cambio, recibe el mensaje del repositorio Git:</w:t>
+      </w:r>
+    </w:p>
+    <w:p>
+      <w:pPr>
+        <w:keepNext/>
+        <w:spacing w:before="120" w:after="40"/>
+      </w:pPr>
+      <w:r>
+        <w:rPr>
+          <w:i/>
+          <w:iCs/>
+          <w:color w:val="595959"/>
+          <w:sz w:val="20"/>
+          <w:szCs w:val="20"/>
+        </w:rPr>
+        <w:t>Servidor con perfil git: GET /loan-service/dev</w:t>
+      </w:r>
+    </w:p>
+    <w:p>
+      <w:pPr>
+        <w:keepNext/>
+        <w:keepLines/>
+        <w:pBdr>
+          <w:left w:val="single" w:sz="18" w:space="6" w:color="1F3864"/>
+        </w:pBdr>
+        <w:shd w:val="clear" w:color="auto" w:fill="F2F2F2"/>
+        <w:spacing w:line="252" w:lineRule="auto"/>
+        <w:ind w:left="200"/>
+      </w:pPr>
+      <w:r>
+        <w:rPr>
+          <w:rFonts w:ascii="Consolas" w:eastAsia="Consolas" w:hAnsi="Consolas" w:cs="Consolas"/>
+          <w:sz w:val="17"/>
+          <w:szCs w:val="17"/>
+        </w:rPr>
+        <w:t>$ curl http://localhost:8888/loan-service/dev</w:t>
+      </w:r>
+    </w:p>
+    <w:p>
+      <w:pPr>
+        <w:keepLines/>
+        <w:pBdr>
+          <w:left w:val="single" w:sz="18" w:space="6" w:color="1F3864"/>
+        </w:pBdr>
+        <w:shd w:val="clear" w:color="auto" w:fill="F2F2F2"/>
+        <w:spacing w:line="252" w:lineRule="auto"/>
+        <w:ind w:left="200"/>
+      </w:pPr>
+      <w:r>
+        <w:rPr>
+          <w:rFonts w:ascii="Consolas" w:eastAsia="Consolas" w:hAnsi="Consolas" w:cs="Consolas"/>
+          <w:sz w:val="17"/>
+          <w:szCs w:val="17"/>
+        </w:rPr>
+        <w:t>{"name":"loan-service","profiles":["dev"],"label":null,"version":"59c32532246ce2d287d2e9f9b5228eb01a2d9b3a","state":"","propertySources":[{"name":"file:///C:/Users/sabas/Documentos/spring-cloud-config-taller/extras/git-backend/config-repo/loan-service-dev.properties","source":{"server.port":"8082","application.message":"Welcome From Development Profile (Git)"}},{"name":"file:///C:/Users/sabas/Documentos/spring-cloud-config-taller/extras/git-backend/config-repo/loan-service.properties","source":{"server.port</w:t>
+      </w:r>
+      <w:r>
+        <w:rPr>
+          <w:rFonts w:ascii="Consolas" w:eastAsia="Consolas" w:hAnsi="Consolas" w:cs="Consolas"/>
+          <w:sz w:val="17"/>
+          <w:szCs w:val="17"/>
+        </w:rPr>
+        <w:t>":"8081","application.message":"Welcome From Default Profile (Git)"}}]}</w:t>
+      </w:r>
+    </w:p>
+    <w:p>
+      <w:pPr>
+        <w:spacing w:after="120"/>
+      </w:pPr>
+    </w:p>
+    <w:p>
+      <w:pPr>
+        <w:keepNext/>
+        <w:spacing w:before="120" w:after="40"/>
+      </w:pPr>
+      <w:r>
+        <w:rPr>
+          <w:i/>
+          <w:iCs/>
+          <w:color w:val="595959"/>
+          <w:sz w:val="20"/>
+          <w:szCs w:val="20"/>
+        </w:rPr>
+        <w:lastRenderedPageBreak/>
+        <w:t>loan-service (perfil dev, sin cambios) contra ese servidor</w:t>
+      </w:r>
+    </w:p>
+    <w:p>
+      <w:pPr>
+        <w:keepNext/>
+        <w:keepLines/>
+        <w:pBdr>
+          <w:left w:val="single" w:sz="18" w:space="6" w:color="1F3864"/>
+        </w:pBdr>
+        <w:shd w:val="clear" w:color="auto" w:fill="F2F2F2"/>
+        <w:spacing w:line="252" w:lineRule="auto"/>
+        <w:ind w:left="200"/>
+      </w:pPr>
+      <w:r>
+        <w:rPr>
+          <w:rFonts w:ascii="Consolas" w:eastAsia="Consolas" w:hAnsi="Consolas" w:cs="Consolas"/>
+          <w:sz w:val="17"/>
+          <w:szCs w:val="17"/>
+        </w:rPr>
+        <w:t>$ (config-server con SPRING_PROFILES_ACTIVE=git; loan-service del taller sin cambios, perfil dev)</w:t>
+      </w:r>
+    </w:p>
+    <w:p>
+      <w:pPr>
+        <w:keepNext/>
+        <w:keepLines/>
+        <w:pBdr>
+          <w:left w:val="single" w:sz="18" w:space="6" w:color="1F3864"/>
+        </w:pBdr>
+        <w:shd w:val="clear" w:color="auto" w:fill="F2F2F2"/>
+        <w:spacing w:line="252" w:lineRule="auto"/>
+        <w:ind w:left="200"/>
+      </w:pPr>
+      <w:r>
+        <w:rPr>
+          <w:rFonts w:ascii="Consolas" w:eastAsia="Consolas" w:hAnsi="Consolas" w:cs="Consolas"/>
+          <w:sz w:val="17"/>
+          <w:szCs w:val="17"/>
+        </w:rPr>
+        <w:t>$ curl -i http://localhost:8082/message</w:t>
+      </w:r>
+    </w:p>
+    <w:p>
+      <w:pPr>
+        <w:keepNext/>
+        <w:keepLines/>
+        <w:pBdr>
+          <w:left w:val="single" w:sz="18" w:space="6" w:color="1F3864"/>
+        </w:pBdr>
+        <w:shd w:val="clear" w:color="auto" w:fill="F2F2F2"/>
+        <w:spacing w:line="252" w:lineRule="auto"/>
+        <w:ind w:left="200"/>
+      </w:pPr>
+      <w:r>
+        <w:rPr>
+          <w:rFonts w:ascii="Consolas" w:eastAsia="Consolas" w:hAnsi="Consolas" w:cs="Consolas"/>
+          <w:sz w:val="17"/>
+          <w:szCs w:val="17"/>
+        </w:rPr>
+        <w:t xml:space="preserve">HTTP/1.1 200 </w:t>
+      </w:r>
+    </w:p>
+    <w:p>
+      <w:pPr>
+        <w:keepNext/>
+        <w:keepLines/>
+        <w:pBdr>
+          <w:left w:val="single" w:sz="18" w:space="6" w:color="1F3864"/>
+        </w:pBdr>
+        <w:shd w:val="clear" w:color="auto" w:fill="F2F2F2"/>
+        <w:spacing w:line="252" w:lineRule="auto"/>
+        <w:ind w:left="200"/>
+      </w:pPr>
+      <w:r>
+        <w:rPr>
+          <w:rFonts w:ascii="Consolas" w:eastAsia="Consolas" w:hAnsi="Consolas" w:cs="Consolas"/>
+          <w:sz w:val="17"/>
+          <w:szCs w:val="17"/>
+        </w:rPr>
+        <w:t xml:space="preserve"> </w:t>
+      </w:r>
+    </w:p>
+    <w:p>
+      <w:pPr>
+        <w:keepLines/>
+        <w:pBdr>
+          <w:left w:val="single" w:sz="18" w:space="6" w:color="1F3864"/>
+        </w:pBdr>
+        <w:shd w:val="clear" w:color="auto" w:fill="F2F2F2"/>
+        <w:spacing w:line="252" w:lineRule="auto"/>
+        <w:ind w:left="200"/>
+      </w:pPr>
+      <w:r>
+        <w:rPr>
+          <w:rFonts w:ascii="Consolas" w:eastAsia="Consolas" w:hAnsi="Consolas" w:cs="Consolas"/>
+          <w:sz w:val="17"/>
+          <w:szCs w:val="17"/>
+        </w:rPr>
+        <w:t>Welcome From Development Profile (Git)</w:t>
+      </w:r>
+    </w:p>
+    <w:p>
+      <w:pPr>
+        <w:spacing w:after="120"/>
+      </w:pPr>
+    </w:p>
+    <w:p>
+      <w:pPr>
+        <w:pStyle w:val="Heading2"/>
+      </w:pPr>
+      <w:bookmarkStart w:id="24" w:name="_Toc240670784"/>
+      <w:r>
+        <w:t>7.2 Docker Compose y MySQL</w:t>
+      </w:r>
+      <w:bookmarkEnd w:id="24"/>
+    </w:p>
+    <w:p>
+      <w:pPr>
+        <w:spacing w:after="120" w:line="276" w:lineRule="auto"/>
+      </w:pPr>
+      <w:r>
+        <w:t xml:space="preserve">Un </w:t>
+      </w:r>
+      <w:r>
+        <w:rPr>
+          <w:rFonts w:ascii="Consolas" w:eastAsia="Consolas" w:hAnsi="Consolas" w:cs="Consolas"/>
+          <w:sz w:val="20"/>
+          <w:szCs w:val="20"/>
+        </w:rPr>
+        <w:t>docker-compose.yml</w:t>
+      </w:r>
+      <w:r>
+        <w:t xml:space="preserve"> levanta tres servicios: MySQL, el Config Server del taller y </w:t>
+      </w:r>
+      <w:r>
+        <w:rPr>
+          <w:rFonts w:ascii="Consolas" w:eastAsia="Consolas" w:hAnsi="Consolas" w:cs="Consolas"/>
+          <w:sz w:val="20"/>
+          <w:szCs w:val="20"/>
+        </w:rPr>
+        <w:t>loan-service-mysql</w:t>
+      </w:r>
+      <w:r>
+        <w:t>, una variante separada del cliente que guarda préstamos en MySQL con las capas controller, service y repository, DTOs con validación y transacciones.</w:t>
+      </w:r>
+    </w:p>
+    <w:tbl>
+      <w:tblPr>
+        <w:tblW w:w="9026" w:type="dxa"/>
+        <w:tblBorders>
+          <w:top w:val="single" w:sz="4" w:space="0" w:color="auto"/>
+          <w:left w:val="single" w:sz="4" w:space="0" w:color="auto"/>
+          <w:bottom w:val="single" w:sz="4" w:space="0" w:color="auto"/>
+          <w:right w:val="single" w:sz="4" w:space="0" w:color="auto"/>
+          <w:insideH w:val="single" w:sz="4" w:space="0" w:color="auto"/>
+          <w:insideV w:val="single" w:sz="4" w:space="0" w:color="auto"/>
+        </w:tblBorders>
+        <w:tblCellMar>
+          <w:left w:w="10" w:type="dxa"/>
+          <w:right w:w="10" w:type="dxa"/>
+        </w:tblCellMar>
+        <w:tblLook w:val="04A0" w:firstRow="1" w:lastRow="0" w:firstColumn="1" w:lastColumn="0" w:noHBand="0" w:noVBand="1"/>
+      </w:tblPr>
+      <w:tblGrid>
+        <w:gridCol w:w="2500"/>
+        <w:gridCol w:w="1100"/>
+        <w:gridCol w:w="5426"/>
+      </w:tblGrid>
+      <w:tr>
+        <w:tblPrEx>
+          <w:tblCellMar>
+            <w:top w:w="0" w:type="dxa"/>
+            <w:bottom w:w="0" w:type="dxa"/>
+          </w:tblCellMar>
+        </w:tblPrEx>
+        <w:trPr>
+          <w:tblHeader/>
+        </w:trPr>
+        <w:tc>
+          <w:tcPr>
+            <w:tcW w:w="2500" w:type="dxa"/>
+            <w:tcBorders>
+              <w:top w:val="single" w:sz="4" w:space="0" w:color="BFBFBF"/>
+              <w:left w:val="single" w:sz="4" w:space="0" w:color="BFBFBF"/>
+              <w:bottom w:val="single" w:sz="4" w:space="0" w:color="BFBFBF"/>
+              <w:right w:val="single" w:sz="4" w:space="0" w:color="BFBFBF"/>
+            </w:tcBorders>
+            <w:shd w:val="clear" w:color="auto" w:fill="1F3864"/>
+            <w:tcMar>
+              <w:top w:w="70" w:type="dxa"/>
+              <w:left w:w="110" w:type="dxa"/>
+              <w:bottom w:w="70" w:type="dxa"/>
+              <w:right w:w="110" w:type="dxa"/>
+            </w:tcMar>
+            <w:vAlign w:val="center"/>
+          </w:tcPr>
+          <w:p>
+            <w:r>
+              <w:rPr>
+                <w:b/>
+                <w:bCs/>
+                <w:color w:val="FFFFFF"/>
+                <w:sz w:val="21"/>
+                <w:szCs w:val="21"/>
+              </w:rPr>
+              <w:t>Servicio</w:t>
+            </w:r>
+          </w:p>
+        </w:tc>
+        <w:tc>
+          <w:tcPr>
+            <w:tcW w:w="1100" w:type="dxa"/>
+            <w:tcBorders>
+              <w:top w:val="single" w:sz="4" w:space="0" w:color="BFBFBF"/>
+              <w:left w:val="single" w:sz="4" w:space="0" w:color="BFBFBF"/>
+              <w:bottom w:val="single" w:sz="4" w:space="0" w:color="BFBFBF"/>
+              <w:right w:val="single" w:sz="4" w:space="0" w:color="BFBFBF"/>
+            </w:tcBorders>
+            <w:shd w:val="clear" w:color="auto" w:fill="1F3864"/>
+            <w:tcMar>
+              <w:top w:w="70" w:type="dxa"/>
+              <w:left w:w="110" w:type="dxa"/>
+              <w:bottom w:w="70" w:type="dxa"/>
+              <w:right w:w="110" w:type="dxa"/>
+            </w:tcMar>
+            <w:vAlign w:val="center"/>
+          </w:tcPr>
+          <w:p>
+            <w:r>
+              <w:rPr>
+                <w:b/>
+                <w:bCs/>
+                <w:color w:val="FFFFFF"/>
+                <w:sz w:val="21"/>
+                <w:szCs w:val="21"/>
+              </w:rPr>
+              <w:t>Puerto</w:t>
+            </w:r>
+          </w:p>
+        </w:tc>
+        <w:tc>
+          <w:tcPr>
+            <w:tcW w:w="5426" w:type="dxa"/>
+            <w:tcBorders>
+              <w:top w:val="single" w:sz="4" w:space="0" w:color="BFBFBF"/>
+              <w:left w:val="single" w:sz="4" w:space="0" w:color="BFBFBF"/>
+              <w:bottom w:val="single" w:sz="4" w:space="0" w:color="BFBFBF"/>
+              <w:right w:val="single" w:sz="4" w:space="0" w:color="BFBFBF"/>
+            </w:tcBorders>
+            <w:shd w:val="clear" w:color="auto" w:fill="1F3864"/>
+            <w:tcMar>
+              <w:top w:w="70" w:type="dxa"/>
+              <w:left w:w="110" w:type="dxa"/>
+              <w:bottom w:w="70" w:type="dxa"/>
+              <w:right w:w="110" w:type="dxa"/>
+            </w:tcMar>
+            <w:vAlign w:val="center"/>
+          </w:tcPr>
+          <w:p>
+            <w:r>
+              <w:rPr>
+                <w:b/>
+                <w:bCs/>
+                <w:color w:val="FFFFFF"/>
+                <w:sz w:val="21"/>
+                <w:szCs w:val="21"/>
+              </w:rPr>
+              <w:t>Función</w:t>
+            </w:r>
+          </w:p>
+        </w:tc>
+      </w:tr>
+      <w:tr>
+        <w:tblPrEx>
+          <w:tblCellMar>
+            <w:top w:w="0" w:type="dxa"/>
+            <w:bottom w:w="0" w:type="dxa"/>
+          </w:tblCellMar>
+        </w:tblPrEx>
+        <w:trPr>
+          <w:cantSplit/>
+        </w:trPr>
+        <w:tc>
+          <w:tcPr>
+            <w:tcW w:w="2500" w:type="dxa"/>
+            <w:tcBorders>
+              <w:top w:val="single" w:sz="4" w:space="0" w:color="BFBFBF"/>
+              <w:left w:val="single" w:sz="4" w:space="0" w:color="BFBFBF"/>
+              <w:bottom w:val="single" w:sz="4" w:space="0" w:color="BFBFBF"/>
+              <w:right w:val="single" w:sz="4" w:space="0" w:color="BFBFBF"/>
+            </w:tcBorders>
+            <w:tcMar>
+              <w:top w:w="70" w:type="dxa"/>
+              <w:left w:w="110" w:type="dxa"/>
+              <w:bottom w:w="70" w:type="dxa"/>
+              <w:right w:w="110" w:type="dxa"/>
+            </w:tcMar>
+            <w:vAlign w:val="center"/>
+          </w:tcPr>
+          <w:p>
+            <w:r>
+              <w:rPr>
+                <w:rFonts w:ascii="Consolas" w:eastAsia="Consolas" w:hAnsi="Consolas" w:cs="Consolas"/>
+                <w:sz w:val="19"/>
+                <w:szCs w:val="19"/>
+              </w:rPr>
+              <w:t>mysql (mysql:8)</w:t>
+            </w:r>
+          </w:p>
+        </w:tc>
+        <w:tc>
+          <w:tcPr>
+            <w:tcW w:w="1100" w:type="dxa"/>
+            <w:tcBorders>
+              <w:top w:val="single" w:sz="4" w:space="0" w:color="BFBFBF"/>
+              <w:left w:val="single" w:sz="4" w:space="0" w:color="BFBFBF"/>
+              <w:bottom w:val="single" w:sz="4" w:space="0" w:color="BFBFBF"/>
+              <w:right w:val="single" w:sz="4" w:space="0" w:color="BFBFBF"/>
+            </w:tcBorders>
+            <w:tcMar>
+              <w:top w:w="70" w:type="dxa"/>
+              <w:left w:w="110" w:type="dxa"/>
+              <w:bottom w:w="70" w:type="dxa"/>
+              <w:right w:w="110" w:type="dxa"/>
+            </w:tcMar>
+            <w:vAlign w:val="center"/>
+          </w:tcPr>
+          <w:p>
+            <w:r>
+              <w:rPr>
+                <w:sz w:val="21"/>
+                <w:szCs w:val="21"/>
+              </w:rPr>
+              <w:t>3308</w:t>
+            </w:r>
+          </w:p>
+        </w:tc>
+        <w:tc>
+          <w:tcPr>
+            <w:tcW w:w="5426" w:type="dxa"/>
+            <w:tcBorders>
+              <w:top w:val="single" w:sz="4" w:space="0" w:color="BFBFBF"/>
+              <w:left w:val="single" w:sz="4" w:space="0" w:color="BFBFBF"/>
+              <w:bottom w:val="single" w:sz="4" w:space="0" w:color="BFBFBF"/>
+              <w:right w:val="single" w:sz="4" w:space="0" w:color="BFBFBF"/>
+            </w:tcBorders>
+            <w:tcMar>
+              <w:top w:w="70" w:type="dxa"/>
+              <w:left w:w="110" w:type="dxa"/>
+              <w:bottom w:w="70" w:type="dxa"/>
+              <w:right w:w="110" w:type="dxa"/>
+            </w:tcMar>
+            <w:vAlign w:val="center"/>
+          </w:tcPr>
+          <w:p>
+            <w:r>
+              <w:rPr>
+                <w:sz w:val="21"/>
+                <w:szCs w:val="21"/>
+              </w:rPr>
+              <w:t>Base loans_db; el esquema se crea con db/schema.sql</w:t>
+            </w:r>
+          </w:p>
+        </w:tc>
+      </w:tr>
+      <w:tr>
+        <w:tblPrEx>
+          <w:tblCellMar>
+            <w:top w:w="0" w:type="dxa"/>
+            <w:bottom w:w="0" w:type="dxa"/>
+          </w:tblCellMar>
+        </w:tblPrEx>
+        <w:trPr>
+          <w:cantSplit/>
+        </w:trPr>
+        <w:tc>
+          <w:tcPr>
+            <w:tcW w:w="2500" w:type="dxa"/>
+            <w:tcBorders>
+              <w:top w:val="single" w:sz="4" w:space="0" w:color="BFBFBF"/>
+              <w:left w:val="single" w:sz="4" w:space="0" w:color="BFBFBF"/>
+              <w:bottom w:val="single" w:sz="4" w:space="0" w:color="BFBFBF"/>
+              <w:right w:val="single" w:sz="4" w:space="0" w:color="BFBFBF"/>
+            </w:tcBorders>
+            <w:tcMar>
+              <w:top w:w="70" w:type="dxa"/>
+              <w:left w:w="110" w:type="dxa"/>
+              <w:bottom w:w="70" w:type="dxa"/>
+              <w:right w:w="110" w:type="dxa"/>
+            </w:tcMar>
+            <w:vAlign w:val="center"/>
+          </w:tcPr>
+          <w:p>
+            <w:r>
+              <w:rPr>
+                <w:rFonts w:ascii="Consolas" w:eastAsia="Consolas" w:hAnsi="Consolas" w:cs="Consolas"/>
+                <w:sz w:val="19"/>
+                <w:szCs w:val="19"/>
+              </w:rPr>
+              <w:t>config-server</w:t>
+            </w:r>
+          </w:p>
+        </w:tc>
+        <w:tc>
+          <w:tcPr>
+            <w:tcW w:w="1100" w:type="dxa"/>
+            <w:tcBorders>
+              <w:top w:val="single" w:sz="4" w:space="0" w:color="BFBFBF"/>
+              <w:left w:val="single" w:sz="4" w:space="0" w:color="BFBFBF"/>
+              <w:bottom w:val="single" w:sz="4" w:space="0" w:color="BFBFBF"/>
+              <w:right w:val="single" w:sz="4" w:space="0" w:color="BFBFBF"/>
+            </w:tcBorders>
+            <w:tcMar>
+              <w:top w:w="70" w:type="dxa"/>
+              <w:left w:w="110" w:type="dxa"/>
+              <w:bottom w:w="70" w:type="dxa"/>
+              <w:right w:w="110" w:type="dxa"/>
+            </w:tcMar>
+            <w:vAlign w:val="center"/>
+          </w:tcPr>
+          <w:p>
+            <w:r>
+              <w:rPr>
+                <w:sz w:val="21"/>
+                <w:szCs w:val="21"/>
+              </w:rPr>
+              <w:t>8888</w:t>
+            </w:r>
+          </w:p>
+        </w:tc>
+        <w:tc>
+          <w:tcPr>
+            <w:tcW w:w="5426" w:type="dxa"/>
+            <w:tcBorders>
+              <w:top w:val="single" w:sz="4" w:space="0" w:color="BFBFBF"/>
+              <w:left w:val="single" w:sz="4" w:space="0" w:color="BFBFBF"/>
+              <w:bottom w:val="single" w:sz="4" w:space="0" w:color="BFBFBF"/>
+              <w:right w:val="single" w:sz="4" w:space="0" w:color="BFBFBF"/>
+            </w:tcBorders>
+            <w:tcMar>
+              <w:top w:w="70" w:type="dxa"/>
+              <w:left w:w="110" w:type="dxa"/>
+              <w:bottom w:w="70" w:type="dxa"/>
+              <w:right w:w="110" w:type="dxa"/>
+            </w:tcMar>
+            <w:vAlign w:val="center"/>
+          </w:tcPr>
+          <w:p>
+            <w:r>
+              <w:rPr>
+                <w:sz w:val="21"/>
+                <w:szCs w:val="21"/>
+              </w:rPr>
+              <w:t>El del taller, más la carpeta extras/config con la configuración del nuevo servicio</w:t>
+            </w:r>
+          </w:p>
+        </w:tc>
+      </w:tr>
+      <w:tr>
+        <w:tblPrEx>
+          <w:tblCellMar>
+            <w:top w:w="0" w:type="dxa"/>
+            <w:bottom w:w="0" w:type="dxa"/>
+          </w:tblCellMar>
+        </w:tblPrEx>
+        <w:trPr>
+          <w:cantSplit/>
+        </w:trPr>
+        <w:tc>
+          <w:tcPr>
+            <w:tcW w:w="2500" w:type="dxa"/>
+            <w:tcBorders>
+              <w:top w:val="single" w:sz="4" w:space="0" w:color="BFBFBF"/>
+              <w:left w:val="single" w:sz="4" w:space="0" w:color="BFBFBF"/>
+              <w:bottom w:val="single" w:sz="4" w:space="0" w:color="BFBFBF"/>
+              <w:right w:val="single" w:sz="4" w:space="0" w:color="BFBFBF"/>
+            </w:tcBorders>
+            <w:tcMar>
+              <w:top w:w="70" w:type="dxa"/>
+              <w:left w:w="110" w:type="dxa"/>
+              <w:bottom w:w="70" w:type="dxa"/>
+              <w:right w:w="110" w:type="dxa"/>
+            </w:tcMar>
+            <w:vAlign w:val="center"/>
+          </w:tcPr>
+          <w:p>
+            <w:r>
+              <w:rPr>
+                <w:rFonts w:ascii="Consolas" w:eastAsia="Consolas" w:hAnsi="Consolas" w:cs="Consolas"/>
+                <w:sz w:val="19"/>
+                <w:szCs w:val="19"/>
+              </w:rPr>
+              <w:t>loan-service-mysql</w:t>
+            </w:r>
+          </w:p>
+        </w:tc>
+        <w:tc>
+          <w:tcPr>
+            <w:tcW w:w="1100" w:type="dxa"/>
+            <w:tcBorders>
+              <w:top w:val="single" w:sz="4" w:space="0" w:color="BFBFBF"/>
+              <w:left w:val="single" w:sz="4" w:space="0" w:color="BFBFBF"/>
+              <w:bottom w:val="single" w:sz="4" w:space="0" w:color="BFBFBF"/>
+              <w:right w:val="single" w:sz="4" w:space="0" w:color="BFBFBF"/>
+            </w:tcBorders>
+            <w:tcMar>
+              <w:top w:w="70" w:type="dxa"/>
+              <w:left w:w="110" w:type="dxa"/>
+              <w:bottom w:w="70" w:type="dxa"/>
+              <w:right w:w="110" w:type="dxa"/>
+            </w:tcMar>
+            <w:vAlign w:val="center"/>
+          </w:tcPr>
+          <w:p>
+            <w:r>
+              <w:rPr>
+                <w:sz w:val="21"/>
+                <w:szCs w:val="21"/>
+              </w:rPr>
+              <w:t>8084</w:t>
+            </w:r>
+          </w:p>
+        </w:tc>
+        <w:tc>
+          <w:tcPr>
+            <w:tcW w:w="5426" w:type="dxa"/>
+            <w:tcBorders>
+              <w:top w:val="single" w:sz="4" w:space="0" w:color="BFBFBF"/>
+              <w:left w:val="single" w:sz="4" w:space="0" w:color="BFBFBF"/>
+              <w:bottom w:val="single" w:sz="4" w:space="0" w:color="BFBFBF"/>
+              <w:right w:val="single" w:sz="4" w:space="0" w:color="BFBFBF"/>
+            </w:tcBorders>
+            <w:tcMar>
+              <w:top w:w="70" w:type="dxa"/>
+              <w:left w:w="110" w:type="dxa"/>
+              <w:bottom w:w="70" w:type="dxa"/>
+              <w:right w:w="110" w:type="dxa"/>
+            </w:tcMar>
+            <w:vAlign w:val="center"/>
+          </w:tcPr>
+          <w:p>
+            <w:r>
+              <w:rPr>
+                <w:sz w:val="21"/>
+                <w:szCs w:val="21"/>
+              </w:rPr>
+              <w:t>API /loans; su configuración y la URL de MySQL vienen del Config Server</w:t>
+            </w:r>
+          </w:p>
+        </w:tc>
+      </w:tr>
+    </w:tbl>
+    <w:p>
+      <w:pPr>
+        <w:spacing w:after="160"/>
+      </w:pPr>
+    </w:p>
+    <w:p>
+      <w:pPr>
+        <w:keepNext/>
+        <w:spacing w:before="120" w:after="40"/>
+      </w:pPr>
+      <w:r>
+        <w:rPr>
+          <w:i/>
+          <w:iCs/>
+          <w:color w:val="595959"/>
+          <w:sz w:val="20"/>
+          <w:szCs w:val="20"/>
+        </w:rPr>
+        <w:t>extras/config/loan-service-mysql.properties (servido por el Config Server)</w:t>
+      </w:r>
+    </w:p>
+    <w:p>
+      <w:pPr>
+        <w:keepNext/>
+        <w:keepLines/>
+        <w:pBdr>
+          <w:left w:val="single" w:sz="18" w:space="6" w:color="1F3864"/>
+        </w:pBdr>
+        <w:shd w:val="clear" w:color="auto" w:fill="F2F2F2"/>
+        <w:spacing w:line="252" w:lineRule="auto"/>
+        <w:ind w:left="200"/>
+      </w:pPr>
+      <w:r>
+        <w:rPr>
+          <w:rFonts w:ascii="Consolas" w:eastAsia="Consolas" w:hAnsi="Consolas" w:cs="Consolas"/>
+          <w:sz w:val="17"/>
+          <w:szCs w:val="17"/>
+        </w:rPr>
+        <w:t>server.port=8084</w:t>
+      </w:r>
+    </w:p>
+    <w:p>
+      <w:pPr>
+        <w:keepNext/>
+        <w:keepLines/>
+        <w:pBdr>
+          <w:left w:val="single" w:sz="18" w:space="6" w:color="1F3864"/>
+        </w:pBdr>
+        <w:shd w:val="clear" w:color="auto" w:fill="F2F2F2"/>
+        <w:spacing w:line="252" w:lineRule="auto"/>
+        <w:ind w:left="200"/>
+      </w:pPr>
+      <w:r>
+        <w:rPr>
+          <w:rFonts w:ascii="Consolas" w:eastAsia="Consolas" w:hAnsi="Consolas" w:cs="Consolas"/>
+          <w:sz w:val="17"/>
+          <w:szCs w:val="17"/>
+        </w:rPr>
+        <w:t>application.message=Welcome From Loan Service MySQL (default)</w:t>
+      </w:r>
+    </w:p>
+    <w:p>
+      <w:pPr>
+        <w:keepNext/>
+        <w:keepLines/>
+        <w:pBdr>
+          <w:left w:val="single" w:sz="18" w:space="6" w:color="1F3864"/>
+        </w:pBdr>
+        <w:shd w:val="clear" w:color="auto" w:fill="F2F2F2"/>
+        <w:spacing w:line="252" w:lineRule="auto"/>
+        <w:ind w:left="200"/>
+      </w:pPr>
+      <w:r>
+        <w:rPr>
+          <w:rFonts w:ascii="Consolas" w:eastAsia="Consolas" w:hAnsi="Consolas" w:cs="Consolas"/>
+          <w:sz w:val="17"/>
+          <w:szCs w:val="17"/>
+        </w:rPr>
+        <w:t>spring.datasource.url=jdbc:mysql://localhost:3308/loans_db</w:t>
+      </w:r>
+    </w:p>
+    <w:p>
+      <w:pPr>
+        <w:keepNext/>
+        <w:keepLines/>
+        <w:pBdr>
+          <w:left w:val="single" w:sz="18" w:space="6" w:color="1F3864"/>
+        </w:pBdr>
+        <w:shd w:val="clear" w:color="auto" w:fill="F2F2F2"/>
+        <w:spacing w:line="252" w:lineRule="auto"/>
+        <w:ind w:left="200"/>
+      </w:pPr>
+      <w:r>
+        <w:rPr>
+          <w:rFonts w:ascii="Consolas" w:eastAsia="Consolas" w:hAnsi="Consolas" w:cs="Consolas"/>
+          <w:sz w:val="17"/>
+          <w:szCs w:val="17"/>
+        </w:rPr>
+        <w:t>spring.datasource.username=loans</w:t>
+      </w:r>
+    </w:p>
+    <w:p>
+      <w:pPr>
+        <w:keepNext/>
+        <w:keepLines/>
+        <w:pBdr>
+          <w:left w:val="single" w:sz="18" w:space="6" w:color="1F3864"/>
+        </w:pBdr>
+        <w:shd w:val="clear" w:color="auto" w:fill="F2F2F2"/>
+        <w:spacing w:line="252" w:lineRule="auto"/>
+        <w:ind w:left="200"/>
+      </w:pPr>
+      <w:r>
+        <w:rPr>
+          <w:rFonts w:ascii="Consolas" w:eastAsia="Consolas" w:hAnsi="Consolas" w:cs="Consolas"/>
+          <w:sz w:val="17"/>
+          <w:szCs w:val="17"/>
+        </w:rPr>
+        <w:t>spring.datasource.password=${MYSQL_PASSWORD}</w:t>
+      </w:r>
+    </w:p>
+    <w:p>
+      <w:pPr>
+        <w:keepNext/>
+        <w:keepLines/>
+        <w:pBdr>
+          <w:left w:val="single" w:sz="18" w:space="6" w:color="1F3864"/>
+        </w:pBdr>
+        <w:shd w:val="clear" w:color="auto" w:fill="F2F2F2"/>
+        <w:spacing w:line="252" w:lineRule="auto"/>
+        <w:ind w:left="200"/>
+      </w:pPr>
+      <w:r>
+        <w:rPr>
+          <w:rFonts w:ascii="Consolas" w:eastAsia="Consolas" w:hAnsi="Consolas" w:cs="Consolas"/>
+          <w:sz w:val="17"/>
+          <w:szCs w:val="17"/>
+        </w:rPr>
+        <w:t>spring.jpa.hibernate.ddl-auto=validate</w:t>
+      </w:r>
+    </w:p>
+    <w:p>
+      <w:pPr>
+        <w:keepLines/>
+        <w:pBdr>
+          <w:left w:val="single" w:sz="18" w:space="6" w:color="1F3864"/>
+        </w:pBdr>
+        <w:shd w:val="clear" w:color="auto" w:fill="F2F2F2"/>
+        <w:spacing w:line="252" w:lineRule="auto"/>
+        <w:ind w:left="200"/>
+      </w:pPr>
+      <w:r>
+        <w:rPr>
+          <w:rFonts w:ascii="Consolas" w:eastAsia="Consolas" w:hAnsi="Consolas" w:cs="Consolas"/>
+          <w:sz w:val="17"/>
+          <w:szCs w:val="17"/>
+        </w:rPr>
+        <w:t>spring.jpa.open-in-view=false</w:t>
+      </w:r>
+    </w:p>
+    <w:p>
+      <w:pPr>
+        <w:spacing w:after="120"/>
+      </w:pPr>
+    </w:p>
+    <w:p>
+      <w:pPr>
+        <w:spacing w:after="120" w:line="276" w:lineRule="auto"/>
+      </w:pPr>
+      <w:r>
+        <w:rPr>
+          <w:b/>
+          <w:bCs/>
+        </w:rPr>
+        <w:t xml:space="preserve">La contraseña no pasa por el Config Server. </w:t>
+      </w:r>
+      <w:r>
+        <w:t>El servidor no tiene definida MYSQL_PASSWORD, por lo que entrega el texto ${MYSQL_PASSWORD} sin resolver y el cliente lo completa con su propia variable de entorno. Las credenciales viven en un archivo .env fuera de git; el repositorio solo incluye .env.example.</w:t>
+      </w:r>
+    </w:p>
+    <w:p>
+      <w:pPr>
+        <w:spacing w:after="120" w:line="276" w:lineRule="auto"/>
+      </w:pPr>
+      <w:r>
+        <w:t xml:space="preserve">Estado de los contenedores, extraído de la salida de </w:t>
+      </w:r>
+      <w:r>
+        <w:rPr>
+          <w:rFonts w:ascii="Consolas" w:eastAsia="Consolas" w:hAnsi="Consolas" w:cs="Consolas"/>
+          <w:sz w:val="20"/>
+          <w:szCs w:val="20"/>
+        </w:rPr>
+        <w:t>docker compose ps</w:t>
+      </w:r>
+      <w:r>
+        <w:t>:</w:t>
+      </w:r>
+    </w:p>
+    <w:tbl>
+      <w:tblPr>
+        <w:tblW w:w="9026" w:type="dxa"/>
+        <w:tblBorders>
+          <w:top w:val="single" w:sz="4" w:space="0" w:color="auto"/>
+          <w:left w:val="single" w:sz="4" w:space="0" w:color="auto"/>
+          <w:bottom w:val="single" w:sz="4" w:space="0" w:color="auto"/>
+          <w:right w:val="single" w:sz="4" w:space="0" w:color="auto"/>
+          <w:insideH w:val="single" w:sz="4" w:space="0" w:color="auto"/>
+          <w:insideV w:val="single" w:sz="4" w:space="0" w:color="auto"/>
+        </w:tblBorders>
+        <w:tblCellMar>
+          <w:left w:w="10" w:type="dxa"/>
+          <w:right w:w="10" w:type="dxa"/>
+        </w:tblCellMar>
+        <w:tblLook w:val="04A0" w:firstRow="1" w:lastRow="0" w:firstColumn="1" w:lastColumn="0" w:noHBand="0" w:noVBand="1"/>
+      </w:tblPr>
+      <w:tblGrid>
+        <w:gridCol w:w="3000"/>
+        <w:gridCol w:w="2900"/>
+        <w:gridCol w:w="3126"/>
+      </w:tblGrid>
+      <w:tr>
+        <w:tblPrEx>
+          <w:tblCellMar>
+            <w:top w:w="0" w:type="dxa"/>
+            <w:bottom w:w="0" w:type="dxa"/>
+          </w:tblCellMar>
+        </w:tblPrEx>
+        <w:trPr>
+          <w:tblHeader/>
+        </w:trPr>
+        <w:tc>
+          <w:tcPr>
+            <w:tcW w:w="3000" w:type="dxa"/>
+            <w:tcBorders>
+              <w:top w:val="single" w:sz="4" w:space="0" w:color="BFBFBF"/>
+              <w:left w:val="single" w:sz="4" w:space="0" w:color="BFBFBF"/>
+              <w:bottom w:val="single" w:sz="4" w:space="0" w:color="BFBFBF"/>
+              <w:right w:val="single" w:sz="4" w:space="0" w:color="BFBFBF"/>
+            </w:tcBorders>
+            <w:shd w:val="clear" w:color="auto" w:fill="1F3864"/>
+            <w:tcMar>
+              <w:top w:w="70" w:type="dxa"/>
+              <w:left w:w="110" w:type="dxa"/>
+              <w:bottom w:w="70" w:type="dxa"/>
+              <w:right w:w="110" w:type="dxa"/>
+            </w:tcMar>
+            <w:vAlign w:val="center"/>
+          </w:tcPr>
+          <w:p>
+            <w:r>
+              <w:rPr>
+                <w:b/>
+                <w:bCs/>
+                <w:color w:val="FFFFFF"/>
+                <w:sz w:val="21"/>
+                <w:szCs w:val="21"/>
+              </w:rPr>
+              <w:t>Contenedor</w:t>
+            </w:r>
+          </w:p>
+        </w:tc>
+        <w:tc>
+          <w:tcPr>
+            <w:tcW w:w="2900" w:type="dxa"/>
+            <w:tcBorders>
+              <w:top w:val="single" w:sz="4" w:space="0" w:color="BFBFBF"/>
+              <w:left w:val="single" w:sz="4" w:space="0" w:color="BFBFBF"/>
+              <w:bottom w:val="single" w:sz="4" w:space="0" w:color="BFBFBF"/>
+              <w:right w:val="single" w:sz="4" w:space="0" w:color="BFBFBF"/>
+            </w:tcBorders>
+            <w:shd w:val="clear" w:color="auto" w:fill="1F3864"/>
+            <w:tcMar>
+              <w:top w:w="70" w:type="dxa"/>
+              <w:left w:w="110" w:type="dxa"/>
+              <w:bottom w:w="70" w:type="dxa"/>
+              <w:right w:w="110" w:type="dxa"/>
+            </w:tcMar>
+            <w:vAlign w:val="center"/>
+          </w:tcPr>
+          <w:p>
+            <w:r>
+              <w:rPr>
+                <w:b/>
+                <w:bCs/>
+                <w:color w:val="FFFFFF"/>
+                <w:sz w:val="21"/>
+                <w:szCs w:val="21"/>
+              </w:rPr>
+              <w:t>Estado</w:t>
+            </w:r>
+          </w:p>
+        </w:tc>
+        <w:tc>
+          <w:tcPr>
+            <w:tcW w:w="3126" w:type="dxa"/>
+            <w:tcBorders>
+              <w:top w:val="single" w:sz="4" w:space="0" w:color="BFBFBF"/>
+              <w:left w:val="single" w:sz="4" w:space="0" w:color="BFBFBF"/>
+              <w:bottom w:val="single" w:sz="4" w:space="0" w:color="BFBFBF"/>
+              <w:right w:val="single" w:sz="4" w:space="0" w:color="BFBFBF"/>
+            </w:tcBorders>
+            <w:shd w:val="clear" w:color="auto" w:fill="1F3864"/>
+            <w:tcMar>
+              <w:top w:w="70" w:type="dxa"/>
+              <w:left w:w="110" w:type="dxa"/>
+              <w:bottom w:w="70" w:type="dxa"/>
+              <w:right w:w="110" w:type="dxa"/>
+            </w:tcMar>
+            <w:vAlign w:val="center"/>
+          </w:tcPr>
+          <w:p>
+            <w:r>
+              <w:rPr>
+                <w:b/>
+                <w:bCs/>
+                <w:color w:val="FFFFFF"/>
+                <w:sz w:val="21"/>
+                <w:szCs w:val="21"/>
+              </w:rPr>
+              <w:t>Puertos</w:t>
+            </w:r>
+          </w:p>
+        </w:tc>
+      </w:tr>
+      <w:tr>
+        <w:tblPrEx>
+          <w:tblCellMar>
+            <w:top w:w="0" w:type="dxa"/>
+            <w:bottom w:w="0" w:type="dxa"/>
+          </w:tblCellMar>
+        </w:tblPrEx>
+        <w:trPr>
+          <w:cantSplit/>
+        </w:trPr>
+        <w:tc>
+          <w:tcPr>
+            <w:tcW w:w="3000" w:type="dxa"/>
+            <w:tcBorders>
+              <w:top w:val="single" w:sz="4" w:space="0" w:color="BFBFBF"/>
+              <w:left w:val="single" w:sz="4" w:space="0" w:color="BFBFBF"/>
+              <w:bottom w:val="single" w:sz="4" w:space="0" w:color="BFBFBF"/>
+              <w:right w:val="single" w:sz="4" w:space="0" w:color="BFBFBF"/>
+            </w:tcBorders>
+            <w:tcMar>
+              <w:top w:w="70" w:type="dxa"/>
+              <w:left w:w="110" w:type="dxa"/>
+              <w:bottom w:w="70" w:type="dxa"/>
+              <w:right w:w="110" w:type="dxa"/>
+            </w:tcMar>
+            <w:vAlign w:val="center"/>
+          </w:tcPr>
+          <w:p>
+            <w:r>
+              <w:rPr>
+                <w:rFonts w:ascii="Consolas" w:eastAsia="Consolas" w:hAnsi="Consolas" w:cs="Consolas"/>
+                <w:sz w:val="19"/>
+                <w:szCs w:val="19"/>
+              </w:rPr>
+              <w:t>taller-cfg-config-server</w:t>
+            </w:r>
+          </w:p>
+        </w:tc>
+        <w:tc>
+          <w:tcPr>
+            <w:tcW w:w="2900" w:type="dxa"/>
+            <w:tcBorders>
+              <w:top w:val="single" w:sz="4" w:space="0" w:color="BFBFBF"/>
+              <w:left w:val="single" w:sz="4" w:space="0" w:color="BFBFBF"/>
+              <w:bottom w:val="single" w:sz="4" w:space="0" w:color="BFBFBF"/>
+              <w:right w:val="single" w:sz="4" w:space="0" w:color="BFBFBF"/>
+            </w:tcBorders>
+            <w:tcMar>
+              <w:top w:w="70" w:type="dxa"/>
+              <w:left w:w="110" w:type="dxa"/>
+              <w:bottom w:w="70" w:type="dxa"/>
+              <w:right w:w="110" w:type="dxa"/>
+            </w:tcMar>
+            <w:vAlign w:val="center"/>
+          </w:tcPr>
+          <w:p>
+            <w:r>
+              <w:rPr>
+                <w:sz w:val="21"/>
+                <w:szCs w:val="21"/>
+              </w:rPr>
+              <w:t>Up 15 seconds (healthy)</w:t>
+            </w:r>
+          </w:p>
+        </w:tc>
+        <w:tc>
+          <w:tcPr>
+            <w:tcW w:w="3126" w:type="dxa"/>
+            <w:tcBorders>
+              <w:top w:val="single" w:sz="4" w:space="0" w:color="BFBFBF"/>
+              <w:left w:val="single" w:sz="4" w:space="0" w:color="BFBFBF"/>
+              <w:bottom w:val="single" w:sz="4" w:space="0" w:color="BFBFBF"/>
+              <w:right w:val="single" w:sz="4" w:space="0" w:color="BFBFBF"/>
+            </w:tcBorders>
+            <w:tcMar>
+              <w:top w:w="70" w:type="dxa"/>
+              <w:left w:w="110" w:type="dxa"/>
+              <w:bottom w:w="70" w:type="dxa"/>
+              <w:right w:w="110" w:type="dxa"/>
+            </w:tcMar>
+            <w:vAlign w:val="center"/>
+          </w:tcPr>
+          <w:p>
+            <w:r>
+              <w:rPr>
+                <w:rFonts w:ascii="Consolas" w:eastAsia="Consolas" w:hAnsi="Consolas" w:cs="Consolas"/>
+                <w:sz w:val="19"/>
+                <w:szCs w:val="19"/>
+              </w:rPr>
+              <w:t>0.0.0.0:8888-&gt;8888/tcp</w:t>
+            </w:r>
+          </w:p>
+        </w:tc>
+      </w:tr>
+      <w:tr>
+        <w:tblPrEx>
+          <w:tblCellMar>
+            <w:top w:w="0" w:type="dxa"/>
+            <w:bottom w:w="0" w:type="dxa"/>
+          </w:tblCellMar>
+        </w:tblPrEx>
+        <w:trPr>
+          <w:cantSplit/>
+        </w:trPr>
+        <w:tc>
+          <w:tcPr>
+            <w:tcW w:w="3000" w:type="dxa"/>
+            <w:tcBorders>
+              <w:top w:val="single" w:sz="4" w:space="0" w:color="BFBFBF"/>
+              <w:left w:val="single" w:sz="4" w:space="0" w:color="BFBFBF"/>
+              <w:bottom w:val="single" w:sz="4" w:space="0" w:color="BFBFBF"/>
+              <w:right w:val="single" w:sz="4" w:space="0" w:color="BFBFBF"/>
+            </w:tcBorders>
+            <w:tcMar>
+              <w:top w:w="70" w:type="dxa"/>
+              <w:left w:w="110" w:type="dxa"/>
+              <w:bottom w:w="70" w:type="dxa"/>
+              <w:right w:w="110" w:type="dxa"/>
+            </w:tcMar>
+            <w:vAlign w:val="center"/>
+          </w:tcPr>
+          <w:p>
+            <w:r>
+              <w:rPr>
+                <w:rFonts w:ascii="Consolas" w:eastAsia="Consolas" w:hAnsi="Consolas" w:cs="Consolas"/>
+                <w:sz w:val="19"/>
+                <w:szCs w:val="19"/>
+              </w:rPr>
+              <w:t>taller-cfg-loan-service-mysql</w:t>
+            </w:r>
+          </w:p>
+        </w:tc>
+        <w:tc>
+          <w:tcPr>
+            <w:tcW w:w="2900" w:type="dxa"/>
+            <w:tcBorders>
+              <w:top w:val="single" w:sz="4" w:space="0" w:color="BFBFBF"/>
+              <w:left w:val="single" w:sz="4" w:space="0" w:color="BFBFBF"/>
+              <w:bottom w:val="single" w:sz="4" w:space="0" w:color="BFBFBF"/>
+              <w:right w:val="single" w:sz="4" w:space="0" w:color="BFBFBF"/>
+            </w:tcBorders>
+            <w:tcMar>
+              <w:top w:w="70" w:type="dxa"/>
+              <w:left w:w="110" w:type="dxa"/>
+              <w:bottom w:w="70" w:type="dxa"/>
+              <w:right w:w="110" w:type="dxa"/>
+            </w:tcMar>
+            <w:vAlign w:val="center"/>
+          </w:tcPr>
+          <w:p>
+            <w:r>
+              <w:rPr>
+                <w:sz w:val="21"/>
+                <w:szCs w:val="21"/>
+              </w:rPr>
+              <w:t>Up 4 seconds</w:t>
+            </w:r>
+          </w:p>
+        </w:tc>
+        <w:tc>
+          <w:tcPr>
+            <w:tcW w:w="3126" w:type="dxa"/>
+            <w:tcBorders>
+              <w:top w:val="single" w:sz="4" w:space="0" w:color="BFBFBF"/>
+              <w:left w:val="single" w:sz="4" w:space="0" w:color="BFBFBF"/>
+              <w:bottom w:val="single" w:sz="4" w:space="0" w:color="BFBFBF"/>
+              <w:right w:val="single" w:sz="4" w:space="0" w:color="BFBFBF"/>
+            </w:tcBorders>
+            <w:tcMar>
+              <w:top w:w="70" w:type="dxa"/>
+              <w:left w:w="110" w:type="dxa"/>
+              <w:bottom w:w="70" w:type="dxa"/>
+              <w:right w:w="110" w:type="dxa"/>
+            </w:tcMar>
+            <w:vAlign w:val="center"/>
+          </w:tcPr>
+          <w:p>
+            <w:r>
+              <w:rPr>
+                <w:rFonts w:ascii="Consolas" w:eastAsia="Consolas" w:hAnsi="Consolas" w:cs="Consolas"/>
+                <w:sz w:val="19"/>
+                <w:szCs w:val="19"/>
+              </w:rPr>
+              <w:t>0.0.0.0:8084-&gt;8084/tcp</w:t>
+            </w:r>
+          </w:p>
+        </w:tc>
+      </w:tr>
+      <w:tr>
+        <w:tblPrEx>
+          <w:tblCellMar>
+            <w:top w:w="0" w:type="dxa"/>
+            <w:bottom w:w="0" w:type="dxa"/>
+          </w:tblCellMar>
+        </w:tblPrEx>
+        <w:trPr>
+          <w:cantSplit/>
+        </w:trPr>
+        <w:tc>
+          <w:tcPr>
+            <w:tcW w:w="3000" w:type="dxa"/>
+            <w:tcBorders>
+              <w:top w:val="single" w:sz="4" w:space="0" w:color="BFBFBF"/>
+              <w:left w:val="single" w:sz="4" w:space="0" w:color="BFBFBF"/>
+              <w:bottom w:val="single" w:sz="4" w:space="0" w:color="BFBFBF"/>
+              <w:right w:val="single" w:sz="4" w:space="0" w:color="BFBFBF"/>
+            </w:tcBorders>
+            <w:tcMar>
+              <w:top w:w="70" w:type="dxa"/>
+              <w:left w:w="110" w:type="dxa"/>
+              <w:bottom w:w="70" w:type="dxa"/>
+              <w:right w:w="110" w:type="dxa"/>
+            </w:tcMar>
+            <w:vAlign w:val="center"/>
+          </w:tcPr>
+          <w:p>
+            <w:r>
+              <w:rPr>
+                <w:rFonts w:ascii="Consolas" w:eastAsia="Consolas" w:hAnsi="Consolas" w:cs="Consolas"/>
+                <w:sz w:val="19"/>
+                <w:szCs w:val="19"/>
+              </w:rPr>
+              <w:t>taller-cfg-mysql</w:t>
+            </w:r>
+          </w:p>
+        </w:tc>
+        <w:tc>
+          <w:tcPr>
+            <w:tcW w:w="2900" w:type="dxa"/>
+            <w:tcBorders>
+              <w:top w:val="single" w:sz="4" w:space="0" w:color="BFBFBF"/>
+              <w:left w:val="single" w:sz="4" w:space="0" w:color="BFBFBF"/>
+              <w:bottom w:val="single" w:sz="4" w:space="0" w:color="BFBFBF"/>
+              <w:right w:val="single" w:sz="4" w:space="0" w:color="BFBFBF"/>
+            </w:tcBorders>
+            <w:tcMar>
+              <w:top w:w="70" w:type="dxa"/>
+              <w:left w:w="110" w:type="dxa"/>
+              <w:bottom w:w="70" w:type="dxa"/>
+              <w:right w:w="110" w:type="dxa"/>
+            </w:tcMar>
+            <w:vAlign w:val="center"/>
+          </w:tcPr>
+          <w:p>
+            <w:r>
+              <w:rPr>
+                <w:sz w:val="21"/>
+                <w:szCs w:val="21"/>
+              </w:rPr>
+              <w:t>Up 15 seconds (healthy)</w:t>
+            </w:r>
+          </w:p>
+        </w:tc>
+        <w:tc>
+          <w:tcPr>
+            <w:tcW w:w="3126" w:type="dxa"/>
+            <w:tcBorders>
+              <w:top w:val="single" w:sz="4" w:space="0" w:color="BFBFBF"/>
+              <w:left w:val="single" w:sz="4" w:space="0" w:color="BFBFBF"/>
+              <w:bottom w:val="single" w:sz="4" w:space="0" w:color="BFBFBF"/>
+              <w:right w:val="single" w:sz="4" w:space="0" w:color="BFBFBF"/>
+            </w:tcBorders>
+            <w:tcMar>
+              <w:top w:w="70" w:type="dxa"/>
+              <w:left w:w="110" w:type="dxa"/>
+              <w:bottom w:w="70" w:type="dxa"/>
+              <w:right w:w="110" w:type="dxa"/>
+            </w:tcMar>
+            <w:vAlign w:val="center"/>
+          </w:tcPr>
+          <w:p>
+            <w:r>
+              <w:rPr>
+                <w:rFonts w:ascii="Consolas" w:eastAsia="Consolas" w:hAnsi="Consolas" w:cs="Consolas"/>
+                <w:sz w:val="19"/>
+                <w:szCs w:val="19"/>
+              </w:rPr>
+              <w:t>0.0.0.0:3308-&gt;3306/tcp</w:t>
+            </w:r>
+          </w:p>
+        </w:tc>
+      </w:tr>
+    </w:tbl>
+    <w:p>
+      <w:pPr>
+        <w:spacing w:after="160"/>
+      </w:pPr>
+    </w:p>
+    <w:p>
+      <w:pPr>
+        <w:spacing w:after="120" w:line="276" w:lineRule="auto"/>
+      </w:pPr>
+      <w:r>
+        <w:t>Prueba de la API. Los préstamos se crean con POST y se consultan con GET; los datos inválidos responden 400 y los inexistentes 404:</w:t>
+      </w:r>
+    </w:p>
+    <w:p>
+      <w:pPr>
+        <w:keepNext/>
+        <w:spacing w:before="120" w:after="40"/>
+      </w:pPr>
+      <w:r>
+        <w:rPr>
+          <w:i/>
+          <w:iCs/>
+          <w:color w:val="595959"/>
+          <w:sz w:val="20"/>
+          <w:szCs w:val="20"/>
+        </w:rPr>
+        <w:lastRenderedPageBreak/>
+        <w:t>Respuestas de la API</w:t>
+      </w:r>
+    </w:p>
+    <w:p>
+      <w:pPr>
+        <w:keepNext/>
+        <w:keepLines/>
+        <w:pBdr>
+          <w:left w:val="single" w:sz="18" w:space="6" w:color="1F3864"/>
+        </w:pBdr>
+        <w:shd w:val="clear" w:color="auto" w:fill="F2F2F2"/>
+        <w:spacing w:line="252" w:lineRule="auto"/>
+        <w:ind w:left="200"/>
+      </w:pPr>
+      <w:r>
+        <w:rPr>
+          <w:rFonts w:ascii="Consolas" w:eastAsia="Consolas" w:hAnsi="Consolas" w:cs="Consolas"/>
+          <w:sz w:val="17"/>
+          <w:szCs w:val="17"/>
+        </w:rPr>
+        <w:t>$ curl http://localhost:8084/message</w:t>
+      </w:r>
+    </w:p>
+    <w:p>
+      <w:pPr>
+        <w:keepNext/>
+        <w:keepLines/>
+        <w:pBdr>
+          <w:left w:val="single" w:sz="18" w:space="6" w:color="1F3864"/>
+        </w:pBdr>
+        <w:shd w:val="clear" w:color="auto" w:fill="F2F2F2"/>
+        <w:spacing w:line="252" w:lineRule="auto"/>
+        <w:ind w:left="200"/>
+      </w:pPr>
+      <w:r>
+        <w:rPr>
+          <w:rFonts w:ascii="Consolas" w:eastAsia="Consolas" w:hAnsi="Consolas" w:cs="Consolas"/>
+          <w:sz w:val="17"/>
+          <w:szCs w:val="17"/>
+        </w:rPr>
+        <w:t>Welcome From Loan Service MySQL (docker)</w:t>
+      </w:r>
+    </w:p>
+    <w:p>
+      <w:pPr>
+        <w:keepNext/>
+        <w:keepLines/>
+        <w:pBdr>
+          <w:left w:val="single" w:sz="18" w:space="6" w:color="1F3864"/>
+        </w:pBdr>
+        <w:shd w:val="clear" w:color="auto" w:fill="F2F2F2"/>
+        <w:spacing w:line="252" w:lineRule="auto"/>
+        <w:ind w:left="200"/>
+      </w:pPr>
+      <w:r>
+        <w:rPr>
+          <w:rFonts w:ascii="Consolas" w:eastAsia="Consolas" w:hAnsi="Consolas" w:cs="Consolas"/>
+          <w:sz w:val="17"/>
+          <w:szCs w:val="17"/>
+        </w:rPr>
+        <w:t>HTTP 200</w:t>
+      </w:r>
+    </w:p>
+    <w:p>
+      <w:pPr>
+        <w:keepNext/>
+        <w:keepLines/>
+        <w:pBdr>
+          <w:left w:val="single" w:sz="18" w:space="6" w:color="1F3864"/>
+        </w:pBdr>
+        <w:shd w:val="clear" w:color="auto" w:fill="F2F2F2"/>
+        <w:spacing w:line="252" w:lineRule="auto"/>
+        <w:ind w:left="200"/>
+      </w:pPr>
+      <w:r>
+        <w:rPr>
+          <w:rFonts w:ascii="Consolas" w:eastAsia="Consolas" w:hAnsi="Consolas" w:cs="Consolas"/>
+          <w:sz w:val="17"/>
+          <w:szCs w:val="17"/>
+        </w:rPr>
+        <w:t xml:space="preserve"> </w:t>
+      </w:r>
+    </w:p>
+    <w:p>
+      <w:pPr>
+        <w:keepNext/>
+        <w:keepLines/>
+        <w:pBdr>
+          <w:left w:val="single" w:sz="18" w:space="6" w:color="1F3864"/>
+        </w:pBdr>
+        <w:shd w:val="clear" w:color="auto" w:fill="F2F2F2"/>
+        <w:spacing w:line="252" w:lineRule="auto"/>
+        <w:ind w:left="200"/>
+      </w:pPr>
+      <w:r>
+        <w:rPr>
+          <w:rFonts w:ascii="Consolas" w:eastAsia="Consolas" w:hAnsi="Consolas" w:cs="Consolas"/>
+          <w:sz w:val="17"/>
+          <w:szCs w:val="17"/>
+        </w:rPr>
+        <w:t>$ curl -i -X POST http://localhost:8084/loans -d {"applicantName":"Ana Torres","amount":15000.50,"termMonths":24}</w:t>
+      </w:r>
+    </w:p>
+    <w:p>
+      <w:pPr>
+        <w:keepNext/>
+        <w:keepLines/>
+        <w:pBdr>
+          <w:left w:val="single" w:sz="18" w:space="6" w:color="1F3864"/>
+        </w:pBdr>
+        <w:shd w:val="clear" w:color="auto" w:fill="F2F2F2"/>
+        <w:spacing w:line="252" w:lineRule="auto"/>
+        <w:ind w:left="200"/>
+      </w:pPr>
+      <w:r>
+        <w:rPr>
+          <w:rFonts w:ascii="Consolas" w:eastAsia="Consolas" w:hAnsi="Consolas" w:cs="Consolas"/>
+          <w:sz w:val="17"/>
+          <w:szCs w:val="17"/>
+        </w:rPr>
+        <w:t xml:space="preserve">HTTP/1.1 201 </w:t>
+      </w:r>
+    </w:p>
+    <w:p>
+      <w:pPr>
+        <w:keepNext/>
+        <w:keepLines/>
+        <w:pBdr>
+          <w:left w:val="single" w:sz="18" w:space="6" w:color="1F3864"/>
+        </w:pBdr>
+        <w:shd w:val="clear" w:color="auto" w:fill="F2F2F2"/>
+        <w:spacing w:line="252" w:lineRule="auto"/>
+        <w:ind w:left="200"/>
+      </w:pPr>
+      <w:r>
+        <w:rPr>
+          <w:rFonts w:ascii="Consolas" w:eastAsia="Consolas" w:hAnsi="Consolas" w:cs="Consolas"/>
+          <w:sz w:val="17"/>
+          <w:szCs w:val="17"/>
+        </w:rPr>
+        <w:t>Location: http://localhost:8084/loans/1</w:t>
+      </w:r>
+    </w:p>
+    <w:p>
+      <w:pPr>
+        <w:keepNext/>
+        <w:keepLines/>
+        <w:pBdr>
+          <w:left w:val="single" w:sz="18" w:space="6" w:color="1F3864"/>
+        </w:pBdr>
+        <w:shd w:val="clear" w:color="auto" w:fill="F2F2F2"/>
+        <w:spacing w:line="252" w:lineRule="auto"/>
+        <w:ind w:left="200"/>
+      </w:pPr>
+      <w:r>
+        <w:rPr>
+          <w:rFonts w:ascii="Consolas" w:eastAsia="Consolas" w:hAnsi="Consolas" w:cs="Consolas"/>
+          <w:sz w:val="17"/>
+          <w:szCs w:val="17"/>
+        </w:rPr>
+        <w:t>{"id":1,"applicantName":"Ana Torres","amount":15000.50,"termMonths":24,"createdAt":"2026-09-19T05:36:08.477053"}</w:t>
+      </w:r>
+    </w:p>
+    <w:p>
+      <w:pPr>
+        <w:keepNext/>
+        <w:keepLines/>
+        <w:pBdr>
+          <w:left w:val="single" w:sz="18" w:space="6" w:color="1F3864"/>
+        </w:pBdr>
+        <w:shd w:val="clear" w:color="auto" w:fill="F2F2F2"/>
+        <w:spacing w:line="252" w:lineRule="auto"/>
+        <w:ind w:left="200"/>
+      </w:pPr>
+      <w:r>
+        <w:rPr>
+          <w:rFonts w:ascii="Consolas" w:eastAsia="Consolas" w:hAnsi="Consolas" w:cs="Consolas"/>
+          <w:sz w:val="17"/>
+          <w:szCs w:val="17"/>
+        </w:rPr>
+        <w:t xml:space="preserve"> </w:t>
+      </w:r>
+    </w:p>
+    <w:p>
+      <w:pPr>
+        <w:keepNext/>
+        <w:keepLines/>
+        <w:pBdr>
+          <w:left w:val="single" w:sz="18" w:space="6" w:color="1F3864"/>
+        </w:pBdr>
+        <w:shd w:val="clear" w:color="auto" w:fill="F2F2F2"/>
+        <w:spacing w:line="252" w:lineRule="auto"/>
+        <w:ind w:left="200"/>
+      </w:pPr>
+      <w:r>
+        <w:rPr>
+          <w:rFonts w:ascii="Consolas" w:eastAsia="Consolas" w:hAnsi="Consolas" w:cs="Consolas"/>
+          <w:sz w:val="17"/>
+          <w:szCs w:val="17"/>
+        </w:rPr>
+        <w:t>$ curl -i -X POST http://localhost:8084/loans -d {"applicantName":"Luis Rojas","amount":2500,"termMonths":36}</w:t>
+      </w:r>
+    </w:p>
+    <w:p>
+      <w:pPr>
+        <w:keepNext/>
+        <w:keepLines/>
+        <w:pBdr>
+          <w:left w:val="single" w:sz="18" w:space="6" w:color="1F3864"/>
+        </w:pBdr>
+        <w:shd w:val="clear" w:color="auto" w:fill="F2F2F2"/>
+        <w:spacing w:line="252" w:lineRule="auto"/>
+        <w:ind w:left="200"/>
+      </w:pPr>
+      <w:r>
+        <w:rPr>
+          <w:rFonts w:ascii="Consolas" w:eastAsia="Consolas" w:hAnsi="Consolas" w:cs="Consolas"/>
+          <w:sz w:val="17"/>
+          <w:szCs w:val="17"/>
+        </w:rPr>
+        <w:t xml:space="preserve">HTTP/1.1 201 </w:t>
+      </w:r>
+    </w:p>
+    <w:p>
+      <w:pPr>
+        <w:keepNext/>
+        <w:keepLines/>
+        <w:pBdr>
+          <w:left w:val="single" w:sz="18" w:space="6" w:color="1F3864"/>
+        </w:pBdr>
+        <w:shd w:val="clear" w:color="auto" w:fill="F2F2F2"/>
+        <w:spacing w:line="252" w:lineRule="auto"/>
+        <w:ind w:left="200"/>
+      </w:pPr>
+      <w:r>
+        <w:rPr>
+          <w:rFonts w:ascii="Consolas" w:eastAsia="Consolas" w:hAnsi="Consolas" w:cs="Consolas"/>
+          <w:sz w:val="17"/>
+          <w:szCs w:val="17"/>
+        </w:rPr>
+        <w:t>Location: http://localhost:8084/loans/2</w:t>
+      </w:r>
+    </w:p>
+    <w:p>
+      <w:pPr>
+        <w:keepNext/>
+        <w:keepLines/>
+        <w:pBdr>
+          <w:left w:val="single" w:sz="18" w:space="6" w:color="1F3864"/>
+        </w:pBdr>
+        <w:shd w:val="clear" w:color="auto" w:fill="F2F2F2"/>
+        <w:spacing w:line="252" w:lineRule="auto"/>
+        <w:ind w:left="200"/>
+      </w:pPr>
+      <w:r>
+        <w:rPr>
+          <w:rFonts w:ascii="Consolas" w:eastAsia="Consolas" w:hAnsi="Consolas" w:cs="Consolas"/>
+          <w:sz w:val="17"/>
+          <w:szCs w:val="17"/>
+        </w:rPr>
+        <w:t>{"id":2,"applicantName":"Luis Rojas","amount":2500.00,"termMonths":36,"createdAt":"2026-09-19T05:36:08.596008"}</w:t>
+      </w:r>
+    </w:p>
+    <w:p>
+      <w:pPr>
+        <w:keepNext/>
+        <w:keepLines/>
+        <w:pBdr>
+          <w:left w:val="single" w:sz="18" w:space="6" w:color="1F3864"/>
+        </w:pBdr>
+        <w:shd w:val="clear" w:color="auto" w:fill="F2F2F2"/>
+        <w:spacing w:line="252" w:lineRule="auto"/>
+        <w:ind w:left="200"/>
+      </w:pPr>
+      <w:r>
+        <w:rPr>
+          <w:rFonts w:ascii="Consolas" w:eastAsia="Consolas" w:hAnsi="Consolas" w:cs="Consolas"/>
+          <w:sz w:val="17"/>
+          <w:szCs w:val="17"/>
+        </w:rPr>
+        <w:t xml:space="preserve"> </w:t>
+      </w:r>
+    </w:p>
+    <w:p>
+      <w:pPr>
+        <w:keepNext/>
+        <w:keepLines/>
+        <w:pBdr>
+          <w:left w:val="single" w:sz="18" w:space="6" w:color="1F3864"/>
+        </w:pBdr>
+        <w:shd w:val="clear" w:color="auto" w:fill="F2F2F2"/>
+        <w:spacing w:line="252" w:lineRule="auto"/>
+        <w:ind w:left="200"/>
+      </w:pPr>
+      <w:r>
+        <w:rPr>
+          <w:rFonts w:ascii="Consolas" w:eastAsia="Consolas" w:hAnsi="Consolas" w:cs="Consolas"/>
+          <w:sz w:val="17"/>
+          <w:szCs w:val="17"/>
+        </w:rPr>
+        <w:t>$ curl http://localhost:8084/loans</w:t>
+      </w:r>
+    </w:p>
+    <w:p>
+      <w:pPr>
+        <w:keepNext/>
+        <w:keepLines/>
+        <w:pBdr>
+          <w:left w:val="single" w:sz="18" w:space="6" w:color="1F3864"/>
+        </w:pBdr>
+        <w:shd w:val="clear" w:color="auto" w:fill="F2F2F2"/>
+        <w:spacing w:line="252" w:lineRule="auto"/>
+        <w:ind w:left="200"/>
+      </w:pPr>
+      <w:r>
+        <w:rPr>
+          <w:rFonts w:ascii="Consolas" w:eastAsia="Consolas" w:hAnsi="Consolas" w:cs="Consolas"/>
+          <w:sz w:val="17"/>
+          <w:szCs w:val="17"/>
+        </w:rPr>
+        <w:t>[{"id":1,"applicantName":"Ana Torres","amount":15000.50,"termMonths":24,"createdAt":"2026-09-19T05:36:08.477053"},{"id":2,"applicantName":"Luis Rojas","amount":2500.00,"termMonths":36,"createdAt":"2026-09-19T05:36:08.596008"}]</w:t>
+      </w:r>
+    </w:p>
+    <w:p>
+      <w:pPr>
+        <w:keepNext/>
+        <w:keepLines/>
+        <w:pBdr>
+          <w:left w:val="single" w:sz="18" w:space="6" w:color="1F3864"/>
+        </w:pBdr>
+        <w:shd w:val="clear" w:color="auto" w:fill="F2F2F2"/>
+        <w:spacing w:line="252" w:lineRule="auto"/>
+        <w:ind w:left="200"/>
+      </w:pPr>
+      <w:r>
+        <w:rPr>
+          <w:rFonts w:ascii="Consolas" w:eastAsia="Consolas" w:hAnsi="Consolas" w:cs="Consolas"/>
+          <w:sz w:val="17"/>
+          <w:szCs w:val="17"/>
+        </w:rPr>
+        <w:t>HTTP 200</w:t>
+      </w:r>
+    </w:p>
+    <w:p>
+      <w:pPr>
+        <w:keepNext/>
+        <w:keepLines/>
+        <w:pBdr>
+          <w:left w:val="single" w:sz="18" w:space="6" w:color="1F3864"/>
+        </w:pBdr>
+        <w:shd w:val="clear" w:color="auto" w:fill="F2F2F2"/>
+        <w:spacing w:line="252" w:lineRule="auto"/>
+        <w:ind w:left="200"/>
+      </w:pPr>
+      <w:r>
+        <w:rPr>
+          <w:rFonts w:ascii="Consolas" w:eastAsia="Consolas" w:hAnsi="Consolas" w:cs="Consolas"/>
+          <w:sz w:val="17"/>
+          <w:szCs w:val="17"/>
+        </w:rPr>
+        <w:t xml:space="preserve"> </w:t>
+      </w:r>
+    </w:p>
+    <w:p>
+      <w:pPr>
+        <w:keepNext/>
+        <w:keepLines/>
+        <w:pBdr>
+          <w:left w:val="single" w:sz="18" w:space="6" w:color="1F3864"/>
+        </w:pBdr>
+        <w:shd w:val="clear" w:color="auto" w:fill="F2F2F2"/>
+        <w:spacing w:line="252" w:lineRule="auto"/>
+        <w:ind w:left="200"/>
+      </w:pPr>
+      <w:r>
+        <w:rPr>
+          <w:rFonts w:ascii="Consolas" w:eastAsia="Consolas" w:hAnsi="Consolas" w:cs="Consolas"/>
+          <w:sz w:val="17"/>
+          <w:szCs w:val="17"/>
+        </w:rPr>
+        <w:t>$ curl http://localhost:8084/loans/999   (no existe)</w:t>
+      </w:r>
+    </w:p>
+    <w:p>
+      <w:pPr>
+        <w:keepNext/>
+        <w:keepLines/>
+        <w:pBdr>
+          <w:left w:val="single" w:sz="18" w:space="6" w:color="1F3864"/>
+        </w:pBdr>
+        <w:shd w:val="clear" w:color="auto" w:fill="F2F2F2"/>
+        <w:spacing w:line="252" w:lineRule="auto"/>
+        <w:ind w:left="200"/>
+      </w:pPr>
+      <w:r>
+        <w:rPr>
+          <w:rFonts w:ascii="Consolas" w:eastAsia="Consolas" w:hAnsi="Consolas" w:cs="Consolas"/>
+          <w:sz w:val="17"/>
+          <w:szCs w:val="17"/>
+        </w:rPr>
+        <w:t>{"detail":"Loan 999 not found","instance":"/loans/999","status":404,"title":"Not Found"}</w:t>
+      </w:r>
+    </w:p>
+    <w:p>
+      <w:pPr>
+        <w:keepNext/>
+        <w:keepLines/>
+        <w:pBdr>
+          <w:left w:val="single" w:sz="18" w:space="6" w:color="1F3864"/>
+        </w:pBdr>
+        <w:shd w:val="clear" w:color="auto" w:fill="F2F2F2"/>
+        <w:spacing w:line="252" w:lineRule="auto"/>
+        <w:ind w:left="200"/>
+      </w:pPr>
+      <w:r>
+        <w:rPr>
+          <w:rFonts w:ascii="Consolas" w:eastAsia="Consolas" w:hAnsi="Consolas" w:cs="Consolas"/>
+          <w:sz w:val="17"/>
+          <w:szCs w:val="17"/>
+        </w:rPr>
+        <w:t>HTTP 404</w:t>
+      </w:r>
+    </w:p>
+    <w:p>
+      <w:pPr>
+        <w:keepNext/>
+        <w:keepLines/>
+        <w:pBdr>
+          <w:left w:val="single" w:sz="18" w:space="6" w:color="1F3864"/>
+        </w:pBdr>
+        <w:shd w:val="clear" w:color="auto" w:fill="F2F2F2"/>
+        <w:spacing w:line="252" w:lineRule="auto"/>
+        <w:ind w:left="200"/>
+      </w:pPr>
+      <w:r>
+        <w:rPr>
+          <w:rFonts w:ascii="Consolas" w:eastAsia="Consolas" w:hAnsi="Consolas" w:cs="Consolas"/>
+          <w:sz w:val="17"/>
+          <w:szCs w:val="17"/>
+        </w:rPr>
+        <w:t xml:space="preserve"> </w:t>
+      </w:r>
+    </w:p>
+    <w:p>
+      <w:pPr>
+        <w:keepNext/>
+        <w:keepLines/>
+        <w:pBdr>
+          <w:left w:val="single" w:sz="18" w:space="6" w:color="1F3864"/>
+        </w:pBdr>
+        <w:shd w:val="clear" w:color="auto" w:fill="F2F2F2"/>
+        <w:spacing w:line="252" w:lineRule="auto"/>
+        <w:ind w:left="200"/>
+      </w:pPr>
+      <w:r>
+        <w:rPr>
+          <w:rFonts w:ascii="Consolas" w:eastAsia="Consolas" w:hAnsi="Consolas" w:cs="Consolas"/>
+          <w:sz w:val="17"/>
+          <w:szCs w:val="17"/>
+        </w:rPr>
+        <w:t>$ curl -X POST http://localhost:8084/loans -d {"applicantName":"","amount":0,"termMonths":999}   (invalido)</w:t>
+      </w:r>
+    </w:p>
+    <w:p>
+      <w:pPr>
+        <w:keepNext/>
+        <w:keepLines/>
+        <w:pBdr>
+          <w:left w:val="single" w:sz="18" w:space="6" w:color="1F3864"/>
+        </w:pBdr>
+        <w:shd w:val="clear" w:color="auto" w:fill="F2F2F2"/>
+        <w:spacing w:line="252" w:lineRule="auto"/>
+        <w:ind w:left="200"/>
+      </w:pPr>
+      <w:r>
+        <w:rPr>
+          <w:rFonts w:ascii="Consolas" w:eastAsia="Consolas" w:hAnsi="Consolas" w:cs="Consolas"/>
+          <w:sz w:val="17"/>
+          <w:szCs w:val="17"/>
+        </w:rPr>
+        <w:t>{"detail":"Invalid request content.","instance":"/loans","status":400,"title":"Bad Request"}</w:t>
+      </w:r>
+    </w:p>
+    <w:p>
+      <w:pPr>
+        <w:keepLines/>
+        <w:pBdr>
+          <w:left w:val="single" w:sz="18" w:space="6" w:color="1F3864"/>
+        </w:pBdr>
+        <w:shd w:val="clear" w:color="auto" w:fill="F2F2F2"/>
+        <w:spacing w:line="252" w:lineRule="auto"/>
+        <w:ind w:left="200"/>
+      </w:pPr>
+      <w:r>
+        <w:rPr>
+          <w:rFonts w:ascii="Consolas" w:eastAsia="Consolas" w:hAnsi="Consolas" w:cs="Consolas"/>
+          <w:sz w:val="17"/>
+          <w:szCs w:val="17"/>
+        </w:rPr>
+        <w:t>HTTP 400</w:t>
+      </w:r>
+    </w:p>
+    <w:p>
+      <w:pPr>
+        <w:spacing w:after="120"/>
+      </w:pPr>
+    </w:p>
+    <w:p>
+      <w:pPr>
+        <w:spacing w:after="120" w:line="276" w:lineRule="auto"/>
+      </w:pPr>
+      <w:r>
+        <w:t>Las filas quedaron guardadas en MySQL, con los mismos valores que devolvió la API:</w:t>
+      </w:r>
+    </w:p>
+    <w:p>
+      <w:pPr>
+        <w:keepNext/>
+        <w:spacing w:before="120" w:after="40"/>
+      </w:pPr>
+      <w:r>
+        <w:rPr>
+          <w:i/>
+          <w:iCs/>
+          <w:color w:val="595959"/>
+          <w:sz w:val="20"/>
+          <w:szCs w:val="20"/>
+        </w:rPr>
+        <w:t>Consulta directa a la base</w:t>
+      </w:r>
+    </w:p>
+    <w:p>
+      <w:pPr>
+        <w:keepNext/>
+        <w:keepLines/>
+        <w:pBdr>
+          <w:left w:val="single" w:sz="18" w:space="6" w:color="1F3864"/>
+        </w:pBdr>
+        <w:shd w:val="clear" w:color="auto" w:fill="F2F2F2"/>
+        <w:spacing w:line="252" w:lineRule="auto"/>
+        <w:ind w:left="200"/>
+      </w:pPr>
+      <w:r>
+        <w:rPr>
+          <w:rFonts w:ascii="Consolas" w:eastAsia="Consolas" w:hAnsi="Consolas" w:cs="Consolas"/>
+          <w:sz w:val="17"/>
+          <w:szCs w:val="17"/>
+        </w:rPr>
+        <w:t>$ docker exec taller-cfg-mysql mysql -uloans loans_db -e "SELECT ... FROM loans"</w:t>
+      </w:r>
+    </w:p>
+    <w:p>
+      <w:pPr>
+        <w:keepNext/>
+        <w:keepLines/>
+        <w:pBdr>
+          <w:left w:val="single" w:sz="18" w:space="6" w:color="1F3864"/>
+        </w:pBdr>
+        <w:shd w:val="clear" w:color="auto" w:fill="F2F2F2"/>
+        <w:spacing w:line="252" w:lineRule="auto"/>
+        <w:ind w:left="200"/>
+      </w:pPr>
+      <w:r>
+        <w:rPr>
+          <w:rFonts w:ascii="Consolas" w:eastAsia="Consolas" w:hAnsi="Consolas" w:cs="Consolas"/>
+          <w:sz w:val="17"/>
+          <w:szCs w:val="17"/>
+        </w:rPr>
+        <w:t>id  applicant_name  amount    term_months  created_at</w:t>
+      </w:r>
+    </w:p>
+    <w:p>
+      <w:pPr>
+        <w:keepNext/>
+        <w:keepLines/>
+        <w:pBdr>
+          <w:left w:val="single" w:sz="18" w:space="6" w:color="1F3864"/>
+        </w:pBdr>
+        <w:shd w:val="clear" w:color="auto" w:fill="F2F2F2"/>
+        <w:spacing w:line="252" w:lineRule="auto"/>
+        <w:ind w:left="200"/>
+      </w:pPr>
+      <w:r>
+        <w:rPr>
+          <w:rFonts w:ascii="Consolas" w:eastAsia="Consolas" w:hAnsi="Consolas" w:cs="Consolas"/>
+          <w:sz w:val="17"/>
+          <w:szCs w:val="17"/>
+        </w:rPr>
+        <w:t>1   Ana Torres      15000.50  24           2026-09-19 05:36:08.477053</w:t>
+      </w:r>
+    </w:p>
+    <w:p>
+      <w:pPr>
+        <w:keepLines/>
+        <w:pBdr>
+          <w:left w:val="single" w:sz="18" w:space="6" w:color="1F3864"/>
+        </w:pBdr>
+        <w:shd w:val="clear" w:color="auto" w:fill="F2F2F2"/>
+        <w:spacing w:line="252" w:lineRule="auto"/>
+        <w:ind w:left="200"/>
+      </w:pPr>
+      <w:r>
+        <w:rPr>
+          <w:rFonts w:ascii="Consolas" w:eastAsia="Consolas" w:hAnsi="Consolas" w:cs="Consolas"/>
+          <w:sz w:val="17"/>
+          <w:szCs w:val="17"/>
+        </w:rPr>
+        <w:t>2   Luis Rojas      2500.00   36           2026-09-19 05:36:08.596008</w:t>
+      </w:r>
+    </w:p>
+    <w:p>
+      <w:pPr>
+        <w:spacing w:after="120"/>
+      </w:pPr>
+    </w:p>
+    <w:p>
+      <w:pPr>
+        <w:keepNext/>
+        <w:spacing w:before="120" w:after="40"/>
+      </w:pPr>
+      <w:r>
+        <w:rPr>
+          <w:i/>
+          <w:iCs/>
+          <w:color w:val="595959"/>
+          <w:sz w:val="20"/>
+          <w:szCs w:val="20"/>
+        </w:rPr>
+        <w:t>Consola de loan-service-mysql (perfil docker)</w:t>
+      </w:r>
+    </w:p>
+    <w:p>
+      <w:pPr>
+        <w:keepNext/>
+        <w:keepLines/>
+        <w:pBdr>
+          <w:left w:val="single" w:sz="18" w:space="6" w:color="1F3864"/>
+        </w:pBdr>
+        <w:shd w:val="clear" w:color="auto" w:fill="F2F2F2"/>
+        <w:spacing w:line="252" w:lineRule="auto"/>
+        <w:ind w:left="200"/>
+      </w:pPr>
+      <w:r>
+        <w:rPr>
+          <w:rFonts w:ascii="Consolas" w:eastAsia="Consolas" w:hAnsi="Consolas" w:cs="Consolas"/>
+          <w:sz w:val="17"/>
+          <w:szCs w:val="17"/>
+        </w:rPr>
+        <w:t>2026-09-19T05:35:49.258Z  INFO 1 --- [loan-service-mysql] [           main] o.s.c.c.c.ConfigServerConfigDataLoader   : Located environment: name=loan-service-mysql, profiles=[default], label=null, version=null, state=null</w:t>
+      </w:r>
+    </w:p>
+    <w:p>
+      <w:pPr>
+        <w:keepNext/>
+        <w:keepLines/>
+        <w:pBdr>
+          <w:left w:val="single" w:sz="18" w:space="6" w:color="1F3864"/>
+        </w:pBdr>
+        <w:shd w:val="clear" w:color="auto" w:fill="F2F2F2"/>
+        <w:spacing w:line="252" w:lineRule="auto"/>
+        <w:ind w:left="200"/>
+      </w:pPr>
+      <w:r>
+        <w:rPr>
+          <w:rFonts w:ascii="Consolas" w:eastAsia="Consolas" w:hAnsi="Consolas" w:cs="Consolas"/>
+          <w:sz w:val="17"/>
+          <w:szCs w:val="17"/>
+        </w:rPr>
+        <w:t>2026-09-19T05:35:49.259Z  INFO 1 --- [loan-service-mysql] [           main] o.s.c.c.c.ConfigServerConfigDataLoader   : Located environment: name=loan-service-mysql, profiles=[docker], label=null, version=null, state=null</w:t>
+      </w:r>
+    </w:p>
+    <w:p>
+      <w:pPr>
+        <w:keepNext/>
+        <w:keepLines/>
+        <w:pBdr>
+          <w:left w:val="single" w:sz="18" w:space="6" w:color="1F3864"/>
+        </w:pBdr>
+        <w:shd w:val="clear" w:color="auto" w:fill="F2F2F2"/>
+        <w:spacing w:line="252" w:lineRule="auto"/>
+        <w:ind w:left="200"/>
+      </w:pPr>
+      <w:r>
+        <w:rPr>
+          <w:rFonts w:ascii="Consolas" w:eastAsia="Consolas" w:hAnsi="Consolas" w:cs="Consolas"/>
+          <w:sz w:val="17"/>
+          <w:szCs w:val="17"/>
+        </w:rPr>
+        <w:t>2026-09-19T05:35:50.777Z  INFO 1 --- [loan-service-mysql] [           main] com.zaxxer.hikari.HikariDataSource       : HikariPool-1 - Start completed.</w:t>
+      </w:r>
+    </w:p>
+    <w:p>
+      <w:pPr>
+        <w:keepNext/>
+        <w:keepLines/>
+        <w:pBdr>
+          <w:left w:val="single" w:sz="18" w:space="6" w:color="1F3864"/>
+        </w:pBdr>
+        <w:shd w:val="clear" w:color="auto" w:fill="F2F2F2"/>
+        <w:spacing w:line="252" w:lineRule="auto"/>
+        <w:ind w:left="200"/>
+      </w:pPr>
+      <w:r>
+        <w:rPr>
+          <w:rFonts w:ascii="Consolas" w:eastAsia="Consolas" w:hAnsi="Consolas" w:cs="Consolas"/>
+          <w:sz w:val="17"/>
+          <w:szCs w:val="17"/>
+        </w:rPr>
+        <w:t>2026-09-19T05:35:51.735Z  INFO 1 --- [loan-service-mysql] [           main] o.s.boot.tomcat.TomcatWebServer          : Tomcat started on port 8084 (http) with context path '/'</w:t>
+      </w:r>
+    </w:p>
+    <w:p>
+      <w:pPr>
+        <w:keepLines/>
+        <w:pBdr>
+          <w:left w:val="single" w:sz="18" w:space="6" w:color="1F3864"/>
+        </w:pBdr>
+        <w:shd w:val="clear" w:color="auto" w:fill="F2F2F2"/>
+        <w:spacing w:line="252" w:lineRule="auto"/>
+        <w:ind w:left="200"/>
+      </w:pPr>
+      <w:r>
+        <w:rPr>
+          <w:rFonts w:ascii="Consolas" w:eastAsia="Consolas" w:hAnsi="Consolas" w:cs="Consolas"/>
+          <w:sz w:val="17"/>
+          <w:szCs w:val="17"/>
+        </w:rPr>
+        <w:t>2026-09-19T05:35:51.745Z  INFO 1 --- [loan-service-mysql] [           main] c.e.l.LoanServiceMysqlApplication        : Started LoanServiceMysqlApplication in 3.548 seconds (process running for 4.128)</w:t>
+      </w:r>
+    </w:p>
+    <w:p>
+      <w:pPr>
+        <w:spacing w:after="120"/>
+      </w:pPr>
+    </w:p>
+    <w:p>
+      <w:pPr>
+        <w:pStyle w:val="Heading2"/>
+      </w:pPr>
+      <w:bookmarkStart w:id="25" w:name="_Toc240670785"/>
+      <w:r>
+        <w:lastRenderedPageBreak/>
+        <w:t>7.3 Pruebas del extra</w:t>
+      </w:r>
+      <w:bookmarkEnd w:id="25"/>
+    </w:p>
+    <w:p>
+      <w:pPr>
+        <w:spacing w:after="120" w:line="276" w:lineRule="auto"/>
+      </w:pPr>
+      <w:r>
+        <w:t xml:space="preserve">El módulo incluye 4 tests unitarios del servicio, con JUnit 5 y Mockito, que pasan con </w:t>
+      </w:r>
+      <w:r>
+        <w:rPr>
+          <w:rFonts w:ascii="Consolas" w:eastAsia="Consolas" w:hAnsi="Consolas" w:cs="Consolas"/>
+          <w:sz w:val="20"/>
+          <w:szCs w:val="20"/>
+        </w:rPr>
+        <w:t>./mvnw test</w:t>
+      </w:r>
+      <w:r>
+        <w:t>: creación, listado, búsqueda por id y error cuando el préstamo no existe.</w:t>
+      </w:r>
+    </w:p>
+    <w:p>
+      <w:pPr>
+        <w:pStyle w:val="Heading1"/>
+      </w:pPr>
+      <w:bookmarkStart w:id="26" w:name="_Toc240670786"/>
+      <w:r>
+        <w:t>8. Observaciones sobre el enunciado</w:t>
+      </w:r>
+      <w:bookmarkEnd w:id="26"/>
     </w:p>
     <w:p>
       <w:pPr>
@@ -9562,7 +12070,7 @@
         <w:t xml:space="preserve">MySQL. </w:t>
       </w:r>
       <w:r>
-        <w:t>El enunciado lista MySQL con Workbench como requisito, pero ni el servidor ni el cliente lo utilizan. El taller queda completo sin base de datos.</w:t>
+        <w:t>El enunciado lista MySQL con Workbench como requisito, pero ni el servidor ni el cliente lo utilizan. El taller queda completo sin base de datos. El extra de la sección 7 sí incorpora MySQL.</w:t>
       </w:r>
     </w:p>
     <w:p>
@@ -9609,11 +12117,11 @@
       <w:pPr>
         <w:pStyle w:val="Heading1"/>
       </w:pPr>
-      <w:bookmarkStart w:id="23" w:name="_Toc240670086"/>
-      <w:r>
-        <w:t>8. Conclusiones</w:t>
-      </w:r>
-      <w:bookmarkEnd w:id="23"/>
+      <w:bookmarkStart w:id="27" w:name="_Toc240670787"/>
+      <w:r>
+        <w:t>9. Conclusiones</w:t>
+      </w:r>
+      <w:bookmarkEnd w:id="27"/>
     </w:p>
     <w:p>
       <w:pPr>
@@ -9778,213 +12286,213 @@
 <file path=word/numbering.xml><?xml version="1.0" encoding="utf-8"?>
 <w:numbering xmlns:wpc="http://schemas.microsoft.com/office/word/2010/wordprocessingCanvas" xmlns:cx="http://schemas.microsoft.com/office/drawing/2014/chartex" xmlns:cx1="http://schemas.microsoft.com/office/drawing/2015/9/8/chartex" xmlns:cx2="http://schemas.microsoft.com/office/drawing/2015/10/21/chartex" xmlns:cx3="http://schemas.microsoft.com/office/drawing/2016/5/9/chartex" xmlns:cx4="http://schemas.microsoft.com/office/drawing/2016/5/10/chartex" xmlns:cx5="http://schemas.microsoft.com/office/drawing/2016/5/11/chartex" xmlns:cx6="http://schemas.microsoft.com/office/drawing/2016/5/12/chartex" xmlns:cx7="http://schemas.microsoft.com/office/drawing/2016/5/13/chartex" xmlns:cx8="http://schemas.microsoft.com/office/drawing/2016/5/14/chartex" xmlns:mc="http://schemas.openxmlformats.org/markup-compatibility/2006" xmlns:aink="http://schemas.microsoft.com/office/drawing/2016/ink" xmlns:am3d="http://schemas.microsoft.com/office/drawing/2017/model3d" xmlns:o="urn:schemas-microsoft-com:office:office" xmlns:oel="http://schemas.microsoft.com/office/2019/extlst" xmlns:r="http://schemas.openxmlformats.org/officeDocument/2006/relationships" xmlns:m="http://schemas.openxmlformats.org/officeDocument/2006/math" xmlns:v="urn:schemas-microsoft-com:vml" xmlns:wp14="http://schemas.microsoft.com/office/word/2010/wordprocessingDrawing" xmlns:wp="http://schemas.openxmlformats.org/drawingml/2006/wordprocessingDrawing" xmlns:w10="urn:schemas-microsoft-com:office:word" xmlns:w="http://schemas.openxmlformats.org/wordprocessingml/2006/main" xmlns:w14="http://schemas.microsoft.com/office/word/2010/wordml" xmlns:w15="http://schemas.microsoft.com/office/word/2012/wordml" xmlns:w16cex="http://schemas.microsoft.com/office/word/2018/wordml/cex" xmlns:w16cid="http://schemas.microsoft.com/office/word/2016/wordml/cid" xmlns:w16="http://schemas.microsoft.com/office/word/2018/wordml" xmlns:w16du="http://schemas.microsoft.com/office/word/2023/wordml/word16du" xmlns:w16sdtdh="http://schemas.microsoft.com/office/word/2020/wordml/sdtdatahash" xmlns:w16sdtfl="http://schemas.microsoft.com/office/word/2024/wordml/sdtformatlock" xmlns:w16se="http://schemas.microsoft.com/office/word/2015/wordml/symex" xmlns:wpg="http://schemas.microsoft.com/office/word/2010/wordprocessingGroup" xmlns:wpi="http://schemas.microsoft.com/office/word/2010/wordprocessingInk" xmlns:wne="http://schemas.microsoft.com/office/word/2006/wordml" xmlns:wps="http://schemas.microsoft.com/office/word/2010/wordprocessingShape" mc:Ignorable="w14 w15 w16se w16cid w16 w16cex w16sdtdh w16sdtfl w16du wp14">
   <w:abstractNum w:abstractNumId="0" w15:restartNumberingAfterBreak="0">
-    <w:nsid w:val="062617B9"/>
+    <w:nsid w:val="42712902"/>
     <w:multiLevelType w:val="hybridMultilevel"/>
-    <w:tmpl w:val="7398305A"/>
-    <w:lvl w:ilvl="0" w:tplc="6B7613C0">
+    <w:tmpl w:val="DD22E53A"/>
+    <w:lvl w:ilvl="0" w:tplc="785A9AA4">
       <w:start w:val="1"/>
-      <w:numFmt w:val="decimal"/>
-      <w:lvlText w:val="%1."/>
+      <w:numFmt w:val="bullet"/>
+      <w:lvlText w:val="•"/>
       <w:lvlJc w:val="left"/>
       <w:pPr>
         <w:ind w:left="720" w:hanging="360"/>
       </w:pPr>
     </w:lvl>
-    <w:lvl w:ilvl="1" w:tplc="0FC8D0C6">
+    <w:lvl w:ilvl="1" w:tplc="0F325260">
       <w:numFmt w:val="decimal"/>
       <w:lvlText w:val=""/>
       <w:lvlJc w:val="left"/>
     </w:lvl>
-    <w:lvl w:ilvl="2" w:tplc="DA100FB8">
+    <w:lvl w:ilvl="2" w:tplc="A656CB7A">
       <w:numFmt w:val="decimal"/>
       <w:lvlText w:val=""/>
       <w:lvlJc w:val="left"/>
     </w:lvl>
-    <w:lvl w:ilvl="3" w:tplc="6484A00A">
+    <w:lvl w:ilvl="3" w:tplc="C01CA252">
       <w:numFmt w:val="decimal"/>
       <w:lvlText w:val=""/>
       <w:lvlJc w:val="left"/>
     </w:lvl>
-    <w:lvl w:ilvl="4" w:tplc="36C466B0">
+    <w:lvl w:ilvl="4" w:tplc="A9E07E26">
       <w:numFmt w:val="decimal"/>
       <w:lvlText w:val=""/>
       <w:lvlJc w:val="left"/>
     </w:lvl>
-    <w:lvl w:ilvl="5" w:tplc="E4DEA79A">
+    <w:lvl w:ilvl="5" w:tplc="1A1E307A">
       <w:numFmt w:val="decimal"/>
       <w:lvlText w:val=""/>
       <w:lvlJc w:val="left"/>
     </w:lvl>
-    <w:lvl w:ilvl="6" w:tplc="59269C2C">
+    <w:lvl w:ilvl="6" w:tplc="28FE146A">
       <w:numFmt w:val="decimal"/>
       <w:lvlText w:val=""/>
       <w:lvlJc w:val="left"/>
     </w:lvl>
-    <w:lvl w:ilvl="7" w:tplc="B6D245F4">
+    <w:lvl w:ilvl="7" w:tplc="663A3642">
       <w:numFmt w:val="decimal"/>
       <w:lvlText w:val=""/>
       <w:lvlJc w:val="left"/>
     </w:lvl>
-    <w:lvl w:ilvl="8" w:tplc="36EA2710">
+    <w:lvl w:ilvl="8" w:tplc="0A6E66BA">
       <w:numFmt w:val="decimal"/>
       <w:lvlText w:val=""/>
       <w:lvlJc w:val="left"/>
     </w:lvl>
   </w:abstractNum>
   <w:abstractNum w:abstractNumId="1" w15:restartNumberingAfterBreak="0">
-    <w:nsid w:val="2ABB0306"/>
+    <w:nsid w:val="56DB4707"/>
     <w:multiLevelType w:val="hybridMultilevel"/>
-    <w:tmpl w:val="7718593E"/>
-    <w:lvl w:ilvl="0" w:tplc="1708CE96">
+    <w:tmpl w:val="724432DC"/>
+    <w:lvl w:ilvl="0" w:tplc="82686156">
       <w:start w:val="1"/>
       <w:numFmt w:val="bullet"/>
-      <w:lvlText w:val="•"/>
+      <w:lvlText w:val="●"/>
       <w:lvlJc w:val="left"/>
       <w:pPr>
         <w:ind w:left="720" w:hanging="360"/>
       </w:pPr>
     </w:lvl>
-    <w:lvl w:ilvl="1" w:tplc="F7226FC0">
+    <w:lvl w:ilvl="1" w:tplc="AF04CB6A">
+      <w:start w:val="1"/>
+      <w:numFmt w:val="bullet"/>
+      <w:lvlText w:val="○"/>
+      <w:lvlJc w:val="left"/>
+      <w:pPr>
+        <w:ind w:left="1440" w:hanging="360"/>
+      </w:pPr>
+    </w:lvl>
+    <w:lvl w:ilvl="2" w:tplc="2AA093B0">
+      <w:start w:val="1"/>
+      <w:numFmt w:val="bullet"/>
+      <w:lvlText w:val="■"/>
+      <w:lvlJc w:val="left"/>
+      <w:pPr>
+        <w:ind w:left="2160" w:hanging="360"/>
+      </w:pPr>
+    </w:lvl>
+    <w:lvl w:ilvl="3" w:tplc="4E441102">
+      <w:start w:val="1"/>
+      <w:numFmt w:val="bullet"/>
+      <w:lvlText w:val="●"/>
+      <w:lvlJc w:val="left"/>
+      <w:pPr>
+        <w:ind w:left="2880" w:hanging="360"/>
+      </w:pPr>
+    </w:lvl>
+    <w:lvl w:ilvl="4" w:tplc="F66C4960">
+      <w:start w:val="1"/>
+      <w:numFmt w:val="bullet"/>
+      <w:lvlText w:val="○"/>
+      <w:lvlJc w:val="left"/>
+      <w:pPr>
+        <w:ind w:left="3600" w:hanging="360"/>
+      </w:pPr>
+    </w:lvl>
+    <w:lvl w:ilvl="5" w:tplc="4E3833AA">
+      <w:start w:val="1"/>
+      <w:numFmt w:val="bullet"/>
+      <w:lvlText w:val="■"/>
+      <w:lvlJc w:val="left"/>
+      <w:pPr>
+        <w:ind w:left="4320" w:hanging="360"/>
+      </w:pPr>
+    </w:lvl>
+    <w:lvl w:ilvl="6" w:tplc="76809668">
+      <w:start w:val="1"/>
+      <w:numFmt w:val="bullet"/>
+      <w:lvlText w:val="●"/>
+      <w:lvlJc w:val="left"/>
+      <w:pPr>
+        <w:ind w:left="5040" w:hanging="360"/>
+      </w:pPr>
+    </w:lvl>
+    <w:lvl w:ilvl="7" w:tplc="AB4AA8F6">
+      <w:start w:val="1"/>
+      <w:numFmt w:val="bullet"/>
+      <w:lvlText w:val="●"/>
+      <w:lvlJc w:val="left"/>
+      <w:pPr>
+        <w:ind w:left="5760" w:hanging="360"/>
+      </w:pPr>
+    </w:lvl>
+    <w:lvl w:ilvl="8" w:tplc="576C398A">
+      <w:start w:val="1"/>
+      <w:numFmt w:val="bullet"/>
+      <w:lvlText w:val="●"/>
+      <w:lvlJc w:val="left"/>
+      <w:pPr>
+        <w:ind w:left="6480" w:hanging="360"/>
+      </w:pPr>
+    </w:lvl>
+  </w:abstractNum>
+  <w:abstractNum w:abstractNumId="2" w15:restartNumberingAfterBreak="0">
+    <w:nsid w:val="70E97DDF"/>
+    <w:multiLevelType w:val="hybridMultilevel"/>
+    <w:tmpl w:val="536493B6"/>
+    <w:lvl w:ilvl="0" w:tplc="12326EAC">
+      <w:start w:val="1"/>
+      <w:numFmt w:val="decimal"/>
+      <w:lvlText w:val="%1."/>
+      <w:lvlJc w:val="left"/>
+      <w:pPr>
+        <w:ind w:left="720" w:hanging="360"/>
+      </w:pPr>
+    </w:lvl>
+    <w:lvl w:ilvl="1" w:tplc="2B48DE32">
       <w:numFmt w:val="decimal"/>
       <w:lvlText w:val=""/>
       <w:lvlJc w:val="left"/>
     </w:lvl>
-    <w:lvl w:ilvl="2" w:tplc="ACC0DCF8">
+    <w:lvl w:ilvl="2" w:tplc="A8D2EE30">
       <w:numFmt w:val="decimal"/>
       <w:lvlText w:val=""/>
       <w:lvlJc w:val="left"/>
     </w:lvl>
-    <w:lvl w:ilvl="3" w:tplc="A09C1916">
+    <w:lvl w:ilvl="3" w:tplc="584E1B3E">
       <w:numFmt w:val="decimal"/>
       <w:lvlText w:val=""/>
       <w:lvlJc w:val="left"/>
     </w:lvl>
-    <w:lvl w:ilvl="4" w:tplc="ABF8C976">
+    <w:lvl w:ilvl="4" w:tplc="7C228F62">
       <w:numFmt w:val="decimal"/>
       <w:lvlText w:val=""/>
       <w:lvlJc w:val="left"/>
     </w:lvl>
-    <w:lvl w:ilvl="5" w:tplc="59CA3322">
+    <w:lvl w:ilvl="5" w:tplc="4FC0DA4E">
       <w:numFmt w:val="decimal"/>
       <w:lvlText w:val=""/>
       <w:lvlJc w:val="left"/>
     </w:lvl>
-    <w:lvl w:ilvl="6" w:tplc="F02087A4">
+    <w:lvl w:ilvl="6" w:tplc="A208B880">
       <w:numFmt w:val="decimal"/>
       <w:lvlText w:val=""/>
       <w:lvlJc w:val="left"/>
     </w:lvl>
-    <w:lvl w:ilvl="7" w:tplc="21F07F08">
+    <w:lvl w:ilvl="7" w:tplc="A560FDFC">
       <w:numFmt w:val="decimal"/>
       <w:lvlText w:val=""/>
       <w:lvlJc w:val="left"/>
     </w:lvl>
-    <w:lvl w:ilvl="8" w:tplc="CC5A3BAA">
+    <w:lvl w:ilvl="8" w:tplc="6D1E7004">
       <w:numFmt w:val="decimal"/>
       <w:lvlText w:val=""/>
       <w:lvlJc w:val="left"/>
     </w:lvl>
   </w:abstractNum>
-  <w:abstractNum w:abstractNumId="2" w15:restartNumberingAfterBreak="0">
-    <w:nsid w:val="3EEB7084"/>
-    <w:multiLevelType w:val="hybridMultilevel"/>
-    <w:tmpl w:val="7E3ADE1A"/>
-    <w:lvl w:ilvl="0" w:tplc="2C3A20E0">
-      <w:start w:val="1"/>
-      <w:numFmt w:val="bullet"/>
-      <w:lvlText w:val="●"/>
-      <w:lvlJc w:val="left"/>
-      <w:pPr>
-        <w:ind w:left="720" w:hanging="360"/>
-      </w:pPr>
-    </w:lvl>
-    <w:lvl w:ilvl="1" w:tplc="AB50AC5C">
-      <w:start w:val="1"/>
-      <w:numFmt w:val="bullet"/>
-      <w:lvlText w:val="○"/>
-      <w:lvlJc w:val="left"/>
-      <w:pPr>
-        <w:ind w:left="1440" w:hanging="360"/>
-      </w:pPr>
-    </w:lvl>
-    <w:lvl w:ilvl="2" w:tplc="E6445C0A">
-      <w:start w:val="1"/>
-      <w:numFmt w:val="bullet"/>
-      <w:lvlText w:val="■"/>
-      <w:lvlJc w:val="left"/>
-      <w:pPr>
-        <w:ind w:left="2160" w:hanging="360"/>
-      </w:pPr>
-    </w:lvl>
-    <w:lvl w:ilvl="3" w:tplc="3FC4CF68">
-      <w:start w:val="1"/>
-      <w:numFmt w:val="bullet"/>
-      <w:lvlText w:val="●"/>
-      <w:lvlJc w:val="left"/>
-      <w:pPr>
-        <w:ind w:left="2880" w:hanging="360"/>
-      </w:pPr>
-    </w:lvl>
-    <w:lvl w:ilvl="4" w:tplc="4608FE8C">
-      <w:start w:val="1"/>
-      <w:numFmt w:val="bullet"/>
-      <w:lvlText w:val="○"/>
-      <w:lvlJc w:val="left"/>
-      <w:pPr>
-        <w:ind w:left="3600" w:hanging="360"/>
-      </w:pPr>
-    </w:lvl>
-    <w:lvl w:ilvl="5" w:tplc="03A8A522">
-      <w:start w:val="1"/>
-      <w:numFmt w:val="bullet"/>
-      <w:lvlText w:val="■"/>
-      <w:lvlJc w:val="left"/>
-      <w:pPr>
-        <w:ind w:left="4320" w:hanging="360"/>
-      </w:pPr>
-    </w:lvl>
-    <w:lvl w:ilvl="6" w:tplc="74DC7AEE">
-      <w:start w:val="1"/>
-      <w:numFmt w:val="bullet"/>
-      <w:lvlText w:val="●"/>
-      <w:lvlJc w:val="left"/>
-      <w:pPr>
-        <w:ind w:left="5040" w:hanging="360"/>
-      </w:pPr>
-    </w:lvl>
-    <w:lvl w:ilvl="7" w:tplc="5930FA7A">
-      <w:start w:val="1"/>
-      <w:numFmt w:val="bullet"/>
-      <w:lvlText w:val="●"/>
-      <w:lvlJc w:val="left"/>
-      <w:pPr>
-        <w:ind w:left="5760" w:hanging="360"/>
-      </w:pPr>
-    </w:lvl>
-    <w:lvl w:ilvl="8" w:tplc="BBB6E886">
-      <w:start w:val="1"/>
-      <w:numFmt w:val="bullet"/>
-      <w:lvlText w:val="●"/>
-      <w:lvlJc w:val="left"/>
-      <w:pPr>
-        <w:ind w:left="6480" w:hanging="360"/>
-      </w:pPr>
-    </w:lvl>
-  </w:abstractNum>
-  <w:num w:numId="1" w16cid:durableId="1300920123">
-    <w:abstractNumId w:val="2"/>
-    <w:lvlOverride w:ilvl="0">
-      <w:startOverride w:val="1"/>
-    </w:lvlOverride>
-  </w:num>
-  <w:num w:numId="2" w16cid:durableId="638264900">
+  <w:num w:numId="1" w16cid:durableId="269440084">
     <w:abstractNumId w:val="1"/>
     <w:lvlOverride w:ilvl="0">
       <w:startOverride w:val="1"/>
     </w:lvlOverride>
   </w:num>
-  <w:num w:numId="3" w16cid:durableId="512111775">
+  <w:num w:numId="2" w16cid:durableId="1435514760">
     <w:abstractNumId w:val="0"/>
+    <w:lvlOverride w:ilvl="0">
+      <w:startOverride w:val="1"/>
+    </w:lvlOverride>
+  </w:num>
+  <w:num w:numId="3" w16cid:durableId="1178345251">
+    <w:abstractNumId w:val="2"/>
     <w:lvlOverride w:ilvl="0">
       <w:startOverride w:val="1"/>
     </w:lvlOverride>
@@ -10604,7 +13112,7 @@
     <w:autoRedefine/>
     <w:uiPriority w:val="39"/>
     <w:unhideWhenUsed/>
-    <w:rsid w:val="002C48D3"/>
+    <w:rsid w:val="001A4BF0"/>
     <w:pPr>
       <w:spacing w:after="100"/>
     </w:pPr>
@@ -10616,7 +13124,7 @@
     <w:autoRedefine/>
     <w:uiPriority w:val="39"/>
     <w:unhideWhenUsed/>
-    <w:rsid w:val="002C48D3"/>
+    <w:rsid w:val="001A4BF0"/>
     <w:pPr>
       <w:spacing w:after="100"/>
       <w:ind w:left="220"/>

</xml_diff>

<commit_message>
docs: agregar URL del repositorio en la portada del informe
</commit_message>
<xml_diff>
--- a/docs/Informe-Taller-Spring-Cloud-Config.docx
+++ b/docs/Informe-Taller-Spring-Cloud-Config.docx
@@ -64,7 +64,7 @@
           <w:left w:w="10" w:type="dxa"/>
           <w:right w:w="10" w:type="dxa"/>
         </w:tblCellMar>
-        <w:tblLook w:val="04A0" w:firstRow="1" w:lastRow="0" w:firstColumn="1" w:lastColumn="0" w:noHBand="0" w:noVBand="1"/>
+        <w:tblLook w:val="0000" w:firstRow="0" w:lastRow="0" w:firstColumn="0" w:lastColumn="0" w:noHBand="0" w:noVBand="0"/>
       </w:tblPr>
       <w:tblGrid>
         <w:gridCol w:w="2200"/>
@@ -398,7 +398,7 @@
                 <w:sz w:val="21"/>
                 <w:szCs w:val="21"/>
               </w:rPr>
-              <w:t>Se entrega junto con este informe</w:t>
+              <w:t>https://github.com/SebastianMontes-Dev/spring-cloud-config-taller</w:t>
             </w:r>
           </w:p>
         </w:tc>
@@ -428,7 +428,7 @@
     <w:sdt>
       <w:sdtPr>
         <w:alias w:val="Contenido"/>
-        <w:id w:val="50657472"/>
+        <w:id w:val="-1783873561"/>
       </w:sdtPr>
       <w:sdtEndPr/>
       <w:sdtContent>
@@ -456,7 +456,7 @@
           <w:r>
             <w:fldChar w:fldCharType="separate"/>
           </w:r>
-          <w:hyperlink w:anchor="_Toc240670760" w:history="1">
+          <w:hyperlink w:anchor="_Toc240671056" w:history="1">
             <w:r>
               <w:rPr>
                 <w:rStyle w:val="Hyperlink"/>
@@ -480,7 +480,7 @@
               <w:rPr>
                 <w:noProof/>
               </w:rPr>
-              <w:instrText xml:space="preserve"> PAGEREF _Toc240670760 \h </w:instrText>
+              <w:instrText xml:space="preserve"> PAGEREF _Toc240671056 \h </w:instrText>
             </w:r>
             <w:r>
               <w:rPr>
@@ -522,7 +522,7 @@
               <w14:ligatures w14:val="standardContextual"/>
             </w:rPr>
           </w:pPr>
-          <w:hyperlink w:anchor="_Toc240670761" w:history="1">
+          <w:hyperlink w:anchor="_Toc240671057" w:history="1">
             <w:r>
               <w:rPr>
                 <w:rStyle w:val="Hyperlink"/>
@@ -546,7 +546,7 @@
               <w:rPr>
                 <w:noProof/>
               </w:rPr>
-              <w:instrText xml:space="preserve"> PAGEREF _Toc240670761 \h </w:instrText>
+              <w:instrText xml:space="preserve"> PAGEREF _Toc240671057 \h </w:instrText>
             </w:r>
             <w:r>
               <w:rPr>
@@ -588,7 +588,7 @@
               <w14:ligatures w14:val="standardContextual"/>
             </w:rPr>
           </w:pPr>
-          <w:hyperlink w:anchor="_Toc240670762" w:history="1">
+          <w:hyperlink w:anchor="_Toc240671058" w:history="1">
             <w:r>
               <w:rPr>
                 <w:rStyle w:val="Hyperlink"/>
@@ -612,7 +612,7 @@
               <w:rPr>
                 <w:noProof/>
               </w:rPr>
-              <w:instrText xml:space="preserve"> PAGEREF _Toc240670762 \h </w:instrText>
+              <w:instrText xml:space="preserve"> PAGEREF _Toc240671058 \h </w:instrText>
             </w:r>
             <w:r>
               <w:rPr>
@@ -654,7 +654,7 @@
               <w14:ligatures w14:val="standardContextual"/>
             </w:rPr>
           </w:pPr>
-          <w:hyperlink w:anchor="_Toc240670763" w:history="1">
+          <w:hyperlink w:anchor="_Toc240671059" w:history="1">
             <w:r>
               <w:rPr>
                 <w:rStyle w:val="Hyperlink"/>
@@ -678,7 +678,7 @@
               <w:rPr>
                 <w:noProof/>
               </w:rPr>
-              <w:instrText xml:space="preserve"> PAGEREF _Toc240670763 \h </w:instrText>
+              <w:instrText xml:space="preserve"> PAGEREF _Toc240671059 \h </w:instrText>
             </w:r>
             <w:r>
               <w:rPr>
@@ -720,7 +720,7 @@
               <w14:ligatures w14:val="standardContextual"/>
             </w:rPr>
           </w:pPr>
-          <w:hyperlink w:anchor="_Toc240670764" w:history="1">
+          <w:hyperlink w:anchor="_Toc240671060" w:history="1">
             <w:r>
               <w:rPr>
                 <w:rStyle w:val="Hyperlink"/>
@@ -744,7 +744,7 @@
               <w:rPr>
                 <w:noProof/>
               </w:rPr>
-              <w:instrText xml:space="preserve"> PAGEREF _Toc240670764 \h </w:instrText>
+              <w:instrText xml:space="preserve"> PAGEREF _Toc240671060 \h </w:instrText>
             </w:r>
             <w:r>
               <w:rPr>
@@ -786,7 +786,7 @@
               <w14:ligatures w14:val="standardContextual"/>
             </w:rPr>
           </w:pPr>
-          <w:hyperlink w:anchor="_Toc240670765" w:history="1">
+          <w:hyperlink w:anchor="_Toc240671061" w:history="1">
             <w:r>
               <w:rPr>
                 <w:rStyle w:val="Hyperlink"/>
@@ -810,7 +810,7 @@
               <w:rPr>
                 <w:noProof/>
               </w:rPr>
-              <w:instrText xml:space="preserve"> PAGEREF _Toc240670765 \h </w:instrText>
+              <w:instrText xml:space="preserve"> PAGEREF _Toc240671061 \h </w:instrText>
             </w:r>
             <w:r>
               <w:rPr>
@@ -852,7 +852,7 @@
               <w14:ligatures w14:val="standardContextual"/>
             </w:rPr>
           </w:pPr>
-          <w:hyperlink w:anchor="_Toc240670766" w:history="1">
+          <w:hyperlink w:anchor="_Toc240671062" w:history="1">
             <w:r>
               <w:rPr>
                 <w:rStyle w:val="Hyperlink"/>
@@ -876,7 +876,7 @@
               <w:rPr>
                 <w:noProof/>
               </w:rPr>
-              <w:instrText xml:space="preserve"> PAGEREF _Toc240670766 \h </w:instrText>
+              <w:instrText xml:space="preserve"> PAGEREF _Toc240671062 \h </w:instrText>
             </w:r>
             <w:r>
               <w:rPr>
@@ -918,7 +918,7 @@
               <w14:ligatures w14:val="standardContextual"/>
             </w:rPr>
           </w:pPr>
-          <w:hyperlink w:anchor="_Toc240670767" w:history="1">
+          <w:hyperlink w:anchor="_Toc240671063" w:history="1">
             <w:r>
               <w:rPr>
                 <w:rStyle w:val="Hyperlink"/>
@@ -942,7 +942,7 @@
               <w:rPr>
                 <w:noProof/>
               </w:rPr>
-              <w:instrText xml:space="preserve"> PAGEREF _Toc240670767 \h </w:instrText>
+              <w:instrText xml:space="preserve"> PAGEREF _Toc240671063 \h </w:instrText>
             </w:r>
             <w:r>
               <w:rPr>
@@ -984,7 +984,7 @@
               <w14:ligatures w14:val="standardContextual"/>
             </w:rPr>
           </w:pPr>
-          <w:hyperlink w:anchor="_Toc240670768" w:history="1">
+          <w:hyperlink w:anchor="_Toc240671064" w:history="1">
             <w:r>
               <w:rPr>
                 <w:rStyle w:val="Hyperlink"/>
@@ -1008,7 +1008,7 @@
               <w:rPr>
                 <w:noProof/>
               </w:rPr>
-              <w:instrText xml:space="preserve"> PAGEREF _Toc240670768 \h </w:instrText>
+              <w:instrText xml:space="preserve"> PAGEREF _Toc240671064 \h </w:instrText>
             </w:r>
             <w:r>
               <w:rPr>
@@ -1050,7 +1050,7 @@
               <w14:ligatures w14:val="standardContextual"/>
             </w:rPr>
           </w:pPr>
-          <w:hyperlink w:anchor="_Toc240670769" w:history="1">
+          <w:hyperlink w:anchor="_Toc240671065" w:history="1">
             <w:r>
               <w:rPr>
                 <w:rStyle w:val="Hyperlink"/>
@@ -1074,7 +1074,7 @@
               <w:rPr>
                 <w:noProof/>
               </w:rPr>
-              <w:instrText xml:space="preserve"> PAGEREF _Toc240670769 \h </w:instrText>
+              <w:instrText xml:space="preserve"> PAGEREF _Toc240671065 \h </w:instrText>
             </w:r>
             <w:r>
               <w:rPr>
@@ -1116,7 +1116,7 @@
               <w14:ligatures w14:val="standardContextual"/>
             </w:rPr>
           </w:pPr>
-          <w:hyperlink w:anchor="_Toc240670770" w:history="1">
+          <w:hyperlink w:anchor="_Toc240671066" w:history="1">
             <w:r>
               <w:rPr>
                 <w:rStyle w:val="Hyperlink"/>
@@ -1140,7 +1140,7 @@
               <w:rPr>
                 <w:noProof/>
               </w:rPr>
-              <w:instrText xml:space="preserve"> PAGEREF _Toc240670770 \h </w:instrText>
+              <w:instrText xml:space="preserve"> PAGEREF _Toc240671066 \h </w:instrText>
             </w:r>
             <w:r>
               <w:rPr>
@@ -1182,7 +1182,7 @@
               <w14:ligatures w14:val="standardContextual"/>
             </w:rPr>
           </w:pPr>
-          <w:hyperlink w:anchor="_Toc240670771" w:history="1">
+          <w:hyperlink w:anchor="_Toc240671067" w:history="1">
             <w:r>
               <w:rPr>
                 <w:rStyle w:val="Hyperlink"/>
@@ -1206,7 +1206,7 @@
               <w:rPr>
                 <w:noProof/>
               </w:rPr>
-              <w:instrText xml:space="preserve"> PAGEREF _Toc240670771 \h </w:instrText>
+              <w:instrText xml:space="preserve"> PAGEREF _Toc240671067 \h </w:instrText>
             </w:r>
             <w:r>
               <w:rPr>
@@ -1248,7 +1248,7 @@
               <w14:ligatures w14:val="standardContextual"/>
             </w:rPr>
           </w:pPr>
-          <w:hyperlink w:anchor="_Toc240670772" w:history="1">
+          <w:hyperlink w:anchor="_Toc240671068" w:history="1">
             <w:r>
               <w:rPr>
                 <w:rStyle w:val="Hyperlink"/>
@@ -1272,7 +1272,7 @@
               <w:rPr>
                 <w:noProof/>
               </w:rPr>
-              <w:instrText xml:space="preserve"> PAGEREF _Toc240670772 \h </w:instrText>
+              <w:instrText xml:space="preserve"> PAGEREF _Toc240671068 \h </w:instrText>
             </w:r>
             <w:r>
               <w:rPr>
@@ -1314,7 +1314,7 @@
               <w14:ligatures w14:val="standardContextual"/>
             </w:rPr>
           </w:pPr>
-          <w:hyperlink w:anchor="_Toc240670773" w:history="1">
+          <w:hyperlink w:anchor="_Toc240671069" w:history="1">
             <w:r>
               <w:rPr>
                 <w:rStyle w:val="Hyperlink"/>
@@ -1338,7 +1338,7 @@
               <w:rPr>
                 <w:noProof/>
               </w:rPr>
-              <w:instrText xml:space="preserve"> PAGEREF _Toc240670773 \h </w:instrText>
+              <w:instrText xml:space="preserve"> PAGEREF _Toc240671069 \h </w:instrText>
             </w:r>
             <w:r>
               <w:rPr>
@@ -1380,7 +1380,7 @@
               <w14:ligatures w14:val="standardContextual"/>
             </w:rPr>
           </w:pPr>
-          <w:hyperlink w:anchor="_Toc240670774" w:history="1">
+          <w:hyperlink w:anchor="_Toc240671070" w:history="1">
             <w:r>
               <w:rPr>
                 <w:rStyle w:val="Hyperlink"/>
@@ -1404,7 +1404,7 @@
               <w:rPr>
                 <w:noProof/>
               </w:rPr>
-              <w:instrText xml:space="preserve"> PAGEREF _Toc240670774 \h </w:instrText>
+              <w:instrText xml:space="preserve"> PAGEREF _Toc240671070 \h </w:instrText>
             </w:r>
             <w:r>
               <w:rPr>
@@ -1446,7 +1446,7 @@
               <w14:ligatures w14:val="standardContextual"/>
             </w:rPr>
           </w:pPr>
-          <w:hyperlink w:anchor="_Toc240670775" w:history="1">
+          <w:hyperlink w:anchor="_Toc240671071" w:history="1">
             <w:r>
               <w:rPr>
                 <w:rStyle w:val="Hyperlink"/>
@@ -1470,7 +1470,7 @@
               <w:rPr>
                 <w:noProof/>
               </w:rPr>
-              <w:instrText xml:space="preserve"> PAGEREF _Toc240670775 \h </w:instrText>
+              <w:instrText xml:space="preserve"> PAGEREF _Toc240671071 \h </w:instrText>
             </w:r>
             <w:r>
               <w:rPr>
@@ -1512,7 +1512,7 @@
               <w14:ligatures w14:val="standardContextual"/>
             </w:rPr>
           </w:pPr>
-          <w:hyperlink w:anchor="_Toc240670776" w:history="1">
+          <w:hyperlink w:anchor="_Toc240671072" w:history="1">
             <w:r>
               <w:rPr>
                 <w:rStyle w:val="Hyperlink"/>
@@ -1536,7 +1536,7 @@
               <w:rPr>
                 <w:noProof/>
               </w:rPr>
-              <w:instrText xml:space="preserve"> PAGEREF _Toc240670776 \h </w:instrText>
+              <w:instrText xml:space="preserve"> PAGEREF _Toc240671072 \h </w:instrText>
             </w:r>
             <w:r>
               <w:rPr>
@@ -1578,7 +1578,7 @@
               <w14:ligatures w14:val="standardContextual"/>
             </w:rPr>
           </w:pPr>
-          <w:hyperlink w:anchor="_Toc240670777" w:history="1">
+          <w:hyperlink w:anchor="_Toc240671073" w:history="1">
             <w:r>
               <w:rPr>
                 <w:rStyle w:val="Hyperlink"/>
@@ -1602,7 +1602,7 @@
               <w:rPr>
                 <w:noProof/>
               </w:rPr>
-              <w:instrText xml:space="preserve"> PAGEREF _Toc240670777 \h </w:instrText>
+              <w:instrText xml:space="preserve"> PAGEREF _Toc240671073 \h </w:instrText>
             </w:r>
             <w:r>
               <w:rPr>
@@ -1644,7 +1644,7 @@
               <w14:ligatures w14:val="standardContextual"/>
             </w:rPr>
           </w:pPr>
-          <w:hyperlink w:anchor="_Toc240670778" w:history="1">
+          <w:hyperlink w:anchor="_Toc240671074" w:history="1">
             <w:r>
               <w:rPr>
                 <w:rStyle w:val="Hyperlink"/>
@@ -1668,7 +1668,7 @@
               <w:rPr>
                 <w:noProof/>
               </w:rPr>
-              <w:instrText xml:space="preserve"> PAGEREF _Toc240670778 \h </w:instrText>
+              <w:instrText xml:space="preserve"> PAGEREF _Toc240671074 \h </w:instrText>
             </w:r>
             <w:r>
               <w:rPr>
@@ -1710,7 +1710,7 @@
               <w14:ligatures w14:val="standardContextual"/>
             </w:rPr>
           </w:pPr>
-          <w:hyperlink w:anchor="_Toc240670779" w:history="1">
+          <w:hyperlink w:anchor="_Toc240671075" w:history="1">
             <w:r>
               <w:rPr>
                 <w:rStyle w:val="Hyperlink"/>
@@ -1734,7 +1734,7 @@
               <w:rPr>
                 <w:noProof/>
               </w:rPr>
-              <w:instrText xml:space="preserve"> PAGEREF _Toc240670779 \h </w:instrText>
+              <w:instrText xml:space="preserve"> PAGEREF _Toc240671075 \h </w:instrText>
             </w:r>
             <w:r>
               <w:rPr>
@@ -1776,7 +1776,7 @@
               <w14:ligatures w14:val="standardContextual"/>
             </w:rPr>
           </w:pPr>
-          <w:hyperlink w:anchor="_Toc240670780" w:history="1">
+          <w:hyperlink w:anchor="_Toc240671076" w:history="1">
             <w:r>
               <w:rPr>
                 <w:rStyle w:val="Hyperlink"/>
@@ -1800,7 +1800,7 @@
               <w:rPr>
                 <w:noProof/>
               </w:rPr>
-              <w:instrText xml:space="preserve"> PAGEREF _Toc240670780 \h </w:instrText>
+              <w:instrText xml:space="preserve"> PAGEREF _Toc240671076 \h </w:instrText>
             </w:r>
             <w:r>
               <w:rPr>
@@ -1842,7 +1842,7 @@
               <w14:ligatures w14:val="standardContextual"/>
             </w:rPr>
           </w:pPr>
-          <w:hyperlink w:anchor="_Toc240670781" w:history="1">
+          <w:hyperlink w:anchor="_Toc240671077" w:history="1">
             <w:r>
               <w:rPr>
                 <w:rStyle w:val="Hyperlink"/>
@@ -1866,7 +1866,7 @@
               <w:rPr>
                 <w:noProof/>
               </w:rPr>
-              <w:instrText xml:space="preserve"> PAGEREF _Toc240670781 \h </w:instrText>
+              <w:instrText xml:space="preserve"> PAGEREF _Toc240671077 \h </w:instrText>
             </w:r>
             <w:r>
               <w:rPr>
@@ -1908,7 +1908,7 @@
               <w14:ligatures w14:val="standardContextual"/>
             </w:rPr>
           </w:pPr>
-          <w:hyperlink w:anchor="_Toc240670782" w:history="1">
+          <w:hyperlink w:anchor="_Toc240671078" w:history="1">
             <w:r>
               <w:rPr>
                 <w:rStyle w:val="Hyperlink"/>
@@ -1932,7 +1932,7 @@
               <w:rPr>
                 <w:noProof/>
               </w:rPr>
-              <w:instrText xml:space="preserve"> PAGEREF _Toc240670782 \h </w:instrText>
+              <w:instrText xml:space="preserve"> PAGEREF _Toc240671078 \h </w:instrText>
             </w:r>
             <w:r>
               <w:rPr>
@@ -1974,7 +1974,7 @@
               <w14:ligatures w14:val="standardContextual"/>
             </w:rPr>
           </w:pPr>
-          <w:hyperlink w:anchor="_Toc240670783" w:history="1">
+          <w:hyperlink w:anchor="_Toc240671079" w:history="1">
             <w:r>
               <w:rPr>
                 <w:rStyle w:val="Hyperlink"/>
@@ -1998,7 +1998,7 @@
               <w:rPr>
                 <w:noProof/>
               </w:rPr>
-              <w:instrText xml:space="preserve"> PAGEREF _Toc240670783 \h </w:instrText>
+              <w:instrText xml:space="preserve"> PAGEREF _Toc240671079 \h </w:instrText>
             </w:r>
             <w:r>
               <w:rPr>
@@ -2040,7 +2040,7 @@
               <w14:ligatures w14:val="standardContextual"/>
             </w:rPr>
           </w:pPr>
-          <w:hyperlink w:anchor="_Toc240670784" w:history="1">
+          <w:hyperlink w:anchor="_Toc240671080" w:history="1">
             <w:r>
               <w:rPr>
                 <w:rStyle w:val="Hyperlink"/>
@@ -2064,7 +2064,7 @@
               <w:rPr>
                 <w:noProof/>
               </w:rPr>
-              <w:instrText xml:space="preserve"> PAGEREF _Toc240670784 \h </w:instrText>
+              <w:instrText xml:space="preserve"> PAGEREF _Toc240671080 \h </w:instrText>
             </w:r>
             <w:r>
               <w:rPr>
@@ -2106,7 +2106,7 @@
               <w14:ligatures w14:val="standardContextual"/>
             </w:rPr>
           </w:pPr>
-          <w:hyperlink w:anchor="_Toc240670785" w:history="1">
+          <w:hyperlink w:anchor="_Toc240671081" w:history="1">
             <w:r>
               <w:rPr>
                 <w:rStyle w:val="Hyperlink"/>
@@ -2130,7 +2130,7 @@
               <w:rPr>
                 <w:noProof/>
               </w:rPr>
-              <w:instrText xml:space="preserve"> PAGEREF _Toc240670785 \h </w:instrText>
+              <w:instrText xml:space="preserve"> PAGEREF _Toc240671081 \h </w:instrText>
             </w:r>
             <w:r>
               <w:rPr>
@@ -2172,7 +2172,7 @@
               <w14:ligatures w14:val="standardContextual"/>
             </w:rPr>
           </w:pPr>
-          <w:hyperlink w:anchor="_Toc240670786" w:history="1">
+          <w:hyperlink w:anchor="_Toc240671082" w:history="1">
             <w:r>
               <w:rPr>
                 <w:rStyle w:val="Hyperlink"/>
@@ -2196,7 +2196,7 @@
               <w:rPr>
                 <w:noProof/>
               </w:rPr>
-              <w:instrText xml:space="preserve"> PAGEREF _Toc240670786 \h </w:instrText>
+              <w:instrText xml:space="preserve"> PAGEREF _Toc240671082 \h </w:instrText>
             </w:r>
             <w:r>
               <w:rPr>
@@ -2238,7 +2238,7 @@
               <w14:ligatures w14:val="standardContextual"/>
             </w:rPr>
           </w:pPr>
-          <w:hyperlink w:anchor="_Toc240670787" w:history="1">
+          <w:hyperlink w:anchor="_Toc240671083" w:history="1">
             <w:r>
               <w:rPr>
                 <w:rStyle w:val="Hyperlink"/>
@@ -2262,7 +2262,7 @@
               <w:rPr>
                 <w:noProof/>
               </w:rPr>
-              <w:instrText xml:space="preserve"> PAGEREF _Toc240670787 \h </w:instrText>
+              <w:instrText xml:space="preserve"> PAGEREF _Toc240671083 \h </w:instrText>
             </w:r>
             <w:r>
               <w:rPr>
@@ -2305,7 +2305,7 @@
       <w:pPr>
         <w:pStyle w:val="Heading1"/>
       </w:pPr>
-      <w:bookmarkStart w:id="0" w:name="_Toc240670760"/>
+      <w:bookmarkStart w:id="0" w:name="_Toc240671056"/>
       <w:r>
         <w:lastRenderedPageBreak/>
         <w:t>1. Introducción y objetivo</w:t>
@@ -2394,7 +2394,7 @@
           <w:left w:w="10" w:type="dxa"/>
           <w:right w:w="10" w:type="dxa"/>
         </w:tblCellMar>
-        <w:tblLook w:val="04A0" w:firstRow="1" w:lastRow="0" w:firstColumn="1" w:lastColumn="0" w:noHBand="0" w:noVBand="1"/>
+        <w:tblLook w:val="0000" w:firstRow="0" w:lastRow="0" w:firstColumn="0" w:lastColumn="0" w:noHBand="0" w:noVBand="0"/>
       </w:tblPr>
       <w:tblGrid>
         <w:gridCol w:w="2400"/>
@@ -2694,7 +2694,7 @@
       <w:pPr>
         <w:pStyle w:val="Heading1"/>
       </w:pPr>
-      <w:bookmarkStart w:id="1" w:name="_Toc240670761"/>
+      <w:bookmarkStart w:id="1" w:name="_Toc240671057"/>
       <w:r>
         <w:t>2. Entorno utilizado</w:t>
       </w:r>
@@ -2715,7 +2715,7 @@
           <w:left w:w="10" w:type="dxa"/>
           <w:right w:w="10" w:type="dxa"/>
         </w:tblCellMar>
-        <w:tblLook w:val="04A0" w:firstRow="1" w:lastRow="0" w:firstColumn="1" w:lastColumn="0" w:noHBand="0" w:noVBand="1"/>
+        <w:tblLook w:val="0000" w:firstRow="0" w:lastRow="0" w:firstColumn="0" w:lastColumn="0" w:noHBand="0" w:noVBand="0"/>
       </w:tblPr>
       <w:tblGrid>
         <w:gridCol w:w="2600"/>
@@ -3332,7 +3332,7 @@
       <w:pPr>
         <w:pStyle w:val="Heading1"/>
       </w:pPr>
-      <w:bookmarkStart w:id="2" w:name="_Toc240670762"/>
+      <w:bookmarkStart w:id="2" w:name="_Toc240671058"/>
       <w:r>
         <w:lastRenderedPageBreak/>
         <w:t>3. Paso 1: Creación del Config Server</w:t>
@@ -3351,7 +3351,7 @@
       <w:pPr>
         <w:pStyle w:val="Heading2"/>
       </w:pPr>
-      <w:bookmarkStart w:id="3" w:name="_Toc240670763"/>
+      <w:bookmarkStart w:id="3" w:name="_Toc240671059"/>
       <w:r>
         <w:t>3.1 Creación del proyecto Spring Boot</w:t>
       </w:r>
@@ -3380,7 +3380,7 @@
           <w:left w:w="10" w:type="dxa"/>
           <w:right w:w="10" w:type="dxa"/>
         </w:tblCellMar>
-        <w:tblLook w:val="04A0" w:firstRow="1" w:lastRow="0" w:firstColumn="1" w:lastColumn="0" w:noHBand="0" w:noVBand="1"/>
+        <w:tblLook w:val="0000" w:firstRow="0" w:lastRow="0" w:firstColumn="0" w:lastColumn="0" w:noHBand="0" w:noVBand="0"/>
       </w:tblPr>
       <w:tblGrid>
         <w:gridCol w:w="3000"/>
@@ -3854,7 +3854,7 @@
       <w:pPr>
         <w:pStyle w:val="Heading2"/>
       </w:pPr>
-      <w:bookmarkStart w:id="4" w:name="_Toc240670764"/>
+      <w:bookmarkStart w:id="4" w:name="_Toc240671060"/>
       <w:r>
         <w:t>3.2 Dependencia en el pom.xml</w:t>
       </w:r>
@@ -3972,7 +3972,7 @@
       <w:pPr>
         <w:pStyle w:val="Heading2"/>
       </w:pPr>
-      <w:bookmarkStart w:id="5" w:name="_Toc240670765"/>
+      <w:bookmarkStart w:id="5" w:name="_Toc240671061"/>
       <w:r>
         <w:t>3.3 Habilitar la funcionalidad del servidor</w:t>
       </w:r>
@@ -4281,7 +4281,7 @@
       <w:pPr>
         <w:pStyle w:val="Heading2"/>
       </w:pPr>
-      <w:bookmarkStart w:id="6" w:name="_Toc240670766"/>
+      <w:bookmarkStart w:id="6" w:name="_Toc240671062"/>
       <w:r>
         <w:lastRenderedPageBreak/>
         <w:t>3.4 Configuración del servidor</w:t>
@@ -4403,7 +4403,7 @@
           <w:left w:w="10" w:type="dxa"/>
           <w:right w:w="10" w:type="dxa"/>
         </w:tblCellMar>
-        <w:tblLook w:val="04A0" w:firstRow="1" w:lastRow="0" w:firstColumn="1" w:lastColumn="0" w:noHBand="0" w:noVBand="1"/>
+        <w:tblLook w:val="0000" w:firstRow="0" w:lastRow="0" w:firstColumn="0" w:lastColumn="0" w:noHBand="0" w:noVBand="0"/>
       </w:tblPr>
       <w:tblGrid>
         <w:gridCol w:w="4503"/>
@@ -4771,7 +4771,7 @@
       <w:pPr>
         <w:pStyle w:val="Heading2"/>
       </w:pPr>
-      <w:bookmarkStart w:id="7" w:name="_Toc240670767"/>
+      <w:bookmarkStart w:id="7" w:name="_Toc240671063"/>
       <w:r>
         <w:t>3.5 Archivos de configuración por perfil</w:t>
       </w:r>
@@ -4991,7 +4991,7 @@
       <w:pPr>
         <w:pStyle w:val="Heading2"/>
       </w:pPr>
-      <w:bookmarkStart w:id="8" w:name="_Toc240670768"/>
+      <w:bookmarkStart w:id="8" w:name="_Toc240671064"/>
       <w:r>
         <w:t>3.6 Ejecución del servidor</w:t>
       </w:r>
@@ -5101,7 +5101,7 @@
       <w:pPr>
         <w:pStyle w:val="Heading2"/>
       </w:pPr>
-      <w:bookmarkStart w:id="9" w:name="_Toc240670769"/>
+      <w:bookmarkStart w:id="9" w:name="_Toc240671065"/>
       <w:r>
         <w:t>3.7 Consulta directa al servidor</w:t>
       </w:r>
@@ -5201,7 +5201,7 @@
           <w:left w:w="10" w:type="dxa"/>
           <w:right w:w="10" w:type="dxa"/>
         </w:tblCellMar>
-        <w:tblLook w:val="04A0" w:firstRow="1" w:lastRow="0" w:firstColumn="1" w:lastColumn="0" w:noHBand="0" w:noVBand="1"/>
+        <w:tblLook w:val="0000" w:firstRow="0" w:lastRow="0" w:firstColumn="0" w:lastColumn="0" w:noHBand="0" w:noVBand="0"/>
       </w:tblPr>
       <w:tblGrid>
         <w:gridCol w:w="2000"/>
@@ -5736,7 +5736,7 @@
           <w:left w:w="10" w:type="dxa"/>
           <w:right w:w="10" w:type="dxa"/>
         </w:tblCellMar>
-        <w:tblLook w:val="04A0" w:firstRow="1" w:lastRow="0" w:firstColumn="1" w:lastColumn="0" w:noHBand="0" w:noVBand="1"/>
+        <w:tblLook w:val="0000" w:firstRow="0" w:lastRow="0" w:firstColumn="0" w:lastColumn="0" w:noHBand="0" w:noVBand="0"/>
       </w:tblPr>
       <w:tblGrid>
         <w:gridCol w:w="9026"/>
@@ -5828,7 +5828,7 @@
           <w:left w:w="10" w:type="dxa"/>
           <w:right w:w="10" w:type="dxa"/>
         </w:tblCellMar>
-        <w:tblLook w:val="04A0" w:firstRow="1" w:lastRow="0" w:firstColumn="1" w:lastColumn="0" w:noHBand="0" w:noVBand="1"/>
+        <w:tblLook w:val="0000" w:firstRow="0" w:lastRow="0" w:firstColumn="0" w:lastColumn="0" w:noHBand="0" w:noVBand="0"/>
       </w:tblPr>
       <w:tblGrid>
         <w:gridCol w:w="9026"/>
@@ -5920,7 +5920,7 @@
           <w:left w:w="10" w:type="dxa"/>
           <w:right w:w="10" w:type="dxa"/>
         </w:tblCellMar>
-        <w:tblLook w:val="04A0" w:firstRow="1" w:lastRow="0" w:firstColumn="1" w:lastColumn="0" w:noHBand="0" w:noVBand="1"/>
+        <w:tblLook w:val="0000" w:firstRow="0" w:lastRow="0" w:firstColumn="0" w:lastColumn="0" w:noHBand="0" w:noVBand="0"/>
       </w:tblPr>
       <w:tblGrid>
         <w:gridCol w:w="9026"/>
@@ -6002,7 +6002,7 @@
       <w:pPr>
         <w:pStyle w:val="Heading1"/>
       </w:pPr>
-      <w:bookmarkStart w:id="10" w:name="_Toc240670770"/>
+      <w:bookmarkStart w:id="10" w:name="_Toc240671066"/>
       <w:r>
         <w:t>4. Paso 2: Creación del Config Client</w:t>
       </w:r>
@@ -6020,7 +6020,7 @@
       <w:pPr>
         <w:pStyle w:val="Heading2"/>
       </w:pPr>
-      <w:bookmarkStart w:id="11" w:name="_Toc240670771"/>
+      <w:bookmarkStart w:id="11" w:name="_Toc240671067"/>
       <w:r>
         <w:t>4.1 Creación del proyecto</w:t>
       </w:r>
@@ -6041,7 +6041,7 @@
           <w:left w:w="10" w:type="dxa"/>
           <w:right w:w="10" w:type="dxa"/>
         </w:tblCellMar>
-        <w:tblLook w:val="04A0" w:firstRow="1" w:lastRow="0" w:firstColumn="1" w:lastColumn="0" w:noHBand="0" w:noVBand="1"/>
+        <w:tblLook w:val="0000" w:firstRow="0" w:lastRow="0" w:firstColumn="0" w:lastColumn="0" w:noHBand="0" w:noVBand="0"/>
       </w:tblPr>
       <w:tblGrid>
         <w:gridCol w:w="3000"/>
@@ -6515,7 +6515,7 @@
       <w:pPr>
         <w:pStyle w:val="Heading2"/>
       </w:pPr>
-      <w:bookmarkStart w:id="12" w:name="_Toc240670772"/>
+      <w:bookmarkStart w:id="12" w:name="_Toc240671068"/>
       <w:r>
         <w:t>4.2 Dependencia en el pom.xml</w:t>
       </w:r>
@@ -6625,7 +6625,7 @@
       <w:pPr>
         <w:pStyle w:val="Heading2"/>
       </w:pPr>
-      <w:bookmarkStart w:id="13" w:name="_Toc240670773"/>
+      <w:bookmarkStart w:id="13" w:name="_Toc240671069"/>
       <w:r>
         <w:t>4.3 Configuración del cliente</w:t>
       </w:r>
@@ -6726,7 +6726,7 @@
           <w:left w:w="10" w:type="dxa"/>
           <w:right w:w="10" w:type="dxa"/>
         </w:tblCellMar>
-        <w:tblLook w:val="04A0" w:firstRow="1" w:lastRow="0" w:firstColumn="1" w:lastColumn="0" w:noHBand="0" w:noVBand="1"/>
+        <w:tblLook w:val="0000" w:firstRow="0" w:lastRow="0" w:firstColumn="0" w:lastColumn="0" w:noHBand="0" w:noVBand="0"/>
       </w:tblPr>
       <w:tblGrid>
         <w:gridCol w:w="3300"/>
@@ -7008,7 +7008,7 @@
       <w:pPr>
         <w:pStyle w:val="Heading2"/>
       </w:pPr>
-      <w:bookmarkStart w:id="14" w:name="_Toc240670774"/>
+      <w:bookmarkStart w:id="14" w:name="_Toc240671070"/>
       <w:r>
         <w:lastRenderedPageBreak/>
         <w:t>4.4 Clase principal</w:t>
@@ -7299,7 +7299,7 @@
       <w:pPr>
         <w:pStyle w:val="Heading2"/>
       </w:pPr>
-      <w:bookmarkStart w:id="15" w:name="_Toc240670775"/>
+      <w:bookmarkStart w:id="15" w:name="_Toc240671071"/>
       <w:r>
         <w:t>4.5 Controlador REST</w:t>
       </w:r>
@@ -7668,7 +7668,7 @@
       <w:pPr>
         <w:pStyle w:val="Heading2"/>
       </w:pPr>
-      <w:bookmarkStart w:id="16" w:name="_Toc240670776"/>
+      <w:bookmarkStart w:id="16" w:name="_Toc240671072"/>
       <w:r>
         <w:t>4.6 Ejecución del cliente</w:t>
       </w:r>
@@ -7847,7 +7847,7 @@
       <w:pPr>
         <w:pStyle w:val="Heading1"/>
       </w:pPr>
-      <w:bookmarkStart w:id="17" w:name="_Toc240670777"/>
+      <w:bookmarkStart w:id="17" w:name="_Toc240671073"/>
       <w:r>
         <w:t>5. Pruebas por perfil</w:t>
       </w:r>
@@ -7876,7 +7876,7 @@
           <w:left w:w="10" w:type="dxa"/>
           <w:right w:w="10" w:type="dxa"/>
         </w:tblCellMar>
-        <w:tblLook w:val="04A0" w:firstRow="1" w:lastRow="0" w:firstColumn="1" w:lastColumn="0" w:noHBand="0" w:noVBand="1"/>
+        <w:tblLook w:val="0000" w:firstRow="0" w:lastRow="0" w:firstColumn="0" w:lastColumn="0" w:noHBand="0" w:noVBand="0"/>
       </w:tblPr>
       <w:tblGrid>
         <w:gridCol w:w="1100"/>
@@ -8499,7 +8499,7 @@
       <w:pPr>
         <w:pStyle w:val="Heading2"/>
       </w:pPr>
-      <w:bookmarkStart w:id="18" w:name="_Toc240670778"/>
+      <w:bookmarkStart w:id="18" w:name="_Toc240671074"/>
       <w:r>
         <w:t>5.1 Perfil default</w:t>
       </w:r>
@@ -8699,7 +8699,7 @@
           <w:left w:w="10" w:type="dxa"/>
           <w:right w:w="10" w:type="dxa"/>
         </w:tblCellMar>
-        <w:tblLook w:val="04A0" w:firstRow="1" w:lastRow="0" w:firstColumn="1" w:lastColumn="0" w:noHBand="0" w:noVBand="1"/>
+        <w:tblLook w:val="0000" w:firstRow="0" w:lastRow="0" w:firstColumn="0" w:lastColumn="0" w:noHBand="0" w:noVBand="0"/>
       </w:tblPr>
       <w:tblGrid>
         <w:gridCol w:w="9026"/>
@@ -8781,7 +8781,7 @@
       <w:pPr>
         <w:pStyle w:val="Heading2"/>
       </w:pPr>
-      <w:bookmarkStart w:id="19" w:name="_Toc240670779"/>
+      <w:bookmarkStart w:id="19" w:name="_Toc240671075"/>
       <w:r>
         <w:t>5.2 Perfil dev</w:t>
       </w:r>
@@ -8981,7 +8981,7 @@
           <w:left w:w="10" w:type="dxa"/>
           <w:right w:w="10" w:type="dxa"/>
         </w:tblCellMar>
-        <w:tblLook w:val="04A0" w:firstRow="1" w:lastRow="0" w:firstColumn="1" w:lastColumn="0" w:noHBand="0" w:noVBand="1"/>
+        <w:tblLook w:val="0000" w:firstRow="0" w:lastRow="0" w:firstColumn="0" w:lastColumn="0" w:noHBand="0" w:noVBand="0"/>
       </w:tblPr>
       <w:tblGrid>
         <w:gridCol w:w="9026"/>
@@ -9062,7 +9062,7 @@
       <w:pPr>
         <w:pStyle w:val="Heading2"/>
       </w:pPr>
-      <w:bookmarkStart w:id="20" w:name="_Toc240670780"/>
+      <w:bookmarkStart w:id="20" w:name="_Toc240671076"/>
       <w:r>
         <w:t>5.3 Perfil uat</w:t>
       </w:r>
@@ -9262,7 +9262,7 @@
           <w:left w:w="10" w:type="dxa"/>
           <w:right w:w="10" w:type="dxa"/>
         </w:tblCellMar>
-        <w:tblLook w:val="04A0" w:firstRow="1" w:lastRow="0" w:firstColumn="1" w:lastColumn="0" w:noHBand="0" w:noVBand="1"/>
+        <w:tblLook w:val="0000" w:firstRow="0" w:lastRow="0" w:firstColumn="0" w:lastColumn="0" w:noHBand="0" w:noVBand="0"/>
       </w:tblPr>
       <w:tblGrid>
         <w:gridCol w:w="9026"/>
@@ -9343,7 +9343,7 @@
       <w:pPr>
         <w:pStyle w:val="Heading1"/>
       </w:pPr>
-      <w:bookmarkStart w:id="21" w:name="_Toc240670781"/>
+      <w:bookmarkStart w:id="21" w:name="_Toc240671077"/>
       <w:r>
         <w:t>6. Pruebas automatizadas</w:t>
       </w:r>
@@ -9743,7 +9743,7 @@
       <w:pPr>
         <w:pStyle w:val="Heading1"/>
       </w:pPr>
-      <w:bookmarkStart w:id="22" w:name="_Toc240670782"/>
+      <w:bookmarkStart w:id="22" w:name="_Toc240671078"/>
       <w:r>
         <w:t>7. Extras opcionales</w:t>
       </w:r>
@@ -9782,7 +9782,7 @@
       <w:pPr>
         <w:pStyle w:val="Heading2"/>
       </w:pPr>
-      <w:bookmarkStart w:id="23" w:name="_Toc240670783"/>
+      <w:bookmarkStart w:id="23" w:name="_Toc240671079"/>
       <w:r>
         <w:t>7.1 Perfil git del Config Server</w:t>
       </w:r>
@@ -10141,7 +10141,7 @@
       <w:pPr>
         <w:pStyle w:val="Heading2"/>
       </w:pPr>
-      <w:bookmarkStart w:id="24" w:name="_Toc240670784"/>
+      <w:bookmarkStart w:id="24" w:name="_Toc240671080"/>
       <w:r>
         <w:t>7.2 Docker Compose y MySQL</w:t>
       </w:r>
@@ -10192,7 +10192,7 @@
           <w:left w:w="10" w:type="dxa"/>
           <w:right w:w="10" w:type="dxa"/>
         </w:tblCellMar>
-        <w:tblLook w:val="04A0" w:firstRow="1" w:lastRow="0" w:firstColumn="1" w:lastColumn="0" w:noHBand="0" w:noVBand="1"/>
+        <w:tblLook w:val="0000" w:firstRow="0" w:lastRow="0" w:firstColumn="0" w:lastColumn="0" w:noHBand="0" w:noVBand="0"/>
       </w:tblPr>
       <w:tblGrid>
         <w:gridCol w:w="2500"/>
@@ -10797,7 +10797,7 @@
           <w:left w:w="10" w:type="dxa"/>
           <w:right w:w="10" w:type="dxa"/>
         </w:tblCellMar>
-        <w:tblLook w:val="04A0" w:firstRow="1" w:lastRow="0" w:firstColumn="1" w:lastColumn="0" w:noHBand="0" w:noVBand="1"/>
+        <w:tblLook w:val="0000" w:firstRow="0" w:lastRow="0" w:firstColumn="0" w:lastColumn="0" w:noHBand="0" w:noVBand="0"/>
       </w:tblPr>
       <w:tblGrid>
         <w:gridCol w:w="3000"/>
@@ -11957,7 +11957,7 @@
       <w:pPr>
         <w:pStyle w:val="Heading2"/>
       </w:pPr>
-      <w:bookmarkStart w:id="25" w:name="_Toc240670785"/>
+      <w:bookmarkStart w:id="25" w:name="_Toc240671081"/>
       <w:r>
         <w:lastRenderedPageBreak/>
         <w:t>7.3 Pruebas del extra</w:t>
@@ -11987,7 +11987,7 @@
       <w:pPr>
         <w:pStyle w:val="Heading1"/>
       </w:pPr>
-      <w:bookmarkStart w:id="26" w:name="_Toc240670786"/>
+      <w:bookmarkStart w:id="26" w:name="_Toc240671082"/>
       <w:r>
         <w:t>8. Observaciones sobre el enunciado</w:t>
       </w:r>
@@ -12117,7 +12117,7 @@
       <w:pPr>
         <w:pStyle w:val="Heading1"/>
       </w:pPr>
-      <w:bookmarkStart w:id="27" w:name="_Toc240670787"/>
+      <w:bookmarkStart w:id="27" w:name="_Toc240671083"/>
       <w:r>
         <w:t>9. Conclusiones</w:t>
       </w:r>
@@ -12286,213 +12286,213 @@
 <file path=word/numbering.xml><?xml version="1.0" encoding="utf-8"?>
 <w:numbering xmlns:wpc="http://schemas.microsoft.com/office/word/2010/wordprocessingCanvas" xmlns:cx="http://schemas.microsoft.com/office/drawing/2014/chartex" xmlns:cx1="http://schemas.microsoft.com/office/drawing/2015/9/8/chartex" xmlns:cx2="http://schemas.microsoft.com/office/drawing/2015/10/21/chartex" xmlns:cx3="http://schemas.microsoft.com/office/drawing/2016/5/9/chartex" xmlns:cx4="http://schemas.microsoft.com/office/drawing/2016/5/10/chartex" xmlns:cx5="http://schemas.microsoft.com/office/drawing/2016/5/11/chartex" xmlns:cx6="http://schemas.microsoft.com/office/drawing/2016/5/12/chartex" xmlns:cx7="http://schemas.microsoft.com/office/drawing/2016/5/13/chartex" xmlns:cx8="http://schemas.microsoft.com/office/drawing/2016/5/14/chartex" xmlns:mc="http://schemas.openxmlformats.org/markup-compatibility/2006" xmlns:aink="http://schemas.microsoft.com/office/drawing/2016/ink" xmlns:am3d="http://schemas.microsoft.com/office/drawing/2017/model3d" xmlns:o="urn:schemas-microsoft-com:office:office" xmlns:oel="http://schemas.microsoft.com/office/2019/extlst" xmlns:r="http://schemas.openxmlformats.org/officeDocument/2006/relationships" xmlns:m="http://schemas.openxmlformats.org/officeDocument/2006/math" xmlns:v="urn:schemas-microsoft-com:vml" xmlns:wp14="http://schemas.microsoft.com/office/word/2010/wordprocessingDrawing" xmlns:wp="http://schemas.openxmlformats.org/drawingml/2006/wordprocessingDrawing" xmlns:w10="urn:schemas-microsoft-com:office:word" xmlns:w="http://schemas.openxmlformats.org/wordprocessingml/2006/main" xmlns:w14="http://schemas.microsoft.com/office/word/2010/wordml" xmlns:w15="http://schemas.microsoft.com/office/word/2012/wordml" xmlns:w16cex="http://schemas.microsoft.com/office/word/2018/wordml/cex" xmlns:w16cid="http://schemas.microsoft.com/office/word/2016/wordml/cid" xmlns:w16="http://schemas.microsoft.com/office/word/2018/wordml" xmlns:w16du="http://schemas.microsoft.com/office/word/2023/wordml/word16du" xmlns:w16sdtdh="http://schemas.microsoft.com/office/word/2020/wordml/sdtdatahash" xmlns:w16sdtfl="http://schemas.microsoft.com/office/word/2024/wordml/sdtformatlock" xmlns:w16se="http://schemas.microsoft.com/office/word/2015/wordml/symex" xmlns:wpg="http://schemas.microsoft.com/office/word/2010/wordprocessingGroup" xmlns:wpi="http://schemas.microsoft.com/office/word/2010/wordprocessingInk" xmlns:wne="http://schemas.microsoft.com/office/word/2006/wordml" xmlns:wps="http://schemas.microsoft.com/office/word/2010/wordprocessingShape" mc:Ignorable="w14 w15 w16se w16cid w16 w16cex w16sdtdh w16sdtfl w16du wp14">
   <w:abstractNum w:abstractNumId="0" w15:restartNumberingAfterBreak="0">
-    <w:nsid w:val="42712902"/>
+    <w:nsid w:val="0C3D337D"/>
     <w:multiLevelType w:val="hybridMultilevel"/>
-    <w:tmpl w:val="DD22E53A"/>
-    <w:lvl w:ilvl="0" w:tplc="785A9AA4">
+    <w:tmpl w:val="6AF2494E"/>
+    <w:lvl w:ilvl="0" w:tplc="A6A811B8">
       <w:start w:val="1"/>
       <w:numFmt w:val="bullet"/>
-      <w:lvlText w:val="•"/>
+      <w:lvlText w:val="●"/>
       <w:lvlJc w:val="left"/>
       <w:pPr>
         <w:ind w:left="720" w:hanging="360"/>
       </w:pPr>
     </w:lvl>
-    <w:lvl w:ilvl="1" w:tplc="0F325260">
+    <w:lvl w:ilvl="1" w:tplc="0AB40492">
+      <w:start w:val="1"/>
+      <w:numFmt w:val="bullet"/>
+      <w:lvlText w:val="○"/>
+      <w:lvlJc w:val="left"/>
+      <w:pPr>
+        <w:ind w:left="1440" w:hanging="360"/>
+      </w:pPr>
+    </w:lvl>
+    <w:lvl w:ilvl="2" w:tplc="944A3EFC">
+      <w:start w:val="1"/>
+      <w:numFmt w:val="bullet"/>
+      <w:lvlText w:val="■"/>
+      <w:lvlJc w:val="left"/>
+      <w:pPr>
+        <w:ind w:left="2160" w:hanging="360"/>
+      </w:pPr>
+    </w:lvl>
+    <w:lvl w:ilvl="3" w:tplc="BDFAAD62">
+      <w:start w:val="1"/>
+      <w:numFmt w:val="bullet"/>
+      <w:lvlText w:val="●"/>
+      <w:lvlJc w:val="left"/>
+      <w:pPr>
+        <w:ind w:left="2880" w:hanging="360"/>
+      </w:pPr>
+    </w:lvl>
+    <w:lvl w:ilvl="4" w:tplc="2A76773A">
+      <w:start w:val="1"/>
+      <w:numFmt w:val="bullet"/>
+      <w:lvlText w:val="○"/>
+      <w:lvlJc w:val="left"/>
+      <w:pPr>
+        <w:ind w:left="3600" w:hanging="360"/>
+      </w:pPr>
+    </w:lvl>
+    <w:lvl w:ilvl="5" w:tplc="54580D4E">
+      <w:start w:val="1"/>
+      <w:numFmt w:val="bullet"/>
+      <w:lvlText w:val="■"/>
+      <w:lvlJc w:val="left"/>
+      <w:pPr>
+        <w:ind w:left="4320" w:hanging="360"/>
+      </w:pPr>
+    </w:lvl>
+    <w:lvl w:ilvl="6" w:tplc="D74E4D8E">
+      <w:start w:val="1"/>
+      <w:numFmt w:val="bullet"/>
+      <w:lvlText w:val="●"/>
+      <w:lvlJc w:val="left"/>
+      <w:pPr>
+        <w:ind w:left="5040" w:hanging="360"/>
+      </w:pPr>
+    </w:lvl>
+    <w:lvl w:ilvl="7" w:tplc="8E502F8C">
+      <w:start w:val="1"/>
+      <w:numFmt w:val="bullet"/>
+      <w:lvlText w:val="●"/>
+      <w:lvlJc w:val="left"/>
+      <w:pPr>
+        <w:ind w:left="5760" w:hanging="360"/>
+      </w:pPr>
+    </w:lvl>
+    <w:lvl w:ilvl="8" w:tplc="62A25A66">
+      <w:start w:val="1"/>
+      <w:numFmt w:val="bullet"/>
+      <w:lvlText w:val="●"/>
+      <w:lvlJc w:val="left"/>
+      <w:pPr>
+        <w:ind w:left="6480" w:hanging="360"/>
+      </w:pPr>
+    </w:lvl>
+  </w:abstractNum>
+  <w:abstractNum w:abstractNumId="1" w15:restartNumberingAfterBreak="0">
+    <w:nsid w:val="3E517570"/>
+    <w:multiLevelType w:val="hybridMultilevel"/>
+    <w:tmpl w:val="1FAED324"/>
+    <w:lvl w:ilvl="0" w:tplc="AC9EA050">
+      <w:start w:val="1"/>
+      <w:numFmt w:val="decimal"/>
+      <w:lvlText w:val="%1."/>
+      <w:lvlJc w:val="left"/>
+      <w:pPr>
+        <w:ind w:left="720" w:hanging="360"/>
+      </w:pPr>
+    </w:lvl>
+    <w:lvl w:ilvl="1" w:tplc="B8668F08">
       <w:numFmt w:val="decimal"/>
       <w:lvlText w:val=""/>
       <w:lvlJc w:val="left"/>
     </w:lvl>
-    <w:lvl w:ilvl="2" w:tplc="A656CB7A">
+    <w:lvl w:ilvl="2" w:tplc="981E3546">
       <w:numFmt w:val="decimal"/>
       <w:lvlText w:val=""/>
       <w:lvlJc w:val="left"/>
     </w:lvl>
-    <w:lvl w:ilvl="3" w:tplc="C01CA252">
+    <w:lvl w:ilvl="3" w:tplc="3236B486">
       <w:numFmt w:val="decimal"/>
       <w:lvlText w:val=""/>
       <w:lvlJc w:val="left"/>
     </w:lvl>
-    <w:lvl w:ilvl="4" w:tplc="A9E07E26">
+    <w:lvl w:ilvl="4" w:tplc="F2D2F16E">
       <w:numFmt w:val="decimal"/>
       <w:lvlText w:val=""/>
       <w:lvlJc w:val="left"/>
     </w:lvl>
-    <w:lvl w:ilvl="5" w:tplc="1A1E307A">
+    <w:lvl w:ilvl="5" w:tplc="8EF83B02">
       <w:numFmt w:val="decimal"/>
       <w:lvlText w:val=""/>
       <w:lvlJc w:val="left"/>
     </w:lvl>
-    <w:lvl w:ilvl="6" w:tplc="28FE146A">
+    <w:lvl w:ilvl="6" w:tplc="0B88CD92">
       <w:numFmt w:val="decimal"/>
       <w:lvlText w:val=""/>
       <w:lvlJc w:val="left"/>
     </w:lvl>
-    <w:lvl w:ilvl="7" w:tplc="663A3642">
+    <w:lvl w:ilvl="7" w:tplc="147081D4">
       <w:numFmt w:val="decimal"/>
       <w:lvlText w:val=""/>
       <w:lvlJc w:val="left"/>
     </w:lvl>
-    <w:lvl w:ilvl="8" w:tplc="0A6E66BA">
+    <w:lvl w:ilvl="8" w:tplc="16A40CBC">
       <w:numFmt w:val="decimal"/>
       <w:lvlText w:val=""/>
       <w:lvlJc w:val="left"/>
     </w:lvl>
   </w:abstractNum>
-  <w:abstractNum w:abstractNumId="1" w15:restartNumberingAfterBreak="0">
-    <w:nsid w:val="56DB4707"/>
+  <w:abstractNum w:abstractNumId="2" w15:restartNumberingAfterBreak="0">
+    <w:nsid w:val="5910718E"/>
     <w:multiLevelType w:val="hybridMultilevel"/>
-    <w:tmpl w:val="724432DC"/>
-    <w:lvl w:ilvl="0" w:tplc="82686156">
+    <w:tmpl w:val="2CB211D0"/>
+    <w:lvl w:ilvl="0" w:tplc="A99A16E0">
       <w:start w:val="1"/>
       <w:numFmt w:val="bullet"/>
-      <w:lvlText w:val="●"/>
+      <w:lvlText w:val="•"/>
       <w:lvlJc w:val="left"/>
       <w:pPr>
         <w:ind w:left="720" w:hanging="360"/>
       </w:pPr>
     </w:lvl>
-    <w:lvl w:ilvl="1" w:tplc="AF04CB6A">
-      <w:start w:val="1"/>
-      <w:numFmt w:val="bullet"/>
-      <w:lvlText w:val="○"/>
-      <w:lvlJc w:val="left"/>
-      <w:pPr>
-        <w:ind w:left="1440" w:hanging="360"/>
-      </w:pPr>
-    </w:lvl>
-    <w:lvl w:ilvl="2" w:tplc="2AA093B0">
-      <w:start w:val="1"/>
-      <w:numFmt w:val="bullet"/>
-      <w:lvlText w:val="■"/>
-      <w:lvlJc w:val="left"/>
-      <w:pPr>
-        <w:ind w:left="2160" w:hanging="360"/>
-      </w:pPr>
-    </w:lvl>
-    <w:lvl w:ilvl="3" w:tplc="4E441102">
-      <w:start w:val="1"/>
-      <w:numFmt w:val="bullet"/>
-      <w:lvlText w:val="●"/>
-      <w:lvlJc w:val="left"/>
-      <w:pPr>
-        <w:ind w:left="2880" w:hanging="360"/>
-      </w:pPr>
-    </w:lvl>
-    <w:lvl w:ilvl="4" w:tplc="F66C4960">
-      <w:start w:val="1"/>
-      <w:numFmt w:val="bullet"/>
-      <w:lvlText w:val="○"/>
-      <w:lvlJc w:val="left"/>
-      <w:pPr>
-        <w:ind w:left="3600" w:hanging="360"/>
-      </w:pPr>
-    </w:lvl>
-    <w:lvl w:ilvl="5" w:tplc="4E3833AA">
-      <w:start w:val="1"/>
-      <w:numFmt w:val="bullet"/>
-      <w:lvlText w:val="■"/>
-      <w:lvlJc w:val="left"/>
-      <w:pPr>
-        <w:ind w:left="4320" w:hanging="360"/>
-      </w:pPr>
-    </w:lvl>
-    <w:lvl w:ilvl="6" w:tplc="76809668">
-      <w:start w:val="1"/>
-      <w:numFmt w:val="bullet"/>
-      <w:lvlText w:val="●"/>
-      <w:lvlJc w:val="left"/>
-      <w:pPr>
-        <w:ind w:left="5040" w:hanging="360"/>
-      </w:pPr>
-    </w:lvl>
-    <w:lvl w:ilvl="7" w:tplc="AB4AA8F6">
-      <w:start w:val="1"/>
-      <w:numFmt w:val="bullet"/>
-      <w:lvlText w:val="●"/>
-      <w:lvlJc w:val="left"/>
-      <w:pPr>
-        <w:ind w:left="5760" w:hanging="360"/>
-      </w:pPr>
-    </w:lvl>
-    <w:lvl w:ilvl="8" w:tplc="576C398A">
-      <w:start w:val="1"/>
-      <w:numFmt w:val="bullet"/>
-      <w:lvlText w:val="●"/>
-      <w:lvlJc w:val="left"/>
-      <w:pPr>
-        <w:ind w:left="6480" w:hanging="360"/>
-      </w:pPr>
-    </w:lvl>
-  </w:abstractNum>
-  <w:abstractNum w:abstractNumId="2" w15:restartNumberingAfterBreak="0">
-    <w:nsid w:val="70E97DDF"/>
-    <w:multiLevelType w:val="hybridMultilevel"/>
-    <w:tmpl w:val="536493B6"/>
-    <w:lvl w:ilvl="0" w:tplc="12326EAC">
-      <w:start w:val="1"/>
-      <w:numFmt w:val="decimal"/>
-      <w:lvlText w:val="%1."/>
-      <w:lvlJc w:val="left"/>
-      <w:pPr>
-        <w:ind w:left="720" w:hanging="360"/>
-      </w:pPr>
-    </w:lvl>
-    <w:lvl w:ilvl="1" w:tplc="2B48DE32">
+    <w:lvl w:ilvl="1" w:tplc="F8E4FD86">
       <w:numFmt w:val="decimal"/>
       <w:lvlText w:val=""/>
       <w:lvlJc w:val="left"/>
     </w:lvl>
-    <w:lvl w:ilvl="2" w:tplc="A8D2EE30">
+    <w:lvl w:ilvl="2" w:tplc="922076FE">
       <w:numFmt w:val="decimal"/>
       <w:lvlText w:val=""/>
       <w:lvlJc w:val="left"/>
     </w:lvl>
-    <w:lvl w:ilvl="3" w:tplc="584E1B3E">
+    <w:lvl w:ilvl="3" w:tplc="774654BC">
       <w:numFmt w:val="decimal"/>
       <w:lvlText w:val=""/>
       <w:lvlJc w:val="left"/>
     </w:lvl>
-    <w:lvl w:ilvl="4" w:tplc="7C228F62">
+    <w:lvl w:ilvl="4" w:tplc="2BA00F44">
       <w:numFmt w:val="decimal"/>
       <w:lvlText w:val=""/>
       <w:lvlJc w:val="left"/>
     </w:lvl>
-    <w:lvl w:ilvl="5" w:tplc="4FC0DA4E">
+    <w:lvl w:ilvl="5" w:tplc="26BA28A0">
       <w:numFmt w:val="decimal"/>
       <w:lvlText w:val=""/>
       <w:lvlJc w:val="left"/>
     </w:lvl>
-    <w:lvl w:ilvl="6" w:tplc="A208B880">
+    <w:lvl w:ilvl="6" w:tplc="E166C664">
       <w:numFmt w:val="decimal"/>
       <w:lvlText w:val=""/>
       <w:lvlJc w:val="left"/>
     </w:lvl>
-    <w:lvl w:ilvl="7" w:tplc="A560FDFC">
+    <w:lvl w:ilvl="7" w:tplc="6428C82E">
       <w:numFmt w:val="decimal"/>
       <w:lvlText w:val=""/>
       <w:lvlJc w:val="left"/>
     </w:lvl>
-    <w:lvl w:ilvl="8" w:tplc="6D1E7004">
+    <w:lvl w:ilvl="8" w:tplc="382E8DCA">
       <w:numFmt w:val="decimal"/>
       <w:lvlText w:val=""/>
       <w:lvlJc w:val="left"/>
     </w:lvl>
   </w:abstractNum>
-  <w:num w:numId="1" w16cid:durableId="269440084">
-    <w:abstractNumId w:val="1"/>
-    <w:lvlOverride w:ilvl="0">
-      <w:startOverride w:val="1"/>
-    </w:lvlOverride>
-  </w:num>
-  <w:num w:numId="2" w16cid:durableId="1435514760">
+  <w:num w:numId="1" w16cid:durableId="990405218">
     <w:abstractNumId w:val="0"/>
     <w:lvlOverride w:ilvl="0">
       <w:startOverride w:val="1"/>
     </w:lvlOverride>
   </w:num>
-  <w:num w:numId="3" w16cid:durableId="1178345251">
+  <w:num w:numId="2" w16cid:durableId="1792623197">
     <w:abstractNumId w:val="2"/>
+    <w:lvlOverride w:ilvl="0">
+      <w:startOverride w:val="1"/>
+    </w:lvlOverride>
+  </w:num>
+  <w:num w:numId="3" w16cid:durableId="1988364178">
+    <w:abstractNumId w:val="1"/>
     <w:lvlOverride w:ilvl="0">
       <w:startOverride w:val="1"/>
     </w:lvlOverride>
@@ -13112,7 +13112,7 @@
     <w:autoRedefine/>
     <w:uiPriority w:val="39"/>
     <w:unhideWhenUsed/>
-    <w:rsid w:val="001A4BF0"/>
+    <w:rsid w:val="00FA7D06"/>
     <w:pPr>
       <w:spacing w:after="100"/>
     </w:pPr>
@@ -13124,7 +13124,7 @@
     <w:autoRedefine/>
     <w:uiPriority w:val="39"/>
     <w:unhideWhenUsed/>
-    <w:rsid w:val="001A4BF0"/>
+    <w:rsid w:val="00FA7D06"/>
     <w:pPr>
       <w:spacing w:after="100"/>
       <w:ind w:left="220"/>

</xml_diff>